<commit_message>
Complexity plan v1.1: add Tn5 batch QC and lambda titration appendices
Co-Authored-By: Claude Opus 5.5 <noreply@anthropic.com>
Claude-Session: https://claude.ai/code/session_0118hMfJWJZ4DaiswK3vUJeT
</commit_message>
<xml_diff>
--- a/cfEpi_LibraryComplexity_Plan.docx
+++ b/cfEpi_LibraryComplexity_Plan.docx
@@ -45,7 +45,7 @@
           <w:sz w:val="18"/>
           <w:szCs w:val="18"/>
         </w:rPr>
-        <w:t xml:space="preserve">Prepared for H. Ludewick. Version 1.0, 29 October 2026. Companion to the cf-EpiTracing Bench Protocol (v1.3) and the QC summary workbook (cfEpi_20261026_QC_summary.xlsx).</w:t>
+        <w:t xml:space="preserve">Prepared for H. Ludewick. Version 1.1, 30 October 2026. Companion to the cf-EpiTracing Bench Protocol (v1.3) and the QC summary workbook (cfEpi_20261026_QC_summary.xlsx).</w:t>
       </w:r>
     </w:p>
     <w:p>
@@ -2577,7 +2577,7 @@
         <w:spacing w:after="100" w:before="200"/>
       </w:pPr>
       <w:r>
-        <w:t xml:space="preserve">4.1 Tn5 activity test (one afternoon)</w:t>
+        <w:t xml:space="preserve">4.1 Tn5 activity test (one afternoon; full protocol in Appendix B)</w:t>
       </w:r>
     </w:p>
     <w:tbl>
@@ -2594,8 +2594,8 @@
       </w:tblPr>
       <w:tblGrid>
         <w:gridCol w:w="1504"/>
-        <w:gridCol w:w="2006"/>
-        <w:gridCol w:w="5516"/>
+        <w:gridCol w:w="3009"/>
+        <w:gridCol w:w="4513"/>
       </w:tblGrid>
       <w:tr>
         <w:trPr>
@@ -2630,7 +2630,7 @@
         </w:tc>
         <w:tc>
           <w:tcPr>
-            <w:tcW w:type="dxa" w:w="2006"/>
+            <w:tcW w:type="dxa" w:w="3009"/>
             <w:shd w:fill="1F4E79" w:color="auto" w:val="clear"/>
             <w:tcMar>
               <w:top w:type="dxa" w:w="60"/>
@@ -2651,13 +2651,13 @@
                 <w:sz w:val="19"/>
                 <w:szCs w:val="19"/>
               </w:rPr>
-              <w:t xml:space="preserve">Human genomic DNA</w:t>
-            </w:r>
-          </w:p>
-        </w:tc>
-        <w:tc>
-          <w:tcPr>
-            <w:tcW w:type="dxa" w:w="5516"/>
+              <w:t xml:space="preserve">Lambda DNA (or human gDNA)</w:t>
+            </w:r>
+          </w:p>
+        </w:tc>
+        <w:tc>
+          <w:tcPr>
+            <w:tcW w:type="dxa" w:w="4513"/>
             <w:shd w:fill="1F4E79" w:color="auto" w:val="clear"/>
             <w:tcMar>
               <w:top w:type="dxa" w:w="60"/>
@@ -2678,7 +2678,7 @@
                 <w:sz w:val="19"/>
                 <w:szCs w:val="19"/>
               </w:rPr>
-              <w:t xml:space="preserve">Loaded Tn5 (final, in 10 µl tagmentation buffer)</w:t>
+              <w:t xml:space="preserve">Loaded Tn5 (final)</w:t>
             </w:r>
           </w:p>
         </w:tc>
@@ -2711,32 +2711,32 @@
         </w:tc>
         <w:tc>
           <w:tcPr>
-            <w:tcW w:type="dxa" w:w="2006"/>
-            <w:tcMar>
-              <w:top w:type="dxa" w:w="60"/>
-              <w:left w:type="dxa" w:w="100"/>
-              <w:bottom w:type="dxa" w:w="60"/>
-              <w:right w:type="dxa" w:w="100"/>
-            </w:tcMar>
-          </w:tcPr>
-          <w:p>
-            <w:pPr>
-              <w:spacing w:after="0"/>
-            </w:pPr>
-            <w:r>
-              <w:rPr>
-                <w:b w:val="false"/>
-                <w:bCs w:val="false"/>
-                <w:sz w:val="19"/>
-                <w:szCs w:val="19"/>
-              </w:rPr>
-              <w:t xml:space="preserve">50 ng</w:t>
-            </w:r>
-          </w:p>
-        </w:tc>
-        <w:tc>
-          <w:tcPr>
-            <w:tcW w:type="dxa" w:w="5516"/>
+            <w:tcW w:type="dxa" w:w="3009"/>
+            <w:tcMar>
+              <w:top w:type="dxa" w:w="60"/>
+              <w:left w:type="dxa" w:w="100"/>
+              <w:bottom w:type="dxa" w:w="60"/>
+              <w:right w:type="dxa" w:w="100"/>
+            </w:tcMar>
+          </w:tcPr>
+          <w:p>
+            <w:pPr>
+              <w:spacing w:after="0"/>
+            </w:pPr>
+            <w:r>
+              <w:rPr>
+                <w:b w:val="false"/>
+                <w:bCs w:val="false"/>
+                <w:sz w:val="19"/>
+                <w:szCs w:val="19"/>
+              </w:rPr>
+              <w:t xml:space="preserve">40 ng</w:t>
+            </w:r>
+          </w:p>
+        </w:tc>
+        <w:tc>
+          <w:tcPr>
+            <w:tcW w:type="dxa" w:w="4513"/>
             <w:tcMar>
               <w:top w:type="dxa" w:w="60"/>
               <w:left w:type="dxa" w:w="100"/>
@@ -2788,32 +2788,32 @@
         </w:tc>
         <w:tc>
           <w:tcPr>
-            <w:tcW w:type="dxa" w:w="2006"/>
-            <w:tcMar>
-              <w:top w:type="dxa" w:w="60"/>
-              <w:left w:type="dxa" w:w="100"/>
-              <w:bottom w:type="dxa" w:w="60"/>
-              <w:right w:type="dxa" w:w="100"/>
-            </w:tcMar>
-          </w:tcPr>
-          <w:p>
-            <w:pPr>
-              <w:spacing w:after="0"/>
-            </w:pPr>
-            <w:r>
-              <w:rPr>
-                <w:b w:val="false"/>
-                <w:bCs w:val="false"/>
-                <w:sz w:val="19"/>
-                <w:szCs w:val="19"/>
-              </w:rPr>
-              <w:t xml:space="preserve">50 ng</w:t>
-            </w:r>
-          </w:p>
-        </w:tc>
-        <w:tc>
-          <w:tcPr>
-            <w:tcW w:type="dxa" w:w="5516"/>
+            <w:tcW w:type="dxa" w:w="3009"/>
+            <w:tcMar>
+              <w:top w:type="dxa" w:w="60"/>
+              <w:left w:type="dxa" w:w="100"/>
+              <w:bottom w:type="dxa" w:w="60"/>
+              <w:right w:type="dxa" w:w="100"/>
+            </w:tcMar>
+          </w:tcPr>
+          <w:p>
+            <w:pPr>
+              <w:spacing w:after="0"/>
+            </w:pPr>
+            <w:r>
+              <w:rPr>
+                <w:b w:val="false"/>
+                <w:bCs w:val="false"/>
+                <w:sz w:val="19"/>
+                <w:szCs w:val="19"/>
+              </w:rPr>
+              <w:t xml:space="preserve">40 ng</w:t>
+            </w:r>
+          </w:p>
+        </w:tc>
+        <w:tc>
+          <w:tcPr>
+            <w:tcW w:type="dxa" w:w="4513"/>
             <w:tcMar>
               <w:top w:type="dxa" w:w="60"/>
               <w:left w:type="dxa" w:w="100"/>
@@ -2865,32 +2865,32 @@
         </w:tc>
         <w:tc>
           <w:tcPr>
-            <w:tcW w:type="dxa" w:w="2006"/>
-            <w:tcMar>
-              <w:top w:type="dxa" w:w="60"/>
-              <w:left w:type="dxa" w:w="100"/>
-              <w:bottom w:type="dxa" w:w="60"/>
-              <w:right w:type="dxa" w:w="100"/>
-            </w:tcMar>
-          </w:tcPr>
-          <w:p>
-            <w:pPr>
-              <w:spacing w:after="0"/>
-            </w:pPr>
-            <w:r>
-              <w:rPr>
-                <w:b w:val="false"/>
-                <w:bCs w:val="false"/>
-                <w:sz w:val="19"/>
-                <w:szCs w:val="19"/>
-              </w:rPr>
-              <w:t xml:space="preserve">50 ng</w:t>
-            </w:r>
-          </w:p>
-        </w:tc>
-        <w:tc>
-          <w:tcPr>
-            <w:tcW w:type="dxa" w:w="5516"/>
+            <w:tcW w:type="dxa" w:w="3009"/>
+            <w:tcMar>
+              <w:top w:type="dxa" w:w="60"/>
+              <w:left w:type="dxa" w:w="100"/>
+              <w:bottom w:type="dxa" w:w="60"/>
+              <w:right w:type="dxa" w:w="100"/>
+            </w:tcMar>
+          </w:tcPr>
+          <w:p>
+            <w:pPr>
+              <w:spacing w:after="0"/>
+            </w:pPr>
+            <w:r>
+              <w:rPr>
+                <w:b w:val="false"/>
+                <w:bCs w:val="false"/>
+                <w:sz w:val="19"/>
+                <w:szCs w:val="19"/>
+              </w:rPr>
+              <w:t xml:space="preserve">40 ng</w:t>
+            </w:r>
+          </w:p>
+        </w:tc>
+        <w:tc>
+          <w:tcPr>
+            <w:tcW w:type="dxa" w:w="4513"/>
             <w:tcMar>
               <w:top w:type="dxa" w:w="60"/>
               <w:left w:type="dxa" w:w="100"/>
@@ -2942,32 +2942,32 @@
         </w:tc>
         <w:tc>
           <w:tcPr>
-            <w:tcW w:type="dxa" w:w="2006"/>
-            <w:tcMar>
-              <w:top w:type="dxa" w:w="60"/>
-              <w:left w:type="dxa" w:w="100"/>
-              <w:bottom w:type="dxa" w:w="60"/>
-              <w:right w:type="dxa" w:w="100"/>
-            </w:tcMar>
-          </w:tcPr>
-          <w:p>
-            <w:pPr>
-              <w:spacing w:after="0"/>
-            </w:pPr>
-            <w:r>
-              <w:rPr>
-                <w:b w:val="false"/>
-                <w:bCs w:val="false"/>
-                <w:sz w:val="19"/>
-                <w:szCs w:val="19"/>
-              </w:rPr>
-              <w:t xml:space="preserve">50 ng</w:t>
-            </w:r>
-          </w:p>
-        </w:tc>
-        <w:tc>
-          <w:tcPr>
-            <w:tcW w:type="dxa" w:w="5516"/>
+            <w:tcW w:type="dxa" w:w="3009"/>
+            <w:tcMar>
+              <w:top w:type="dxa" w:w="60"/>
+              <w:left w:type="dxa" w:w="100"/>
+              <w:bottom w:type="dxa" w:w="60"/>
+              <w:right w:type="dxa" w:w="100"/>
+            </w:tcMar>
+          </w:tcPr>
+          <w:p>
+            <w:pPr>
+              <w:spacing w:after="0"/>
+            </w:pPr>
+            <w:r>
+              <w:rPr>
+                <w:b w:val="false"/>
+                <w:bCs w:val="false"/>
+                <w:sz w:val="19"/>
+                <w:szCs w:val="19"/>
+              </w:rPr>
+              <w:t xml:space="preserve">40 ng</w:t>
+            </w:r>
+          </w:p>
+        </w:tc>
+        <w:tc>
+          <w:tcPr>
+            <w:tcW w:type="dxa" w:w="4513"/>
             <w:tcMar>
               <w:top w:type="dxa" w:w="60"/>
               <w:left w:type="dxa" w:w="100"/>
@@ -3019,32 +3019,32 @@
         </w:tc>
         <w:tc>
           <w:tcPr>
-            <w:tcW w:type="dxa" w:w="2006"/>
-            <w:tcMar>
-              <w:top w:type="dxa" w:w="60"/>
-              <w:left w:type="dxa" w:w="100"/>
-              <w:bottom w:type="dxa" w:w="60"/>
-              <w:right w:type="dxa" w:w="100"/>
-            </w:tcMar>
-          </w:tcPr>
-          <w:p>
-            <w:pPr>
-              <w:spacing w:after="0"/>
-            </w:pPr>
-            <w:r>
-              <w:rPr>
-                <w:b w:val="false"/>
-                <w:bCs w:val="false"/>
-                <w:sz w:val="19"/>
-                <w:szCs w:val="19"/>
-              </w:rPr>
-              <w:t xml:space="preserve">50 ng</w:t>
-            </w:r>
-          </w:p>
-        </w:tc>
-        <w:tc>
-          <w:tcPr>
-            <w:tcW w:type="dxa" w:w="5516"/>
+            <w:tcW w:type="dxa" w:w="3009"/>
+            <w:tcMar>
+              <w:top w:type="dxa" w:w="60"/>
+              <w:left w:type="dxa" w:w="100"/>
+              <w:bottom w:type="dxa" w:w="60"/>
+              <w:right w:type="dxa" w:w="100"/>
+            </w:tcMar>
+          </w:tcPr>
+          <w:p>
+            <w:pPr>
+              <w:spacing w:after="0"/>
+            </w:pPr>
+            <w:r>
+              <w:rPr>
+                <w:b w:val="false"/>
+                <w:bCs w:val="false"/>
+                <w:sz w:val="19"/>
+                <w:szCs w:val="19"/>
+              </w:rPr>
+              <w:t xml:space="preserve">40 ng</w:t>
+            </w:r>
+          </w:p>
+        </w:tc>
+        <w:tc>
+          <w:tcPr>
+            <w:tcW w:type="dxa" w:w="4513"/>
             <w:tcMar>
               <w:top w:type="dxa" w:w="60"/>
               <w:left w:type="dxa" w:w="100"/>
@@ -3096,51 +3096,51 @@
         </w:tc>
         <w:tc>
           <w:tcPr>
-            <w:tcW w:type="dxa" w:w="2006"/>
-            <w:tcMar>
-              <w:top w:type="dxa" w:w="60"/>
-              <w:left w:type="dxa" w:w="100"/>
-              <w:bottom w:type="dxa" w:w="60"/>
-              <w:right w:type="dxa" w:w="100"/>
-            </w:tcMar>
-          </w:tcPr>
-          <w:p>
-            <w:pPr>
-              <w:spacing w:after="0"/>
-            </w:pPr>
-            <w:r>
-              <w:rPr>
-                <w:b w:val="false"/>
-                <w:bCs w:val="false"/>
-                <w:sz w:val="19"/>
-                <w:szCs w:val="19"/>
-              </w:rPr>
-              <w:t xml:space="preserve">50 ng</w:t>
-            </w:r>
-          </w:p>
-        </w:tc>
-        <w:tc>
-          <w:tcPr>
-            <w:tcW w:type="dxa" w:w="5516"/>
-            <w:tcMar>
-              <w:top w:type="dxa" w:w="60"/>
-              <w:left w:type="dxa" w:w="100"/>
-              <w:bottom w:type="dxa" w:w="60"/>
-              <w:right w:type="dxa" w:w="100"/>
-            </w:tcMar>
-          </w:tcPr>
-          <w:p>
-            <w:pPr>
-              <w:spacing w:after="0"/>
-            </w:pPr>
-            <w:r>
-              <w:rPr>
-                <w:b w:val="false"/>
-                <w:bCs w:val="false"/>
-                <w:sz w:val="19"/>
-                <w:szCs w:val="19"/>
-              </w:rPr>
-              <w:t xml:space="preserve">Commercial Tn5 (e.g. Illumina TDE1 or Diagenode) at recommended amount</w:t>
+            <w:tcW w:type="dxa" w:w="3009"/>
+            <w:tcMar>
+              <w:top w:type="dxa" w:w="60"/>
+              <w:left w:type="dxa" w:w="100"/>
+              <w:bottom w:type="dxa" w:w="60"/>
+              <w:right w:type="dxa" w:w="100"/>
+            </w:tcMar>
+          </w:tcPr>
+          <w:p>
+            <w:pPr>
+              <w:spacing w:after="0"/>
+            </w:pPr>
+            <w:r>
+              <w:rPr>
+                <w:b w:val="false"/>
+                <w:bCs w:val="false"/>
+                <w:sz w:val="19"/>
+                <w:szCs w:val="19"/>
+              </w:rPr>
+              <w:t xml:space="preserve">40 ng</w:t>
+            </w:r>
+          </w:p>
+        </w:tc>
+        <w:tc>
+          <w:tcPr>
+            <w:tcW w:type="dxa" w:w="4513"/>
+            <w:tcMar>
+              <w:top w:type="dxa" w:w="60"/>
+              <w:left w:type="dxa" w:w="100"/>
+              <w:bottom w:type="dxa" w:w="60"/>
+              <w:right w:type="dxa" w:w="100"/>
+            </w:tcMar>
+          </w:tcPr>
+          <w:p>
+            <w:pPr>
+              <w:spacing w:after="0"/>
+            </w:pPr>
+            <w:r>
+              <w:rPr>
+                <w:b w:val="false"/>
+                <w:bCs w:val="false"/>
+                <w:sz w:val="19"/>
+                <w:szCs w:val="19"/>
+              </w:rPr>
+              <w:t xml:space="preserve">Commercial Tn5 (e.g. Illumina TDE1) at recommended amount</w:t>
             </w:r>
           </w:p>
         </w:tc>
@@ -5009,6 +5009,3027 @@
       </w:pPr>
       <w:r>
         <w:t xml:space="preserve">Chen et al. Cell-free chromatin state tracing reveals disease origin and therapy responses. Nature (2026). DOI: 10.1038/s41586-026-10224-0 (PMC13171458).</w:t>
+      </w:r>
+    </w:p>
+    <w:p>
+      <w:pPr>
+        <w:pStyle w:val="Heading1"/>
+        <w:spacing w:after="120" w:before="300"/>
+      </w:pPr>
+      <w:r>
+        <w:t xml:space="preserve">Appendix A. In-house Tn5 batch: record and QC</w:t>
+      </w:r>
+    </w:p>
+    <w:p>
+      <w:pPr>
+        <w:pStyle w:val="Heading2"/>
+        <w:spacing w:after="100" w:before="200"/>
+      </w:pPr>
+      <w:r>
+        <w:t xml:space="preserve">A.1 Batch record</w:t>
+      </w:r>
+    </w:p>
+    <w:tbl>
+      <w:tblPr>
+        <w:tblW w:type="dxa" w:w="9026"/>
+        <w:tblBorders>
+          <w:top w:val="single" w:color="auto" w:sz="4"/>
+          <w:left w:val="single" w:color="auto" w:sz="4"/>
+          <w:bottom w:val="single" w:color="auto" w:sz="4"/>
+          <w:right w:val="single" w:color="auto" w:sz="4"/>
+          <w:insideH w:val="single" w:color="auto" w:sz="4"/>
+          <w:insideV w:val="single" w:color="auto" w:sz="4"/>
+        </w:tblBorders>
+      </w:tblPr>
+      <w:tblGrid>
+        <w:gridCol w:w="2507"/>
+        <w:gridCol w:w="6519"/>
+      </w:tblGrid>
+      <w:tr>
+        <w:trPr>
+          <w:tblHeader/>
+        </w:trPr>
+        <w:tc>
+          <w:tcPr>
+            <w:tcW w:type="dxa" w:w="2507"/>
+            <w:shd w:fill="1F4E79" w:color="auto" w:val="clear"/>
+            <w:tcMar>
+              <w:top w:type="dxa" w:w="60"/>
+              <w:left w:type="dxa" w:w="100"/>
+              <w:bottom w:type="dxa" w:w="60"/>
+              <w:right w:type="dxa" w:w="100"/>
+            </w:tcMar>
+          </w:tcPr>
+          <w:p>
+            <w:pPr>
+              <w:spacing w:after="0"/>
+            </w:pPr>
+            <w:r>
+              <w:rPr>
+                <w:b/>
+                <w:bCs/>
+                <w:color w:val="FFFFFF"/>
+                <w:sz w:val="19"/>
+                <w:szCs w:val="19"/>
+              </w:rPr>
+              <w:t xml:space="preserve">Item</w:t>
+            </w:r>
+          </w:p>
+        </w:tc>
+        <w:tc>
+          <w:tcPr>
+            <w:tcW w:type="dxa" w:w="6519"/>
+            <w:shd w:fill="1F4E79" w:color="auto" w:val="clear"/>
+            <w:tcMar>
+              <w:top w:type="dxa" w:w="60"/>
+              <w:left w:type="dxa" w:w="100"/>
+              <w:bottom w:type="dxa" w:w="60"/>
+              <w:right w:type="dxa" w:w="100"/>
+            </w:tcMar>
+          </w:tcPr>
+          <w:p>
+            <w:pPr>
+              <w:spacing w:after="0"/>
+            </w:pPr>
+            <w:r>
+              <w:rPr>
+                <w:b/>
+                <w:bCs/>
+                <w:color w:val="FFFFFF"/>
+                <w:sz w:val="19"/>
+                <w:szCs w:val="19"/>
+              </w:rPr>
+              <w:t xml:space="preserve">Details</w:t>
+            </w:r>
+          </w:p>
+        </w:tc>
+      </w:tr>
+      <w:tr>
+        <w:tc>
+          <w:tcPr>
+            <w:tcW w:type="dxa" w:w="2507"/>
+            <w:tcMar>
+              <w:top w:type="dxa" w:w="60"/>
+              <w:left w:type="dxa" w:w="100"/>
+              <w:bottom w:type="dxa" w:w="60"/>
+              <w:right w:type="dxa" w:w="100"/>
+            </w:tcMar>
+          </w:tcPr>
+          <w:p>
+            <w:pPr>
+              <w:spacing w:after="0"/>
+            </w:pPr>
+            <w:r>
+              <w:rPr>
+                <w:b w:val="false"/>
+                <w:bCs w:val="false"/>
+                <w:sz w:val="19"/>
+                <w:szCs w:val="19"/>
+              </w:rPr>
+              <w:t xml:space="preserve">Construct</w:t>
+            </w:r>
+          </w:p>
+        </w:tc>
+        <w:tc>
+          <w:tcPr>
+            <w:tcW w:type="dxa" w:w="6519"/>
+            <w:tcMar>
+              <w:top w:type="dxa" w:w="60"/>
+              <w:left w:type="dxa" w:w="100"/>
+              <w:bottom w:type="dxa" w:w="60"/>
+              <w:right w:type="dxa" w:w="100"/>
+            </w:tcMar>
+          </w:tcPr>
+          <w:p>
+            <w:pPr>
+              <w:spacing w:after="0"/>
+            </w:pPr>
+            <w:r>
+              <w:rPr>
+                <w:b w:val="false"/>
+                <w:bCs w:val="false"/>
+                <w:sz w:val="19"/>
+                <w:szCs w:val="19"/>
+              </w:rPr>
+              <w:t xml:space="preserve">pTXB1-Tn5 (from Trung); expressed in BL21(DE3) (NEB)</w:t>
+            </w:r>
+          </w:p>
+        </w:tc>
+      </w:tr>
+      <w:tr>
+        <w:tc>
+          <w:tcPr>
+            <w:tcW w:type="dxa" w:w="2507"/>
+            <w:tcMar>
+              <w:top w:type="dxa" w:w="60"/>
+              <w:left w:type="dxa" w:w="100"/>
+              <w:bottom w:type="dxa" w:w="60"/>
+              <w:right w:type="dxa" w:w="100"/>
+            </w:tcMar>
+          </w:tcPr>
+          <w:p>
+            <w:pPr>
+              <w:spacing w:after="0"/>
+            </w:pPr>
+            <w:r>
+              <w:rPr>
+                <w:b w:val="false"/>
+                <w:bCs w:val="false"/>
+                <w:sz w:val="19"/>
+                <w:szCs w:val="19"/>
+              </w:rPr>
+              <w:t xml:space="preserve">Culture</w:t>
+            </w:r>
+          </w:p>
+        </w:tc>
+        <w:tc>
+          <w:tcPr>
+            <w:tcW w:type="dxa" w:w="6519"/>
+            <w:tcMar>
+              <w:top w:type="dxa" w:w="60"/>
+              <w:left w:type="dxa" w:w="100"/>
+              <w:bottom w:type="dxa" w:w="60"/>
+              <w:right w:type="dxa" w:w="100"/>
+            </w:tcMar>
+          </w:tcPr>
+          <w:p>
+            <w:pPr>
+              <w:spacing w:after="0"/>
+            </w:pPr>
+            <w:r>
+              <w:rPr>
+                <w:b w:val="false"/>
+                <w:bCs w:val="false"/>
+                <w:sz w:val="19"/>
+                <w:szCs w:val="19"/>
+              </w:rPr>
+              <w:t xml:space="preserve">10 ml overnight (OD600 0.042 at inoculation) into 1 L LB + amp; 200 rpm; OD600 1.074 after 3 h 20 min</w:t>
+            </w:r>
+          </w:p>
+        </w:tc>
+      </w:tr>
+      <w:tr>
+        <w:tc>
+          <w:tcPr>
+            <w:tcW w:type="dxa" w:w="2507"/>
+            <w:tcMar>
+              <w:top w:type="dxa" w:w="60"/>
+              <w:left w:type="dxa" w:w="100"/>
+              <w:bottom w:type="dxa" w:w="60"/>
+              <w:right w:type="dxa" w:w="100"/>
+            </w:tcMar>
+          </w:tcPr>
+          <w:p>
+            <w:pPr>
+              <w:spacing w:after="0"/>
+            </w:pPr>
+            <w:r>
+              <w:rPr>
+                <w:b w:val="false"/>
+                <w:bCs w:val="false"/>
+                <w:sz w:val="19"/>
+                <w:szCs w:val="19"/>
+              </w:rPr>
+              <w:t xml:space="preserve">Induction</w:t>
+            </w:r>
+          </w:p>
+        </w:tc>
+        <w:tc>
+          <w:tcPr>
+            <w:tcW w:type="dxa" w:w="6519"/>
+            <w:tcMar>
+              <w:top w:type="dxa" w:w="60"/>
+              <w:left w:type="dxa" w:w="100"/>
+              <w:bottom w:type="dxa" w:w="60"/>
+              <w:right w:type="dxa" w:w="100"/>
+            </w:tcMar>
+          </w:tcPr>
+          <w:p>
+            <w:pPr>
+              <w:spacing w:after="0"/>
+            </w:pPr>
+            <w:r>
+              <w:rPr>
+                <w:b w:val="false"/>
+                <w:bCs w:val="false"/>
+                <w:sz w:val="19"/>
+                <w:szCs w:val="19"/>
+              </w:rPr>
+              <w:t xml:space="preserve">0.25 mM IPTG (250 µl of 1 M per 1 L); 25 °C, 4 h, 100 rpm; final OD600 2.25; pellet stored at −80 °C</w:t>
+            </w:r>
+          </w:p>
+        </w:tc>
+      </w:tr>
+      <w:tr>
+        <w:tc>
+          <w:tcPr>
+            <w:tcW w:type="dxa" w:w="2507"/>
+            <w:tcMar>
+              <w:top w:type="dxa" w:w="60"/>
+              <w:left w:type="dxa" w:w="100"/>
+              <w:bottom w:type="dxa" w:w="60"/>
+              <w:right w:type="dxa" w:w="100"/>
+            </w:tcMar>
+          </w:tcPr>
+          <w:p>
+            <w:pPr>
+              <w:spacing w:after="0"/>
+            </w:pPr>
+            <w:r>
+              <w:rPr>
+                <w:b w:val="false"/>
+                <w:bCs w:val="false"/>
+                <w:sz w:val="19"/>
+                <w:szCs w:val="19"/>
+              </w:rPr>
+              <w:t xml:space="preserve">Purification</w:t>
+            </w:r>
+          </w:p>
+        </w:tc>
+        <w:tc>
+          <w:tcPr>
+            <w:tcW w:type="dxa" w:w="6519"/>
+            <w:tcMar>
+              <w:top w:type="dxa" w:w="60"/>
+              <w:left w:type="dxa" w:w="100"/>
+              <w:bottom w:type="dxa" w:w="60"/>
+              <w:right w:type="dxa" w:w="100"/>
+            </w:tcMar>
+          </w:tcPr>
+          <w:p>
+            <w:pPr>
+              <w:spacing w:after="0"/>
+            </w:pPr>
+            <w:r>
+              <w:rPr>
+                <w:b w:val="false"/>
+                <w:bCs w:val="false"/>
+                <w:sz w:val="19"/>
+                <w:szCs w:val="19"/>
+              </w:rPr>
+              <w:t xml:space="preserve">Chitin column (intein cleavage); ~3 ml concentrated in 30 kDa Amicon (3,500 g, 5-min intervals, ~20 min)</w:t>
+            </w:r>
+          </w:p>
+        </w:tc>
+      </w:tr>
+      <w:tr>
+        <w:tc>
+          <w:tcPr>
+            <w:tcW w:type="dxa" w:w="2507"/>
+            <w:tcMar>
+              <w:top w:type="dxa" w:w="60"/>
+              <w:left w:type="dxa" w:w="100"/>
+              <w:bottom w:type="dxa" w:w="60"/>
+              <w:right w:type="dxa" w:w="100"/>
+            </w:tcMar>
+          </w:tcPr>
+          <w:p>
+            <w:pPr>
+              <w:spacing w:after="0"/>
+            </w:pPr>
+            <w:r>
+              <w:rPr>
+                <w:b w:val="false"/>
+                <w:bCs w:val="false"/>
+                <w:sz w:val="19"/>
+                <w:szCs w:val="19"/>
+              </w:rPr>
+              <w:t xml:space="preserve">Concentration</w:t>
+            </w:r>
+          </w:p>
+        </w:tc>
+        <w:tc>
+          <w:tcPr>
+            <w:tcW w:type="dxa" w:w="6519"/>
+            <w:tcMar>
+              <w:top w:type="dxa" w:w="60"/>
+              <w:left w:type="dxa" w:w="100"/>
+              <w:bottom w:type="dxa" w:w="60"/>
+              <w:right w:type="dxa" w:w="100"/>
+            </w:tcMar>
+          </w:tcPr>
+          <w:p>
+            <w:pPr>
+              <w:spacing w:after="0"/>
+            </w:pPr>
+            <w:r>
+              <w:rPr>
+                <w:b w:val="false"/>
+                <w:bCs w:val="false"/>
+                <w:sz w:val="19"/>
+                <w:szCs w:val="19"/>
+              </w:rPr>
+              <w:t xml:space="preserve">A280 = 33.4 → ~385 µM (ε ≈ 86,900 M⁻¹cm⁻¹); to be confirmed by SDS-PAGE/Bradford (see A.3)</w:t>
+            </w:r>
+          </w:p>
+        </w:tc>
+      </w:tr>
+      <w:tr>
+        <w:tc>
+          <w:tcPr>
+            <w:tcW w:type="dxa" w:w="2507"/>
+            <w:tcMar>
+              <w:top w:type="dxa" w:w="60"/>
+              <w:left w:type="dxa" w:w="100"/>
+              <w:bottom w:type="dxa" w:w="60"/>
+              <w:right w:type="dxa" w:w="100"/>
+            </w:tcMar>
+          </w:tcPr>
+          <w:p>
+            <w:pPr>
+              <w:spacing w:after="0"/>
+            </w:pPr>
+            <w:r>
+              <w:rPr>
+                <w:b w:val="false"/>
+                <w:bCs w:val="false"/>
+                <w:sz w:val="19"/>
+                <w:szCs w:val="19"/>
+              </w:rPr>
+              <w:t xml:space="preserve">Storage buffer (Chen et al.)</w:t>
+            </w:r>
+          </w:p>
+        </w:tc>
+        <w:tc>
+          <w:tcPr>
+            <w:tcW w:type="dxa" w:w="6519"/>
+            <w:tcMar>
+              <w:top w:type="dxa" w:w="60"/>
+              <w:left w:type="dxa" w:w="100"/>
+              <w:bottom w:type="dxa" w:w="60"/>
+              <w:right w:type="dxa" w:w="100"/>
+            </w:tcMar>
+          </w:tcPr>
+          <w:p>
+            <w:pPr>
+              <w:spacing w:after="0"/>
+            </w:pPr>
+            <w:r>
+              <w:rPr>
+                <w:b w:val="false"/>
+                <w:bCs w:val="false"/>
+                <w:sz w:val="19"/>
+                <w:szCs w:val="19"/>
+              </w:rPr>
+              <w:t xml:space="preserve">50 mM HEPES pH 7.2, 100 mM NaCl, 0.1 mM EDTA, 1 mM DTT, 0.1% Triton X-100, 60% glycerol</w:t>
+            </w:r>
+          </w:p>
+        </w:tc>
+      </w:tr>
+      <w:tr>
+        <w:tc>
+          <w:tcPr>
+            <w:tcW w:type="dxa" w:w="2507"/>
+            <w:tcMar>
+              <w:top w:type="dxa" w:w="60"/>
+              <w:left w:type="dxa" w:w="100"/>
+              <w:bottom w:type="dxa" w:w="60"/>
+              <w:right w:type="dxa" w:w="100"/>
+            </w:tcMar>
+          </w:tcPr>
+          <w:p>
+            <w:pPr>
+              <w:spacing w:after="0"/>
+            </w:pPr>
+            <w:r>
+              <w:rPr>
+                <w:b w:val="false"/>
+                <w:bCs w:val="false"/>
+                <w:sz w:val="19"/>
+                <w:szCs w:val="19"/>
+              </w:rPr>
+              <w:t xml:space="preserve">Loaded stock</w:t>
+            </w:r>
+          </w:p>
+        </w:tc>
+        <w:tc>
+          <w:tcPr>
+            <w:tcW w:type="dxa" w:w="6519"/>
+            <w:tcMar>
+              <w:top w:type="dxa" w:w="60"/>
+              <w:left w:type="dxa" w:w="100"/>
+              <w:bottom w:type="dxa" w:w="60"/>
+              <w:right w:type="dxa" w:w="100"/>
+            </w:tcMar>
+          </w:tcPr>
+          <w:p>
+            <w:pPr>
+              <w:spacing w:after="0"/>
+            </w:pPr>
+            <w:r>
+              <w:rPr>
+                <w:b w:val="false"/>
+                <w:bCs w:val="false"/>
+                <w:sz w:val="19"/>
+                <w:szCs w:val="19"/>
+              </w:rPr>
+              <w:t xml:space="preserve">37.5 µM Tn5 + 37.5 µM annealed MEA/MEB adapters (1:1), 1 h RT; liquid at −20 °C; use within 6 months</w:t>
+            </w:r>
+          </w:p>
+        </w:tc>
+      </w:tr>
+    </w:tbl>
+    <w:p>
+      <w:pPr>
+        <w:pStyle w:val="Heading2"/>
+        <w:spacing w:after="100" w:before="200"/>
+      </w:pPr>
+      <w:r>
+        <w:t xml:space="preserve">A.2 Assembly (50 µl loaded stock, 37.5 µM)</w:t>
+      </w:r>
+    </w:p>
+    <w:tbl>
+      <w:tblPr>
+        <w:tblW w:type="dxa" w:w="9026"/>
+        <w:tblBorders>
+          <w:top w:val="single" w:color="auto" w:sz="4"/>
+          <w:left w:val="single" w:color="auto" w:sz="4"/>
+          <w:bottom w:val="single" w:color="auto" w:sz="4"/>
+          <w:right w:val="single" w:color="auto" w:sz="4"/>
+          <w:insideH w:val="single" w:color="auto" w:sz="4"/>
+          <w:insideV w:val="single" w:color="auto" w:sz="4"/>
+        </w:tblBorders>
+      </w:tblPr>
+      <w:tblGrid>
+        <w:gridCol w:w="4012"/>
+        <w:gridCol w:w="1605"/>
+        <w:gridCol w:w="1605"/>
+        <w:gridCol w:w="1804"/>
+      </w:tblGrid>
+      <w:tr>
+        <w:trPr>
+          <w:tblHeader/>
+        </w:trPr>
+        <w:tc>
+          <w:tcPr>
+            <w:tcW w:type="dxa" w:w="4012"/>
+            <w:shd w:fill="1F4E79" w:color="auto" w:val="clear"/>
+            <w:tcMar>
+              <w:top w:type="dxa" w:w="60"/>
+              <w:left w:type="dxa" w:w="100"/>
+              <w:bottom w:type="dxa" w:w="60"/>
+              <w:right w:type="dxa" w:w="100"/>
+            </w:tcMar>
+          </w:tcPr>
+          <w:p>
+            <w:pPr>
+              <w:spacing w:after="0"/>
+            </w:pPr>
+            <w:r>
+              <w:rPr>
+                <w:b/>
+                <w:bCs/>
+                <w:color w:val="FFFFFF"/>
+                <w:sz w:val="19"/>
+                <w:szCs w:val="19"/>
+              </w:rPr>
+              <w:t xml:space="preserve">Component</w:t>
+            </w:r>
+          </w:p>
+        </w:tc>
+        <w:tc>
+          <w:tcPr>
+            <w:tcW w:type="dxa" w:w="1605"/>
+            <w:shd w:fill="1F4E79" w:color="auto" w:val="clear"/>
+            <w:tcMar>
+              <w:top w:type="dxa" w:w="60"/>
+              <w:left w:type="dxa" w:w="100"/>
+              <w:bottom w:type="dxa" w:w="60"/>
+              <w:right w:type="dxa" w:w="100"/>
+            </w:tcMar>
+          </w:tcPr>
+          <w:p>
+            <w:pPr>
+              <w:spacing w:after="0"/>
+            </w:pPr>
+            <w:r>
+              <w:rPr>
+                <w:b/>
+                <w:bCs/>
+                <w:color w:val="FFFFFF"/>
+                <w:sz w:val="19"/>
+                <w:szCs w:val="19"/>
+              </w:rPr>
+              <w:t xml:space="preserve">Stock</w:t>
+            </w:r>
+          </w:p>
+        </w:tc>
+        <w:tc>
+          <w:tcPr>
+            <w:tcW w:type="dxa" w:w="1605"/>
+            <w:shd w:fill="1F4E79" w:color="auto" w:val="clear"/>
+            <w:tcMar>
+              <w:top w:type="dxa" w:w="60"/>
+              <w:left w:type="dxa" w:w="100"/>
+              <w:bottom w:type="dxa" w:w="60"/>
+              <w:right w:type="dxa" w:w="100"/>
+            </w:tcMar>
+          </w:tcPr>
+          <w:p>
+            <w:pPr>
+              <w:spacing w:after="0"/>
+            </w:pPr>
+            <w:r>
+              <w:rPr>
+                <w:b/>
+                <w:bCs/>
+                <w:color w:val="FFFFFF"/>
+                <w:sz w:val="19"/>
+                <w:szCs w:val="19"/>
+              </w:rPr>
+              <w:t xml:space="preserve">Volume</w:t>
+            </w:r>
+          </w:p>
+        </w:tc>
+        <w:tc>
+          <w:tcPr>
+            <w:tcW w:type="dxa" w:w="1804"/>
+            <w:shd w:fill="1F4E79" w:color="auto" w:val="clear"/>
+            <w:tcMar>
+              <w:top w:type="dxa" w:w="60"/>
+              <w:left w:type="dxa" w:w="100"/>
+              <w:bottom w:type="dxa" w:w="60"/>
+              <w:right w:type="dxa" w:w="100"/>
+            </w:tcMar>
+          </w:tcPr>
+          <w:p>
+            <w:pPr>
+              <w:spacing w:after="0"/>
+            </w:pPr>
+            <w:r>
+              <w:rPr>
+                <w:b/>
+                <w:bCs/>
+                <w:color w:val="FFFFFF"/>
+                <w:sz w:val="19"/>
+                <w:szCs w:val="19"/>
+              </w:rPr>
+              <w:t xml:space="preserve">Final</w:t>
+            </w:r>
+          </w:p>
+        </w:tc>
+      </w:tr>
+      <w:tr>
+        <w:tc>
+          <w:tcPr>
+            <w:tcW w:type="dxa" w:w="4012"/>
+            <w:tcMar>
+              <w:top w:type="dxa" w:w="60"/>
+              <w:left w:type="dxa" w:w="100"/>
+              <w:bottom w:type="dxa" w:w="60"/>
+              <w:right w:type="dxa" w:w="100"/>
+            </w:tcMar>
+          </w:tcPr>
+          <w:p>
+            <w:pPr>
+              <w:spacing w:after="0"/>
+            </w:pPr>
+            <w:r>
+              <w:rPr>
+                <w:b w:val="false"/>
+                <w:bCs w:val="false"/>
+                <w:sz w:val="19"/>
+                <w:szCs w:val="19"/>
+              </w:rPr>
+              <w:t xml:space="preserve">Tn5</w:t>
+            </w:r>
+          </w:p>
+        </w:tc>
+        <w:tc>
+          <w:tcPr>
+            <w:tcW w:type="dxa" w:w="1605"/>
+            <w:tcMar>
+              <w:top w:type="dxa" w:w="60"/>
+              <w:left w:type="dxa" w:w="100"/>
+              <w:bottom w:type="dxa" w:w="60"/>
+              <w:right w:type="dxa" w:w="100"/>
+            </w:tcMar>
+          </w:tcPr>
+          <w:p>
+            <w:pPr>
+              <w:spacing w:after="0"/>
+            </w:pPr>
+            <w:r>
+              <w:rPr>
+                <w:b w:val="false"/>
+                <w:bCs w:val="false"/>
+                <w:sz w:val="19"/>
+                <w:szCs w:val="19"/>
+              </w:rPr>
+              <w:t xml:space="preserve">~385 µM</w:t>
+            </w:r>
+          </w:p>
+        </w:tc>
+        <w:tc>
+          <w:tcPr>
+            <w:tcW w:type="dxa" w:w="1605"/>
+            <w:tcMar>
+              <w:top w:type="dxa" w:w="60"/>
+              <w:left w:type="dxa" w:w="100"/>
+              <w:bottom w:type="dxa" w:w="60"/>
+              <w:right w:type="dxa" w:w="100"/>
+            </w:tcMar>
+          </w:tcPr>
+          <w:p>
+            <w:pPr>
+              <w:spacing w:after="0"/>
+            </w:pPr>
+            <w:r>
+              <w:rPr>
+                <w:b w:val="false"/>
+                <w:bCs w:val="false"/>
+                <w:sz w:val="19"/>
+                <w:szCs w:val="19"/>
+              </w:rPr>
+              <w:t xml:space="preserve">4.87 µl</w:t>
+            </w:r>
+          </w:p>
+        </w:tc>
+        <w:tc>
+          <w:tcPr>
+            <w:tcW w:type="dxa" w:w="1804"/>
+            <w:tcMar>
+              <w:top w:type="dxa" w:w="60"/>
+              <w:left w:type="dxa" w:w="100"/>
+              <w:bottom w:type="dxa" w:w="60"/>
+              <w:right w:type="dxa" w:w="100"/>
+            </w:tcMar>
+          </w:tcPr>
+          <w:p>
+            <w:pPr>
+              <w:spacing w:after="0"/>
+            </w:pPr>
+            <w:r>
+              <w:rPr>
+                <w:b w:val="false"/>
+                <w:bCs w:val="false"/>
+                <w:sz w:val="19"/>
+                <w:szCs w:val="19"/>
+              </w:rPr>
+              <w:t xml:space="preserve">37.5 µM</w:t>
+            </w:r>
+          </w:p>
+        </w:tc>
+      </w:tr>
+      <w:tr>
+        <w:tc>
+          <w:tcPr>
+            <w:tcW w:type="dxa" w:w="4012"/>
+            <w:tcMar>
+              <w:top w:type="dxa" w:w="60"/>
+              <w:left w:type="dxa" w:w="100"/>
+              <w:bottom w:type="dxa" w:w="60"/>
+              <w:right w:type="dxa" w:w="100"/>
+            </w:tcMar>
+          </w:tcPr>
+          <w:p>
+            <w:pPr>
+              <w:spacing w:after="0"/>
+            </w:pPr>
+            <w:r>
+              <w:rPr>
+                <w:b w:val="false"/>
+                <w:bCs w:val="false"/>
+                <w:sz w:val="19"/>
+                <w:szCs w:val="19"/>
+              </w:rPr>
+              <w:t xml:space="preserve">Storage buffer</w:t>
+            </w:r>
+          </w:p>
+        </w:tc>
+        <w:tc>
+          <w:tcPr>
+            <w:tcW w:type="dxa" w:w="1605"/>
+            <w:tcMar>
+              <w:top w:type="dxa" w:w="60"/>
+              <w:left w:type="dxa" w:w="100"/>
+              <w:bottom w:type="dxa" w:w="60"/>
+              <w:right w:type="dxa" w:w="100"/>
+            </w:tcMar>
+          </w:tcPr>
+          <w:p>
+            <w:pPr>
+              <w:spacing w:after="0"/>
+            </w:pPr>
+            <w:r>
+              <w:rPr>
+                <w:b w:val="false"/>
+                <w:bCs w:val="false"/>
+                <w:sz w:val="19"/>
+                <w:szCs w:val="19"/>
+              </w:rPr>
+              <w:t xml:space="preserve">—</w:t>
+            </w:r>
+          </w:p>
+        </w:tc>
+        <w:tc>
+          <w:tcPr>
+            <w:tcW w:type="dxa" w:w="1605"/>
+            <w:tcMar>
+              <w:top w:type="dxa" w:w="60"/>
+              <w:left w:type="dxa" w:w="100"/>
+              <w:bottom w:type="dxa" w:w="60"/>
+              <w:right w:type="dxa" w:w="100"/>
+            </w:tcMar>
+          </w:tcPr>
+          <w:p>
+            <w:pPr>
+              <w:spacing w:after="0"/>
+            </w:pPr>
+            <w:r>
+              <w:rPr>
+                <w:b w:val="false"/>
+                <w:bCs w:val="false"/>
+                <w:sz w:val="19"/>
+                <w:szCs w:val="19"/>
+              </w:rPr>
+              <w:t xml:space="preserve">25.83 µl</w:t>
+            </w:r>
+          </w:p>
+        </w:tc>
+        <w:tc>
+          <w:tcPr>
+            <w:tcW w:type="dxa" w:w="1804"/>
+            <w:tcMar>
+              <w:top w:type="dxa" w:w="60"/>
+              <w:left w:type="dxa" w:w="100"/>
+              <w:bottom w:type="dxa" w:w="60"/>
+              <w:right w:type="dxa" w:w="100"/>
+            </w:tcMar>
+          </w:tcPr>
+          <w:p>
+            <w:pPr>
+              <w:spacing w:after="0"/>
+            </w:pPr>
+            <w:r>
+              <w:rPr>
+                <w:b w:val="false"/>
+                <w:bCs w:val="false"/>
+                <w:sz w:val="19"/>
+                <w:szCs w:val="19"/>
+              </w:rPr>
+              <w:t xml:space="preserve">—</w:t>
+            </w:r>
+          </w:p>
+        </w:tc>
+      </w:tr>
+      <w:tr>
+        <w:tc>
+          <w:tcPr>
+            <w:tcW w:type="dxa" w:w="4012"/>
+            <w:tcMar>
+              <w:top w:type="dxa" w:w="60"/>
+              <w:left w:type="dxa" w:w="100"/>
+              <w:bottom w:type="dxa" w:w="60"/>
+              <w:right w:type="dxa" w:w="100"/>
+            </w:tcMar>
+          </w:tcPr>
+          <w:p>
+            <w:pPr>
+              <w:spacing w:after="0"/>
+            </w:pPr>
+            <w:r>
+              <w:rPr>
+                <w:b w:val="false"/>
+                <w:bCs w:val="false"/>
+                <w:sz w:val="19"/>
+                <w:szCs w:val="19"/>
+              </w:rPr>
+              <w:t xml:space="preserve">Protease inhibitor cocktail</w:t>
+            </w:r>
+          </w:p>
+        </w:tc>
+        <w:tc>
+          <w:tcPr>
+            <w:tcW w:type="dxa" w:w="1605"/>
+            <w:tcMar>
+              <w:top w:type="dxa" w:w="60"/>
+              <w:left w:type="dxa" w:w="100"/>
+              <w:bottom w:type="dxa" w:w="60"/>
+              <w:right w:type="dxa" w:w="100"/>
+            </w:tcMar>
+          </w:tcPr>
+          <w:p>
+            <w:pPr>
+              <w:spacing w:after="0"/>
+            </w:pPr>
+            <w:r>
+              <w:rPr>
+                <w:b w:val="false"/>
+                <w:bCs w:val="false"/>
+                <w:sz w:val="19"/>
+                <w:szCs w:val="19"/>
+              </w:rPr>
+              <w:t xml:space="preserve">100×</w:t>
+            </w:r>
+          </w:p>
+        </w:tc>
+        <w:tc>
+          <w:tcPr>
+            <w:tcW w:type="dxa" w:w="1605"/>
+            <w:tcMar>
+              <w:top w:type="dxa" w:w="60"/>
+              <w:left w:type="dxa" w:w="100"/>
+              <w:bottom w:type="dxa" w:w="60"/>
+              <w:right w:type="dxa" w:w="100"/>
+            </w:tcMar>
+          </w:tcPr>
+          <w:p>
+            <w:pPr>
+              <w:spacing w:after="0"/>
+            </w:pPr>
+            <w:r>
+              <w:rPr>
+                <w:b w:val="false"/>
+                <w:bCs w:val="false"/>
+                <w:sz w:val="19"/>
+                <w:szCs w:val="19"/>
+              </w:rPr>
+              <w:t xml:space="preserve">0.5 µl</w:t>
+            </w:r>
+          </w:p>
+        </w:tc>
+        <w:tc>
+          <w:tcPr>
+            <w:tcW w:type="dxa" w:w="1804"/>
+            <w:tcMar>
+              <w:top w:type="dxa" w:w="60"/>
+              <w:left w:type="dxa" w:w="100"/>
+              <w:bottom w:type="dxa" w:w="60"/>
+              <w:right w:type="dxa" w:w="100"/>
+            </w:tcMar>
+          </w:tcPr>
+          <w:p>
+            <w:pPr>
+              <w:spacing w:after="0"/>
+            </w:pPr>
+            <w:r>
+              <w:rPr>
+                <w:b w:val="false"/>
+                <w:bCs w:val="false"/>
+                <w:sz w:val="19"/>
+                <w:szCs w:val="19"/>
+              </w:rPr>
+              <w:t xml:space="preserve">1×</w:t>
+            </w:r>
+          </w:p>
+        </w:tc>
+      </w:tr>
+      <w:tr>
+        <w:tc>
+          <w:tcPr>
+            <w:tcW w:type="dxa" w:w="4012"/>
+            <w:tcMar>
+              <w:top w:type="dxa" w:w="60"/>
+              <w:left w:type="dxa" w:w="100"/>
+              <w:bottom w:type="dxa" w:w="60"/>
+              <w:right w:type="dxa" w:w="100"/>
+            </w:tcMar>
+          </w:tcPr>
+          <w:p>
+            <w:pPr>
+              <w:spacing w:after="0"/>
+            </w:pPr>
+            <w:r>
+              <w:rPr>
+                <w:b w:val="false"/>
+                <w:bCs w:val="false"/>
+                <w:sz w:val="19"/>
+                <w:szCs w:val="19"/>
+              </w:rPr>
+              <w:t xml:space="preserve">Annealed adapters (MEA/MErev + MEB/MErev, 1:1)</w:t>
+            </w:r>
+          </w:p>
+        </w:tc>
+        <w:tc>
+          <w:tcPr>
+            <w:tcW w:type="dxa" w:w="1605"/>
+            <w:tcMar>
+              <w:top w:type="dxa" w:w="60"/>
+              <w:left w:type="dxa" w:w="100"/>
+              <w:bottom w:type="dxa" w:w="60"/>
+              <w:right w:type="dxa" w:w="100"/>
+            </w:tcMar>
+          </w:tcPr>
+          <w:p>
+            <w:pPr>
+              <w:spacing w:after="0"/>
+            </w:pPr>
+            <w:r>
+              <w:rPr>
+                <w:b w:val="false"/>
+                <w:bCs w:val="false"/>
+                <w:sz w:val="19"/>
+                <w:szCs w:val="19"/>
+              </w:rPr>
+              <w:t xml:space="preserve">100 µM total</w:t>
+            </w:r>
+          </w:p>
+        </w:tc>
+        <w:tc>
+          <w:tcPr>
+            <w:tcW w:type="dxa" w:w="1605"/>
+            <w:tcMar>
+              <w:top w:type="dxa" w:w="60"/>
+              <w:left w:type="dxa" w:w="100"/>
+              <w:bottom w:type="dxa" w:w="60"/>
+              <w:right w:type="dxa" w:w="100"/>
+            </w:tcMar>
+          </w:tcPr>
+          <w:p>
+            <w:pPr>
+              <w:spacing w:after="0"/>
+            </w:pPr>
+            <w:r>
+              <w:rPr>
+                <w:b w:val="false"/>
+                <w:bCs w:val="false"/>
+                <w:sz w:val="19"/>
+                <w:szCs w:val="19"/>
+              </w:rPr>
+              <w:t xml:space="preserve">18.75 µl</w:t>
+            </w:r>
+          </w:p>
+        </w:tc>
+        <w:tc>
+          <w:tcPr>
+            <w:tcW w:type="dxa" w:w="1804"/>
+            <w:tcMar>
+              <w:top w:type="dxa" w:w="60"/>
+              <w:left w:type="dxa" w:w="100"/>
+              <w:bottom w:type="dxa" w:w="60"/>
+              <w:right w:type="dxa" w:w="100"/>
+            </w:tcMar>
+          </w:tcPr>
+          <w:p>
+            <w:pPr>
+              <w:spacing w:after="0"/>
+            </w:pPr>
+            <w:r>
+              <w:rPr>
+                <w:b w:val="false"/>
+                <w:bCs w:val="false"/>
+                <w:sz w:val="19"/>
+                <w:szCs w:val="19"/>
+              </w:rPr>
+              <w:t xml:space="preserve">37.5 µM</w:t>
+            </w:r>
+          </w:p>
+        </w:tc>
+      </w:tr>
+      <w:tr>
+        <w:tc>
+          <w:tcPr>
+            <w:tcW w:type="dxa" w:w="4012"/>
+            <w:tcMar>
+              <w:top w:type="dxa" w:w="60"/>
+              <w:left w:type="dxa" w:w="100"/>
+              <w:bottom w:type="dxa" w:w="60"/>
+              <w:right w:type="dxa" w:w="100"/>
+            </w:tcMar>
+          </w:tcPr>
+          <w:p>
+            <w:pPr>
+              <w:spacing w:after="0"/>
+            </w:pPr>
+            <w:r>
+              <w:rPr>
+                <w:b w:val="false"/>
+                <w:bCs w:val="false"/>
+                <w:sz w:val="19"/>
+                <w:szCs w:val="19"/>
+              </w:rPr>
+              <w:t xml:space="preserve">Total</w:t>
+            </w:r>
+          </w:p>
+        </w:tc>
+        <w:tc>
+          <w:tcPr>
+            <w:tcW w:type="dxa" w:w="1605"/>
+            <w:tcMar>
+              <w:top w:type="dxa" w:w="60"/>
+              <w:left w:type="dxa" w:w="100"/>
+              <w:bottom w:type="dxa" w:w="60"/>
+              <w:right w:type="dxa" w:w="100"/>
+            </w:tcMar>
+          </w:tcPr>
+          <w:p>
+            <w:pPr>
+              <w:spacing w:after="0"/>
+            </w:pPr>
+            <w:r>
+              <w:rPr>
+                <w:b w:val="false"/>
+                <w:bCs w:val="false"/>
+                <w:sz w:val="19"/>
+                <w:szCs w:val="19"/>
+              </w:rPr>
+              <w:t xml:space="preserve"/>
+            </w:r>
+          </w:p>
+        </w:tc>
+        <w:tc>
+          <w:tcPr>
+            <w:tcW w:type="dxa" w:w="1605"/>
+            <w:tcMar>
+              <w:top w:type="dxa" w:w="60"/>
+              <w:left w:type="dxa" w:w="100"/>
+              <w:bottom w:type="dxa" w:w="60"/>
+              <w:right w:type="dxa" w:w="100"/>
+            </w:tcMar>
+          </w:tcPr>
+          <w:p>
+            <w:pPr>
+              <w:spacing w:after="0"/>
+            </w:pPr>
+            <w:r>
+              <w:rPr>
+                <w:b w:val="false"/>
+                <w:bCs w:val="false"/>
+                <w:sz w:val="19"/>
+                <w:szCs w:val="19"/>
+              </w:rPr>
+              <w:t xml:space="preserve">50 µl</w:t>
+            </w:r>
+          </w:p>
+        </w:tc>
+        <w:tc>
+          <w:tcPr>
+            <w:tcW w:type="dxa" w:w="1804"/>
+            <w:tcMar>
+              <w:top w:type="dxa" w:w="60"/>
+              <w:left w:type="dxa" w:w="100"/>
+              <w:bottom w:type="dxa" w:w="60"/>
+              <w:right w:type="dxa" w:w="100"/>
+            </w:tcMar>
+          </w:tcPr>
+          <w:p>
+            <w:pPr>
+              <w:spacing w:after="0"/>
+            </w:pPr>
+            <w:r>
+              <w:rPr>
+                <w:b w:val="false"/>
+                <w:bCs w:val="false"/>
+                <w:sz w:val="19"/>
+                <w:szCs w:val="19"/>
+              </w:rPr>
+              <w:t xml:space="preserve">37.5 µM</w:t>
+            </w:r>
+          </w:p>
+        </w:tc>
+      </w:tr>
+    </w:tbl>
+    <w:p>
+      <w:pPr>
+        <w:spacing w:after="100"/>
+      </w:pPr>
+      <w:r>
+        <w:rPr>
+          <w:i/>
+          <w:iCs/>
+          <w:sz w:val="18"/>
+          <w:szCs w:val="18"/>
+        </w:rPr>
+        <w:t xml:space="preserve">Premix used: 48.7 µl Tn5 + 258.3 µl storage buffer, aliquoted at 31.25 µl; add 18.75 µl annealed adapters per aliquot (≈ 38 µM final). PIC is not in the premix — add with the adapters if required. Final glycerol ≈ 32%; stock confirmed liquid at −20 °C.</w:t>
+      </w:r>
+    </w:p>
+    <w:p>
+      <w:pPr>
+        <w:pStyle w:val="Heading2"/>
+        <w:spacing w:after="100" w:before="200"/>
+      </w:pPr>
+      <w:r>
+        <w:t xml:space="preserve">A.3 QC checks</w:t>
+      </w:r>
+    </w:p>
+    <w:tbl>
+      <w:tblPr>
+        <w:tblW w:type="dxa" w:w="9026"/>
+        <w:tblBorders>
+          <w:top w:val="single" w:color="auto" w:sz="4"/>
+          <w:left w:val="single" w:color="auto" w:sz="4"/>
+          <w:bottom w:val="single" w:color="auto" w:sz="4"/>
+          <w:right w:val="single" w:color="auto" w:sz="4"/>
+          <w:insideH w:val="single" w:color="auto" w:sz="4"/>
+          <w:insideV w:val="single" w:color="auto" w:sz="4"/>
+        </w:tblBorders>
+      </w:tblPr>
+      <w:tblGrid>
+        <w:gridCol w:w="1986"/>
+        <w:gridCol w:w="2708"/>
+        <w:gridCol w:w="4332"/>
+      </w:tblGrid>
+      <w:tr>
+        <w:trPr>
+          <w:tblHeader/>
+        </w:trPr>
+        <w:tc>
+          <w:tcPr>
+            <w:tcW w:type="dxa" w:w="1986"/>
+            <w:shd w:fill="1F4E79" w:color="auto" w:val="clear"/>
+            <w:tcMar>
+              <w:top w:type="dxa" w:w="60"/>
+              <w:left w:type="dxa" w:w="100"/>
+              <w:bottom w:type="dxa" w:w="60"/>
+              <w:right w:type="dxa" w:w="100"/>
+            </w:tcMar>
+          </w:tcPr>
+          <w:p>
+            <w:pPr>
+              <w:spacing w:after="0"/>
+            </w:pPr>
+            <w:r>
+              <w:rPr>
+                <w:b/>
+                <w:bCs/>
+                <w:color w:val="FFFFFF"/>
+                <w:sz w:val="19"/>
+                <w:szCs w:val="19"/>
+              </w:rPr>
+              <w:t xml:space="preserve">Check</w:t>
+            </w:r>
+          </w:p>
+        </w:tc>
+        <w:tc>
+          <w:tcPr>
+            <w:tcW w:type="dxa" w:w="2708"/>
+            <w:shd w:fill="1F4E79" w:color="auto" w:val="clear"/>
+            <w:tcMar>
+              <w:top w:type="dxa" w:w="60"/>
+              <w:left w:type="dxa" w:w="100"/>
+              <w:bottom w:type="dxa" w:w="60"/>
+              <w:right w:type="dxa" w:w="100"/>
+            </w:tcMar>
+          </w:tcPr>
+          <w:p>
+            <w:pPr>
+              <w:spacing w:after="0"/>
+            </w:pPr>
+            <w:r>
+              <w:rPr>
+                <w:b/>
+                <w:bCs/>
+                <w:color w:val="FFFFFF"/>
+                <w:sz w:val="19"/>
+                <w:szCs w:val="19"/>
+              </w:rPr>
+              <w:t xml:space="preserve">Method</w:t>
+            </w:r>
+          </w:p>
+        </w:tc>
+        <w:tc>
+          <w:tcPr>
+            <w:tcW w:type="dxa" w:w="4332"/>
+            <w:shd w:fill="1F4E79" w:color="auto" w:val="clear"/>
+            <w:tcMar>
+              <w:top w:type="dxa" w:w="60"/>
+              <w:left w:type="dxa" w:w="100"/>
+              <w:bottom w:type="dxa" w:w="60"/>
+              <w:right w:type="dxa" w:w="100"/>
+            </w:tcMar>
+          </w:tcPr>
+          <w:p>
+            <w:pPr>
+              <w:spacing w:after="0"/>
+            </w:pPr>
+            <w:r>
+              <w:rPr>
+                <w:b/>
+                <w:bCs/>
+                <w:color w:val="FFFFFF"/>
+                <w:sz w:val="19"/>
+                <w:szCs w:val="19"/>
+              </w:rPr>
+              <w:t xml:space="preserve">Expected / action</w:t>
+            </w:r>
+          </w:p>
+        </w:tc>
+      </w:tr>
+      <w:tr>
+        <w:tc>
+          <w:tcPr>
+            <w:tcW w:type="dxa" w:w="1986"/>
+            <w:tcMar>
+              <w:top w:type="dxa" w:w="60"/>
+              <w:left w:type="dxa" w:w="100"/>
+              <w:bottom w:type="dxa" w:w="60"/>
+              <w:right w:type="dxa" w:w="100"/>
+            </w:tcMar>
+          </w:tcPr>
+          <w:p>
+            <w:pPr>
+              <w:spacing w:after="0"/>
+            </w:pPr>
+            <w:r>
+              <w:rPr>
+                <w:b w:val="false"/>
+                <w:bCs w:val="false"/>
+                <w:sz w:val="19"/>
+                <w:szCs w:val="19"/>
+              </w:rPr>
+              <w:t xml:space="preserve">Protein concentration</w:t>
+            </w:r>
+          </w:p>
+        </w:tc>
+        <w:tc>
+          <w:tcPr>
+            <w:tcW w:type="dxa" w:w="2708"/>
+            <w:tcMar>
+              <w:top w:type="dxa" w:w="60"/>
+              <w:left w:type="dxa" w:w="100"/>
+              <w:bottom w:type="dxa" w:w="60"/>
+              <w:right w:type="dxa" w:w="100"/>
+            </w:tcMar>
+          </w:tcPr>
+          <w:p>
+            <w:pPr>
+              <w:spacing w:after="0"/>
+            </w:pPr>
+            <w:r>
+              <w:rPr>
+                <w:b w:val="false"/>
+                <w:bCs w:val="false"/>
+                <w:sz w:val="19"/>
+                <w:szCs w:val="19"/>
+              </w:rPr>
+              <w:t xml:space="preserve">SDS-PAGE vs BSA standards (0.5, 1, 2 µg) or Bradford</w:t>
+            </w:r>
+          </w:p>
+        </w:tc>
+        <w:tc>
+          <w:tcPr>
+            <w:tcW w:type="dxa" w:w="4332"/>
+            <w:tcMar>
+              <w:top w:type="dxa" w:w="60"/>
+              <w:left w:type="dxa" w:w="100"/>
+              <w:bottom w:type="dxa" w:w="60"/>
+              <w:right w:type="dxa" w:w="100"/>
+            </w:tcMar>
+          </w:tcPr>
+          <w:p>
+            <w:pPr>
+              <w:spacing w:after="0"/>
+            </w:pPr>
+            <w:r>
+              <w:rPr>
+                <w:b w:val="false"/>
+                <w:bCs w:val="false"/>
+                <w:sz w:val="19"/>
+                <w:szCs w:val="19"/>
+              </w:rPr>
+              <w:t xml:space="preserve">A280 may be inflated if Triton X-100 was concentrated in the 30 kDa Amicon (micelles are retained). Recalculate the loaded-stock concentration if different</w:t>
+            </w:r>
+          </w:p>
+        </w:tc>
+      </w:tr>
+      <w:tr>
+        <w:tc>
+          <w:tcPr>
+            <w:tcW w:type="dxa" w:w="1986"/>
+            <w:tcMar>
+              <w:top w:type="dxa" w:w="60"/>
+              <w:left w:type="dxa" w:w="100"/>
+              <w:bottom w:type="dxa" w:w="60"/>
+              <w:right w:type="dxa" w:w="100"/>
+            </w:tcMar>
+          </w:tcPr>
+          <w:p>
+            <w:pPr>
+              <w:spacing w:after="0"/>
+            </w:pPr>
+            <w:r>
+              <w:rPr>
+                <w:b w:val="false"/>
+                <w:bCs w:val="false"/>
+                <w:sz w:val="19"/>
+                <w:szCs w:val="19"/>
+              </w:rPr>
+              <w:t xml:space="preserve">Purity / cleavage</w:t>
+            </w:r>
+          </w:p>
+        </w:tc>
+        <w:tc>
+          <w:tcPr>
+            <w:tcW w:type="dxa" w:w="2708"/>
+            <w:tcMar>
+              <w:top w:type="dxa" w:w="60"/>
+              <w:left w:type="dxa" w:w="100"/>
+              <w:bottom w:type="dxa" w:w="60"/>
+              <w:right w:type="dxa" w:w="100"/>
+            </w:tcMar>
+          </w:tcPr>
+          <w:p>
+            <w:pPr>
+              <w:spacing w:after="0"/>
+            </w:pPr>
+            <w:r>
+              <w:rPr>
+                <w:b w:val="false"/>
+                <w:bCs w:val="false"/>
+                <w:sz w:val="19"/>
+                <w:szCs w:val="19"/>
+              </w:rPr>
+              <w:t xml:space="preserve">SDS-PAGE, Coomassie</w:t>
+            </w:r>
+          </w:p>
+        </w:tc>
+        <w:tc>
+          <w:tcPr>
+            <w:tcW w:type="dxa" w:w="4332"/>
+            <w:tcMar>
+              <w:top w:type="dxa" w:w="60"/>
+              <w:left w:type="dxa" w:w="100"/>
+              <w:bottom w:type="dxa" w:w="60"/>
+              <w:right w:type="dxa" w:w="100"/>
+            </w:tcMar>
+          </w:tcPr>
+          <w:p>
+            <w:pPr>
+              <w:spacing w:after="0"/>
+            </w:pPr>
+            <w:r>
+              <w:rPr>
+                <w:b w:val="false"/>
+                <w:bCs w:val="false"/>
+                <w:sz w:val="19"/>
+                <w:szCs w:val="19"/>
+              </w:rPr>
+              <w:t xml:space="preserve">Major band ~53 kDa (Tn5); little ~81 kDa (uncleaved fusion) or ~28 kDa (intein–CBD)</w:t>
+            </w:r>
+          </w:p>
+        </w:tc>
+      </w:tr>
+      <w:tr>
+        <w:tc>
+          <w:tcPr>
+            <w:tcW w:type="dxa" w:w="1986"/>
+            <w:tcMar>
+              <w:top w:type="dxa" w:w="60"/>
+              <w:left w:type="dxa" w:w="100"/>
+              <w:bottom w:type="dxa" w:w="60"/>
+              <w:right w:type="dxa" w:w="100"/>
+            </w:tcMar>
+          </w:tcPr>
+          <w:p>
+            <w:pPr>
+              <w:spacing w:after="0"/>
+            </w:pPr>
+            <w:r>
+              <w:rPr>
+                <w:b w:val="false"/>
+                <w:bCs w:val="false"/>
+                <w:sz w:val="19"/>
+                <w:szCs w:val="19"/>
+              </w:rPr>
+              <w:t xml:space="preserve">Adapter annealing</w:t>
+            </w:r>
+          </w:p>
+        </w:tc>
+        <w:tc>
+          <w:tcPr>
+            <w:tcW w:type="dxa" w:w="2708"/>
+            <w:tcMar>
+              <w:top w:type="dxa" w:w="60"/>
+              <w:left w:type="dxa" w:w="100"/>
+              <w:bottom w:type="dxa" w:w="60"/>
+              <w:right w:type="dxa" w:w="100"/>
+            </w:tcMar>
+          </w:tcPr>
+          <w:p>
+            <w:pPr>
+              <w:spacing w:after="0"/>
+            </w:pPr>
+            <w:r>
+              <w:rPr>
+                <w:b w:val="false"/>
+                <w:bCs w:val="false"/>
+                <w:sz w:val="19"/>
+                <w:szCs w:val="19"/>
+              </w:rPr>
+              <w:t xml:space="preserve">Protocol check</w:t>
+            </w:r>
+          </w:p>
+        </w:tc>
+        <w:tc>
+          <w:tcPr>
+            <w:tcW w:type="dxa" w:w="4332"/>
+            <w:tcMar>
+              <w:top w:type="dxa" w:w="60"/>
+              <w:left w:type="dxa" w:w="100"/>
+              <w:bottom w:type="dxa" w:w="60"/>
+              <w:right w:type="dxa" w:w="100"/>
+            </w:tcMar>
+          </w:tcPr>
+          <w:p>
+            <w:pPr>
+              <w:spacing w:after="0"/>
+            </w:pPr>
+            <w:r>
+              <w:rPr>
+                <w:b w:val="false"/>
+                <w:bCs w:val="false"/>
+                <w:sz w:val="19"/>
+                <w:szCs w:val="19"/>
+              </w:rPr>
+              <w:t xml:space="preserve">Typically 95 °C 2–5 min then slow cool to RT; MEA and MEB duplexes mixed 1:1 before loading</w:t>
+            </w:r>
+          </w:p>
+        </w:tc>
+      </w:tr>
+      <w:tr>
+        <w:tc>
+          <w:tcPr>
+            <w:tcW w:type="dxa" w:w="1986"/>
+            <w:tcMar>
+              <w:top w:type="dxa" w:w="60"/>
+              <w:left w:type="dxa" w:w="100"/>
+              <w:bottom w:type="dxa" w:w="60"/>
+              <w:right w:type="dxa" w:w="100"/>
+            </w:tcMar>
+          </w:tcPr>
+          <w:p>
+            <w:pPr>
+              <w:spacing w:after="0"/>
+            </w:pPr>
+            <w:r>
+              <w:rPr>
+                <w:b w:val="false"/>
+                <w:bCs w:val="false"/>
+                <w:sz w:val="19"/>
+                <w:szCs w:val="19"/>
+              </w:rPr>
+              <w:t xml:space="preserve">Storage state</w:t>
+            </w:r>
+          </w:p>
+        </w:tc>
+        <w:tc>
+          <w:tcPr>
+            <w:tcW w:type="dxa" w:w="2708"/>
+            <w:tcMar>
+              <w:top w:type="dxa" w:w="60"/>
+              <w:left w:type="dxa" w:w="100"/>
+              <w:bottom w:type="dxa" w:w="60"/>
+              <w:right w:type="dxa" w:w="100"/>
+            </w:tcMar>
+          </w:tcPr>
+          <w:p>
+            <w:pPr>
+              <w:spacing w:after="0"/>
+            </w:pPr>
+            <w:r>
+              <w:rPr>
+                <w:b w:val="false"/>
+                <w:bCs w:val="false"/>
+                <w:sz w:val="19"/>
+                <w:szCs w:val="19"/>
+              </w:rPr>
+              <w:t xml:space="preserve">Inspect at −20 °C</w:t>
+            </w:r>
+          </w:p>
+        </w:tc>
+        <w:tc>
+          <w:tcPr>
+            <w:tcW w:type="dxa" w:w="4332"/>
+            <w:tcMar>
+              <w:top w:type="dxa" w:w="60"/>
+              <w:left w:type="dxa" w:w="100"/>
+              <w:bottom w:type="dxa" w:w="60"/>
+              <w:right w:type="dxa" w:w="100"/>
+            </w:tcMar>
+          </w:tcPr>
+          <w:p>
+            <w:pPr>
+              <w:spacing w:after="0"/>
+            </w:pPr>
+            <w:r>
+              <w:rPr>
+                <w:b w:val="false"/>
+                <w:bCs w:val="false"/>
+                <w:sz w:val="19"/>
+                <w:szCs w:val="19"/>
+              </w:rPr>
+              <w:t xml:space="preserve">Liquid (confirmed): no freeze–thaw</w:t>
+            </w:r>
+          </w:p>
+        </w:tc>
+      </w:tr>
+      <w:tr>
+        <w:tc>
+          <w:tcPr>
+            <w:tcW w:type="dxa" w:w="1986"/>
+            <w:tcMar>
+              <w:top w:type="dxa" w:w="60"/>
+              <w:left w:type="dxa" w:w="100"/>
+              <w:bottom w:type="dxa" w:w="60"/>
+              <w:right w:type="dxa" w:w="100"/>
+            </w:tcMar>
+          </w:tcPr>
+          <w:p>
+            <w:pPr>
+              <w:spacing w:after="0"/>
+            </w:pPr>
+            <w:r>
+              <w:rPr>
+                <w:b w:val="false"/>
+                <w:bCs w:val="false"/>
+                <w:sz w:val="19"/>
+                <w:szCs w:val="19"/>
+              </w:rPr>
+              <w:t xml:space="preserve">Activity</w:t>
+            </w:r>
+          </w:p>
+        </w:tc>
+        <w:tc>
+          <w:tcPr>
+            <w:tcW w:type="dxa" w:w="2708"/>
+            <w:tcMar>
+              <w:top w:type="dxa" w:w="60"/>
+              <w:left w:type="dxa" w:w="100"/>
+              <w:bottom w:type="dxa" w:w="60"/>
+              <w:right w:type="dxa" w:w="100"/>
+            </w:tcMar>
+          </w:tcPr>
+          <w:p>
+            <w:pPr>
+              <w:spacing w:after="0"/>
+            </w:pPr>
+            <w:r>
+              <w:rPr>
+                <w:b w:val="false"/>
+                <w:bCs w:val="false"/>
+                <w:sz w:val="19"/>
+                <w:szCs w:val="19"/>
+              </w:rPr>
+              <w:t xml:space="preserve">Lambda titration (Appendix B)</w:t>
+            </w:r>
+          </w:p>
+        </w:tc>
+        <w:tc>
+          <w:tcPr>
+            <w:tcW w:type="dxa" w:w="4332"/>
+            <w:tcMar>
+              <w:top w:type="dxa" w:w="60"/>
+              <w:left w:type="dxa" w:w="100"/>
+              <w:bottom w:type="dxa" w:w="60"/>
+              <w:right w:type="dxa" w:w="100"/>
+            </w:tcMar>
+          </w:tcPr>
+          <w:p>
+            <w:pPr>
+              <w:spacing w:after="0"/>
+            </w:pPr>
+            <w:r>
+              <w:rPr>
+                <w:b w:val="false"/>
+                <w:bCs w:val="false"/>
+                <w:sz w:val="19"/>
+                <w:szCs w:val="19"/>
+              </w:rPr>
+              <w:t xml:space="preserve">Defines the effective dose for this batch; repeat for every new batch</w:t>
+            </w:r>
+          </w:p>
+        </w:tc>
+      </w:tr>
+    </w:tbl>
+    <w:p>
+      <w:pPr>
+        <w:pStyle w:val="Heading2"/>
+        <w:spacing w:after="100" w:before="200"/>
+      </w:pPr>
+      <w:r>
+        <w:t xml:space="preserve">A.4 Handling</w:t>
+      </w:r>
+    </w:p>
+    <w:p>
+      <w:pPr>
+        <w:pStyle w:val="ListParagraph"/>
+        <w:numPr>
+          <w:ilvl w:val="0"/>
+          <w:numId w:val="2"/>
+        </w:numPr>
+        <w:spacing w:after="60"/>
+      </w:pPr>
+      <w:r>
+        <w:t xml:space="preserve">Keep at −20 °C; take out briefly onto ice or a cold block. Mix gently before use; do not vortex hard.</w:t>
+      </w:r>
+    </w:p>
+    <w:p>
+      <w:pPr>
+        <w:pStyle w:val="ListParagraph"/>
+        <w:numPr>
+          <w:ilvl w:val="0"/>
+          <w:numId w:val="2"/>
+        </w:numPr>
+        <w:spacing w:after="60"/>
+      </w:pPr>
+      <w:r>
+        <w:t xml:space="preserve">Never pipette stock directly into wells: 100 nM in 10 µl needs only 0.027 µl of 37.5 µM stock. Always use working dilutions (A.5).</w:t>
+      </w:r>
+    </w:p>
+    <w:p>
+      <w:pPr>
+        <w:pStyle w:val="ListParagraph"/>
+        <w:numPr>
+          <w:ilvl w:val="0"/>
+          <w:numId w:val="2"/>
+        </w:numPr>
+        <w:spacing w:after="60"/>
+      </w:pPr>
+      <w:r>
+        <w:t xml:space="preserve">Record batch ID and loading date for every experiment.</w:t>
+      </w:r>
+    </w:p>
+    <w:p>
+      <w:pPr>
+        <w:pStyle w:val="Heading2"/>
+        <w:spacing w:after="100" w:before="200"/>
+      </w:pPr>
+      <w:r>
+        <w:t xml:space="preserve">A.5 Working dilutions from 37.5 µM stock (in storage/dilution buffer, on ice)</w:t>
+      </w:r>
+    </w:p>
+    <w:tbl>
+      <w:tblPr>
+        <w:tblW w:type="dxa" w:w="9026"/>
+        <w:tblBorders>
+          <w:top w:val="single" w:color="auto" w:sz="4"/>
+          <w:left w:val="single" w:color="auto" w:sz="4"/>
+          <w:bottom w:val="single" w:color="auto" w:sz="4"/>
+          <w:right w:val="single" w:color="auto" w:sz="4"/>
+          <w:insideH w:val="single" w:color="auto" w:sz="4"/>
+          <w:insideV w:val="single" w:color="auto" w:sz="4"/>
+        </w:tblBorders>
+      </w:tblPr>
+      <w:tblGrid>
+        <w:gridCol w:w="2206"/>
+        <w:gridCol w:w="4012"/>
+        <w:gridCol w:w="2808"/>
+      </w:tblGrid>
+      <w:tr>
+        <w:trPr>
+          <w:tblHeader/>
+        </w:trPr>
+        <w:tc>
+          <w:tcPr>
+            <w:tcW w:type="dxa" w:w="2206"/>
+            <w:shd w:fill="1F4E79" w:color="auto" w:val="clear"/>
+            <w:tcMar>
+              <w:top w:type="dxa" w:w="60"/>
+              <w:left w:type="dxa" w:w="100"/>
+              <w:bottom w:type="dxa" w:w="60"/>
+              <w:right w:type="dxa" w:w="100"/>
+            </w:tcMar>
+          </w:tcPr>
+          <w:p>
+            <w:pPr>
+              <w:spacing w:after="0"/>
+            </w:pPr>
+            <w:r>
+              <w:rPr>
+                <w:b/>
+                <w:bCs/>
+                <w:color w:val="FFFFFF"/>
+                <w:sz w:val="19"/>
+                <w:szCs w:val="19"/>
+              </w:rPr>
+              <w:t xml:space="preserve">Dilution</w:t>
+            </w:r>
+          </w:p>
+        </w:tc>
+        <w:tc>
+          <w:tcPr>
+            <w:tcW w:type="dxa" w:w="4012"/>
+            <w:shd w:fill="1F4E79" w:color="auto" w:val="clear"/>
+            <w:tcMar>
+              <w:top w:type="dxa" w:w="60"/>
+              <w:left w:type="dxa" w:w="100"/>
+              <w:bottom w:type="dxa" w:w="60"/>
+              <w:right w:type="dxa" w:w="100"/>
+            </w:tcMar>
+          </w:tcPr>
+          <w:p>
+            <w:pPr>
+              <w:spacing w:after="0"/>
+            </w:pPr>
+            <w:r>
+              <w:rPr>
+                <w:b/>
+                <w:bCs/>
+                <w:color w:val="FFFFFF"/>
+                <w:sz w:val="19"/>
+                <w:szCs w:val="19"/>
+              </w:rPr>
+              <w:t xml:space="preserve">Recipe</w:t>
+            </w:r>
+          </w:p>
+        </w:tc>
+        <w:tc>
+          <w:tcPr>
+            <w:tcW w:type="dxa" w:w="2808"/>
+            <w:shd w:fill="1F4E79" w:color="auto" w:val="clear"/>
+            <w:tcMar>
+              <w:top w:type="dxa" w:w="60"/>
+              <w:left w:type="dxa" w:w="100"/>
+              <w:bottom w:type="dxa" w:w="60"/>
+              <w:right w:type="dxa" w:w="100"/>
+            </w:tcMar>
+          </w:tcPr>
+          <w:p>
+            <w:pPr>
+              <w:spacing w:after="0"/>
+            </w:pPr>
+            <w:r>
+              <w:rPr>
+                <w:b/>
+                <w:bCs/>
+                <w:color w:val="FFFFFF"/>
+                <w:sz w:val="19"/>
+                <w:szCs w:val="19"/>
+              </w:rPr>
+              <w:t xml:space="preserve">Concentration</w:t>
+            </w:r>
+          </w:p>
+        </w:tc>
+      </w:tr>
+      <w:tr>
+        <w:tc>
+          <w:tcPr>
+            <w:tcW w:type="dxa" w:w="2206"/>
+            <w:tcMar>
+              <w:top w:type="dxa" w:w="60"/>
+              <w:left w:type="dxa" w:w="100"/>
+              <w:bottom w:type="dxa" w:w="60"/>
+              <w:right w:type="dxa" w:w="100"/>
+            </w:tcMar>
+          </w:tcPr>
+          <w:p>
+            <w:pPr>
+              <w:spacing w:after="0"/>
+            </w:pPr>
+            <w:r>
+              <w:rPr>
+                <w:b w:val="false"/>
+                <w:bCs w:val="false"/>
+                <w:sz w:val="19"/>
+                <w:szCs w:val="19"/>
+              </w:rPr>
+              <w:t xml:space="preserve">Intermediate</w:t>
+            </w:r>
+          </w:p>
+        </w:tc>
+        <w:tc>
+          <w:tcPr>
+            <w:tcW w:type="dxa" w:w="4012"/>
+            <w:tcMar>
+              <w:top w:type="dxa" w:w="60"/>
+              <w:left w:type="dxa" w:w="100"/>
+              <w:bottom w:type="dxa" w:w="60"/>
+              <w:right w:type="dxa" w:w="100"/>
+            </w:tcMar>
+          </w:tcPr>
+          <w:p>
+            <w:pPr>
+              <w:spacing w:after="0"/>
+            </w:pPr>
+            <w:r>
+              <w:rPr>
+                <w:b w:val="false"/>
+                <w:bCs w:val="false"/>
+                <w:sz w:val="19"/>
+                <w:szCs w:val="19"/>
+              </w:rPr>
+              <w:t xml:space="preserve">4 µl stock + 26 µl buffer</w:t>
+            </w:r>
+          </w:p>
+        </w:tc>
+        <w:tc>
+          <w:tcPr>
+            <w:tcW w:type="dxa" w:w="2808"/>
+            <w:tcMar>
+              <w:top w:type="dxa" w:w="60"/>
+              <w:left w:type="dxa" w:w="100"/>
+              <w:bottom w:type="dxa" w:w="60"/>
+              <w:right w:type="dxa" w:w="100"/>
+            </w:tcMar>
+          </w:tcPr>
+          <w:p>
+            <w:pPr>
+              <w:spacing w:after="0"/>
+            </w:pPr>
+            <w:r>
+              <w:rPr>
+                <w:b w:val="false"/>
+                <w:bCs w:val="false"/>
+                <w:sz w:val="19"/>
+                <w:szCs w:val="19"/>
+              </w:rPr>
+              <w:t xml:space="preserve">5 µM (can be kept at −20 °C)</w:t>
+            </w:r>
+          </w:p>
+        </w:tc>
+      </w:tr>
+      <w:tr>
+        <w:tc>
+          <w:tcPr>
+            <w:tcW w:type="dxa" w:w="2206"/>
+            <w:tcMar>
+              <w:top w:type="dxa" w:w="60"/>
+              <w:left w:type="dxa" w:w="100"/>
+              <w:bottom w:type="dxa" w:w="60"/>
+              <w:right w:type="dxa" w:w="100"/>
+            </w:tcMar>
+          </w:tcPr>
+          <w:p>
+            <w:pPr>
+              <w:spacing w:after="0"/>
+            </w:pPr>
+            <w:r>
+              <w:rPr>
+                <w:b w:val="false"/>
+                <w:bCs w:val="false"/>
+                <w:sz w:val="19"/>
+                <w:szCs w:val="19"/>
+              </w:rPr>
+              <w:t xml:space="preserve">Working 1</w:t>
+            </w:r>
+          </w:p>
+        </w:tc>
+        <w:tc>
+          <w:tcPr>
+            <w:tcW w:type="dxa" w:w="4012"/>
+            <w:tcMar>
+              <w:top w:type="dxa" w:w="60"/>
+              <w:left w:type="dxa" w:w="100"/>
+              <w:bottom w:type="dxa" w:w="60"/>
+              <w:right w:type="dxa" w:w="100"/>
+            </w:tcMar>
+          </w:tcPr>
+          <w:p>
+            <w:pPr>
+              <w:spacing w:after="0"/>
+            </w:pPr>
+            <w:r>
+              <w:rPr>
+                <w:b w:val="false"/>
+                <w:bCs w:val="false"/>
+                <w:sz w:val="19"/>
+                <w:szCs w:val="19"/>
+              </w:rPr>
+              <w:t xml:space="preserve">10 µl of 5 µM + 90 µl buffer</w:t>
+            </w:r>
+          </w:p>
+        </w:tc>
+        <w:tc>
+          <w:tcPr>
+            <w:tcW w:type="dxa" w:w="2808"/>
+            <w:tcMar>
+              <w:top w:type="dxa" w:w="60"/>
+              <w:left w:type="dxa" w:w="100"/>
+              <w:bottom w:type="dxa" w:w="60"/>
+              <w:right w:type="dxa" w:w="100"/>
+            </w:tcMar>
+          </w:tcPr>
+          <w:p>
+            <w:pPr>
+              <w:spacing w:after="0"/>
+            </w:pPr>
+            <w:r>
+              <w:rPr>
+                <w:b w:val="false"/>
+                <w:bCs w:val="false"/>
+                <w:sz w:val="19"/>
+                <w:szCs w:val="19"/>
+              </w:rPr>
+              <w:t xml:space="preserve">500 nM</w:t>
+            </w:r>
+          </w:p>
+        </w:tc>
+      </w:tr>
+      <w:tr>
+        <w:tc>
+          <w:tcPr>
+            <w:tcW w:type="dxa" w:w="2206"/>
+            <w:tcMar>
+              <w:top w:type="dxa" w:w="60"/>
+              <w:left w:type="dxa" w:w="100"/>
+              <w:bottom w:type="dxa" w:w="60"/>
+              <w:right w:type="dxa" w:w="100"/>
+            </w:tcMar>
+          </w:tcPr>
+          <w:p>
+            <w:pPr>
+              <w:spacing w:after="0"/>
+            </w:pPr>
+            <w:r>
+              <w:rPr>
+                <w:b w:val="false"/>
+                <w:bCs w:val="false"/>
+                <w:sz w:val="19"/>
+                <w:szCs w:val="19"/>
+              </w:rPr>
+              <w:t xml:space="preserve">Working 2</w:t>
+            </w:r>
+          </w:p>
+        </w:tc>
+        <w:tc>
+          <w:tcPr>
+            <w:tcW w:type="dxa" w:w="4012"/>
+            <w:tcMar>
+              <w:top w:type="dxa" w:w="60"/>
+              <w:left w:type="dxa" w:w="100"/>
+              <w:bottom w:type="dxa" w:w="60"/>
+              <w:right w:type="dxa" w:w="100"/>
+            </w:tcMar>
+          </w:tcPr>
+          <w:p>
+            <w:pPr>
+              <w:spacing w:after="0"/>
+            </w:pPr>
+            <w:r>
+              <w:rPr>
+                <w:b w:val="false"/>
+                <w:bCs w:val="false"/>
+                <w:sz w:val="19"/>
+                <w:szCs w:val="19"/>
+              </w:rPr>
+              <w:t xml:space="preserve">40 µl of 500 nM + 40 µl buffer</w:t>
+            </w:r>
+          </w:p>
+        </w:tc>
+        <w:tc>
+          <w:tcPr>
+            <w:tcW w:type="dxa" w:w="2808"/>
+            <w:tcMar>
+              <w:top w:type="dxa" w:w="60"/>
+              <w:left w:type="dxa" w:w="100"/>
+              <w:bottom w:type="dxa" w:w="60"/>
+              <w:right w:type="dxa" w:w="100"/>
+            </w:tcMar>
+          </w:tcPr>
+          <w:p>
+            <w:pPr>
+              <w:spacing w:after="0"/>
+            </w:pPr>
+            <w:r>
+              <w:rPr>
+                <w:b w:val="false"/>
+                <w:bCs w:val="false"/>
+                <w:sz w:val="19"/>
+                <w:szCs w:val="19"/>
+              </w:rPr>
+              <w:t xml:space="preserve">250 nM</w:t>
+            </w:r>
+          </w:p>
+        </w:tc>
+      </w:tr>
+      <w:tr>
+        <w:tc>
+          <w:tcPr>
+            <w:tcW w:type="dxa" w:w="2206"/>
+            <w:tcMar>
+              <w:top w:type="dxa" w:w="60"/>
+              <w:left w:type="dxa" w:w="100"/>
+              <w:bottom w:type="dxa" w:w="60"/>
+              <w:right w:type="dxa" w:w="100"/>
+            </w:tcMar>
+          </w:tcPr>
+          <w:p>
+            <w:pPr>
+              <w:spacing w:after="0"/>
+            </w:pPr>
+            <w:r>
+              <w:rPr>
+                <w:b w:val="false"/>
+                <w:bCs w:val="false"/>
+                <w:sz w:val="19"/>
+                <w:szCs w:val="19"/>
+              </w:rPr>
+              <w:t xml:space="preserve">Working 3</w:t>
+            </w:r>
+          </w:p>
+        </w:tc>
+        <w:tc>
+          <w:tcPr>
+            <w:tcW w:type="dxa" w:w="4012"/>
+            <w:tcMar>
+              <w:top w:type="dxa" w:w="60"/>
+              <w:left w:type="dxa" w:w="100"/>
+              <w:bottom w:type="dxa" w:w="60"/>
+              <w:right w:type="dxa" w:w="100"/>
+            </w:tcMar>
+          </w:tcPr>
+          <w:p>
+            <w:pPr>
+              <w:spacing w:after="0"/>
+            </w:pPr>
+            <w:r>
+              <w:rPr>
+                <w:b w:val="false"/>
+                <w:bCs w:val="false"/>
+                <w:sz w:val="19"/>
+                <w:szCs w:val="19"/>
+              </w:rPr>
+              <w:t xml:space="preserve">40 µl of 250 nM + 40 µl buffer</w:t>
+            </w:r>
+          </w:p>
+        </w:tc>
+        <w:tc>
+          <w:tcPr>
+            <w:tcW w:type="dxa" w:w="2808"/>
+            <w:tcMar>
+              <w:top w:type="dxa" w:w="60"/>
+              <w:left w:type="dxa" w:w="100"/>
+              <w:bottom w:type="dxa" w:w="60"/>
+              <w:right w:type="dxa" w:w="100"/>
+            </w:tcMar>
+          </w:tcPr>
+          <w:p>
+            <w:pPr>
+              <w:spacing w:after="0"/>
+            </w:pPr>
+            <w:r>
+              <w:rPr>
+                <w:b w:val="false"/>
+                <w:bCs w:val="false"/>
+                <w:sz w:val="19"/>
+                <w:szCs w:val="19"/>
+              </w:rPr>
+              <w:t xml:space="preserve">125 nM</w:t>
+            </w:r>
+          </w:p>
+        </w:tc>
+      </w:tr>
+      <w:tr>
+        <w:tc>
+          <w:tcPr>
+            <w:tcW w:type="dxa" w:w="2206"/>
+            <w:tcMar>
+              <w:top w:type="dxa" w:w="60"/>
+              <w:left w:type="dxa" w:w="100"/>
+              <w:bottom w:type="dxa" w:w="60"/>
+              <w:right w:type="dxa" w:w="100"/>
+            </w:tcMar>
+          </w:tcPr>
+          <w:p>
+            <w:pPr>
+              <w:spacing w:after="0"/>
+            </w:pPr>
+            <w:r>
+              <w:rPr>
+                <w:b w:val="false"/>
+                <w:bCs w:val="false"/>
+                <w:sz w:val="19"/>
+                <w:szCs w:val="19"/>
+              </w:rPr>
+              <w:t xml:space="preserve">Working 4</w:t>
+            </w:r>
+          </w:p>
+        </w:tc>
+        <w:tc>
+          <w:tcPr>
+            <w:tcW w:type="dxa" w:w="4012"/>
+            <w:tcMar>
+              <w:top w:type="dxa" w:w="60"/>
+              <w:left w:type="dxa" w:w="100"/>
+              <w:bottom w:type="dxa" w:w="60"/>
+              <w:right w:type="dxa" w:w="100"/>
+            </w:tcMar>
+          </w:tcPr>
+          <w:p>
+            <w:pPr>
+              <w:spacing w:after="0"/>
+            </w:pPr>
+            <w:r>
+              <w:rPr>
+                <w:b w:val="false"/>
+                <w:bCs w:val="false"/>
+                <w:sz w:val="19"/>
+                <w:szCs w:val="19"/>
+              </w:rPr>
+              <w:t xml:space="preserve">40 µl of 125 nM + 40 µl buffer</w:t>
+            </w:r>
+          </w:p>
+        </w:tc>
+        <w:tc>
+          <w:tcPr>
+            <w:tcW w:type="dxa" w:w="2808"/>
+            <w:tcMar>
+              <w:top w:type="dxa" w:w="60"/>
+              <w:left w:type="dxa" w:w="100"/>
+              <w:bottom w:type="dxa" w:w="60"/>
+              <w:right w:type="dxa" w:w="100"/>
+            </w:tcMar>
+          </w:tcPr>
+          <w:p>
+            <w:pPr>
+              <w:spacing w:after="0"/>
+            </w:pPr>
+            <w:r>
+              <w:rPr>
+                <w:b w:val="false"/>
+                <w:bCs w:val="false"/>
+                <w:sz w:val="19"/>
+                <w:szCs w:val="19"/>
+              </w:rPr>
+              <w:t xml:space="preserve">62.5 nM</w:t>
+            </w:r>
+          </w:p>
+        </w:tc>
+      </w:tr>
+    </w:tbl>
+    <w:p>
+      <w:pPr>
+        <w:spacing w:after="100"/>
+      </w:pPr>
+      <w:r>
+        <w:t xml:space="preserve">2 µl of working stock in a 10 µl reaction gives 100 / 50 / 25 / 12.5 nM final. For cf-EpiTracing, build the chosen working stock into the tagmentation master mix (e.g. 2 µl of 500 nM per well for 100 nM).</w:t>
+      </w:r>
+    </w:p>
+    <w:p>
+      <w:pPr>
+        <w:pStyle w:val="Heading1"/>
+        <w:spacing w:after="120" w:before="300"/>
+      </w:pPr>
+      <w:r>
+        <w:t xml:space="preserve">Appendix B. Tn5 activity titration protocol</w:t>
+      </w:r>
+    </w:p>
+    <w:p>
+      <w:pPr>
+        <w:spacing w:after="100"/>
+      </w:pPr>
+      <w:r>
+        <w:t xml:space="preserve">Lambda DNA (e.g. NEB N3011 or Thermo SD0011) is recommended as the standard: identical in every lot, cheap, and ideal for comparing Tn5 batches over time. Human genomic DNA also works. Neither models cf-chromatin; this test calibrates relative activity, and the cf-EpiTracing pilot sets the final dose.</w:t>
+      </w:r>
+    </w:p>
+    <w:p>
+      <w:pPr>
+        <w:pStyle w:val="Heading2"/>
+        <w:spacing w:after="100" w:before="200"/>
+      </w:pPr>
+      <w:r>
+        <w:t xml:space="preserve">B.1 Materials</w:t>
+      </w:r>
+    </w:p>
+    <w:p>
+      <w:pPr>
+        <w:pStyle w:val="ListParagraph"/>
+        <w:numPr>
+          <w:ilvl w:val="0"/>
+          <w:numId w:val="2"/>
+        </w:numPr>
+        <w:spacing w:after="60"/>
+      </w:pPr>
+      <w:r>
+        <w:t xml:space="preserve">Tn5 working dilutions (Appendix A.5); dilution buffer for the no-enzyme control</w:t>
+      </w:r>
+    </w:p>
+    <w:p>
+      <w:pPr>
+        <w:pStyle w:val="ListParagraph"/>
+        <w:numPr>
+          <w:ilvl w:val="0"/>
+          <w:numId w:val="2"/>
+        </w:numPr>
+        <w:spacing w:after="60"/>
+      </w:pPr>
+      <w:r>
+        <w:t xml:space="preserve">Lambda DNA diluted to 10 ng/µl in 10 mM Tris-HCl pH 8.0</w:t>
+      </w:r>
+    </w:p>
+    <w:p>
+      <w:pPr>
+        <w:pStyle w:val="ListParagraph"/>
+        <w:numPr>
+          <w:ilvl w:val="0"/>
+          <w:numId w:val="2"/>
+        </w:numPr>
+        <w:spacing w:after="60"/>
+      </w:pPr>
+      <w:r>
+        <w:t xml:space="preserve">2× tagmentation buffer: 20 mM MgCl₂, 20 mM TAPS-NaOH pH 8.5</w:t>
+      </w:r>
+    </w:p>
+    <w:p>
+      <w:pPr>
+        <w:pStyle w:val="ListParagraph"/>
+        <w:numPr>
+          <w:ilvl w:val="0"/>
+          <w:numId w:val="2"/>
+        </w:numPr>
+        <w:spacing w:after="60"/>
+      </w:pPr>
+      <w:r>
+        <w:t xml:space="preserve">cf-EpiTracing lysis buffer (60 mM Tris pH 8.0, 60 mM EDTA, 0.25% SDS, 0.6 mg/ml proteinase K)</w:t>
+      </w:r>
+    </w:p>
+    <w:p>
+      <w:pPr>
+        <w:pStyle w:val="ListParagraph"/>
+        <w:numPr>
+          <w:ilvl w:val="0"/>
+          <w:numId w:val="2"/>
+        </w:numPr>
+        <w:spacing w:after="60"/>
+      </w:pPr>
+      <w:r>
+        <w:t xml:space="preserve">SPRI/AMPure beads, fresh 80% ethanol, 10 mM Tris-HCl pH 8.0; TapeStation D5000 (or High Sensitivity D5000)</w:t>
+      </w:r>
+    </w:p>
+    <w:p>
+      <w:pPr>
+        <w:pStyle w:val="Heading2"/>
+        <w:spacing w:after="100" w:before="200"/>
+      </w:pPr>
+      <w:r>
+        <w:t xml:space="preserve">B.2 Reaction set-up (12 µl, on ice; duplicates recommended)</w:t>
+      </w:r>
+    </w:p>
+    <w:tbl>
+      <w:tblPr>
+        <w:tblW w:type="dxa" w:w="9026"/>
+        <w:tblBorders>
+          <w:top w:val="single" w:color="auto" w:sz="4"/>
+          <w:left w:val="single" w:color="auto" w:sz="4"/>
+          <w:bottom w:val="single" w:color="auto" w:sz="4"/>
+          <w:right w:val="single" w:color="auto" w:sz="4"/>
+          <w:insideH w:val="single" w:color="auto" w:sz="4"/>
+          <w:insideV w:val="single" w:color="auto" w:sz="4"/>
+        </w:tblBorders>
+      </w:tblPr>
+      <w:tblGrid>
+        <w:gridCol w:w="6519"/>
+        <w:gridCol w:w="2507"/>
+      </w:tblGrid>
+      <w:tr>
+        <w:trPr>
+          <w:tblHeader/>
+        </w:trPr>
+        <w:tc>
+          <w:tcPr>
+            <w:tcW w:type="dxa" w:w="6519"/>
+            <w:shd w:fill="1F4E79" w:color="auto" w:val="clear"/>
+            <w:tcMar>
+              <w:top w:type="dxa" w:w="60"/>
+              <w:left w:type="dxa" w:w="100"/>
+              <w:bottom w:type="dxa" w:w="60"/>
+              <w:right w:type="dxa" w:w="100"/>
+            </w:tcMar>
+          </w:tcPr>
+          <w:p>
+            <w:pPr>
+              <w:spacing w:after="0"/>
+            </w:pPr>
+            <w:r>
+              <w:rPr>
+                <w:b/>
+                <w:bCs/>
+                <w:color w:val="FFFFFF"/>
+                <w:sz w:val="19"/>
+                <w:szCs w:val="19"/>
+              </w:rPr>
+              <w:t xml:space="preserve">Component</w:t>
+            </w:r>
+          </w:p>
+        </w:tc>
+        <w:tc>
+          <w:tcPr>
+            <w:tcW w:type="dxa" w:w="2507"/>
+            <w:shd w:fill="1F4E79" w:color="auto" w:val="clear"/>
+            <w:tcMar>
+              <w:top w:type="dxa" w:w="60"/>
+              <w:left w:type="dxa" w:w="100"/>
+              <w:bottom w:type="dxa" w:w="60"/>
+              <w:right w:type="dxa" w:w="100"/>
+            </w:tcMar>
+          </w:tcPr>
+          <w:p>
+            <w:pPr>
+              <w:spacing w:after="0"/>
+            </w:pPr>
+            <w:r>
+              <w:rPr>
+                <w:b/>
+                <w:bCs/>
+                <w:color w:val="FFFFFF"/>
+                <w:sz w:val="19"/>
+                <w:szCs w:val="19"/>
+              </w:rPr>
+              <w:t xml:space="preserve">Volume</w:t>
+            </w:r>
+          </w:p>
+        </w:tc>
+      </w:tr>
+      <w:tr>
+        <w:tc>
+          <w:tcPr>
+            <w:tcW w:type="dxa" w:w="6519"/>
+            <w:tcMar>
+              <w:top w:type="dxa" w:w="60"/>
+              <w:left w:type="dxa" w:w="100"/>
+              <w:bottom w:type="dxa" w:w="60"/>
+              <w:right w:type="dxa" w:w="100"/>
+            </w:tcMar>
+          </w:tcPr>
+          <w:p>
+            <w:pPr>
+              <w:spacing w:after="0"/>
+            </w:pPr>
+            <w:r>
+              <w:rPr>
+                <w:b w:val="false"/>
+                <w:bCs w:val="false"/>
+                <w:sz w:val="19"/>
+                <w:szCs w:val="19"/>
+              </w:rPr>
+              <w:t xml:space="preserve">2× tagmentation buffer</w:t>
+            </w:r>
+          </w:p>
+        </w:tc>
+        <w:tc>
+          <w:tcPr>
+            <w:tcW w:type="dxa" w:w="2507"/>
+            <w:tcMar>
+              <w:top w:type="dxa" w:w="60"/>
+              <w:left w:type="dxa" w:w="100"/>
+              <w:bottom w:type="dxa" w:w="60"/>
+              <w:right w:type="dxa" w:w="100"/>
+            </w:tcMar>
+          </w:tcPr>
+          <w:p>
+            <w:pPr>
+              <w:spacing w:after="0"/>
+            </w:pPr>
+            <w:r>
+              <w:rPr>
+                <w:b w:val="false"/>
+                <w:bCs w:val="false"/>
+                <w:sz w:val="19"/>
+                <w:szCs w:val="19"/>
+              </w:rPr>
+              <w:t xml:space="preserve">6 µl</w:t>
+            </w:r>
+          </w:p>
+        </w:tc>
+      </w:tr>
+      <w:tr>
+        <w:tc>
+          <w:tcPr>
+            <w:tcW w:type="dxa" w:w="6519"/>
+            <w:tcMar>
+              <w:top w:type="dxa" w:w="60"/>
+              <w:left w:type="dxa" w:w="100"/>
+              <w:bottom w:type="dxa" w:w="60"/>
+              <w:right w:type="dxa" w:w="100"/>
+            </w:tcMar>
+          </w:tcPr>
+          <w:p>
+            <w:pPr>
+              <w:spacing w:after="0"/>
+            </w:pPr>
+            <w:r>
+              <w:rPr>
+                <w:b w:val="false"/>
+                <w:bCs w:val="false"/>
+                <w:sz w:val="19"/>
+                <w:szCs w:val="19"/>
+              </w:rPr>
+              <w:t xml:space="preserve">Lambda DNA (10 ng/µl)</w:t>
+            </w:r>
+          </w:p>
+        </w:tc>
+        <w:tc>
+          <w:tcPr>
+            <w:tcW w:type="dxa" w:w="2507"/>
+            <w:tcMar>
+              <w:top w:type="dxa" w:w="60"/>
+              <w:left w:type="dxa" w:w="100"/>
+              <w:bottom w:type="dxa" w:w="60"/>
+              <w:right w:type="dxa" w:w="100"/>
+            </w:tcMar>
+          </w:tcPr>
+          <w:p>
+            <w:pPr>
+              <w:spacing w:after="0"/>
+            </w:pPr>
+            <w:r>
+              <w:rPr>
+                <w:b w:val="false"/>
+                <w:bCs w:val="false"/>
+                <w:sz w:val="19"/>
+                <w:szCs w:val="19"/>
+              </w:rPr>
+              <w:t xml:space="preserve">4 µl (40 ng)</w:t>
+            </w:r>
+          </w:p>
+        </w:tc>
+      </w:tr>
+      <w:tr>
+        <w:tc>
+          <w:tcPr>
+            <w:tcW w:type="dxa" w:w="6519"/>
+            <w:tcMar>
+              <w:top w:type="dxa" w:w="60"/>
+              <w:left w:type="dxa" w:w="100"/>
+              <w:bottom w:type="dxa" w:w="60"/>
+              <w:right w:type="dxa" w:w="100"/>
+            </w:tcMar>
+          </w:tcPr>
+          <w:p>
+            <w:pPr>
+              <w:spacing w:after="0"/>
+            </w:pPr>
+            <w:r>
+              <w:rPr>
+                <w:b w:val="false"/>
+                <w:bCs w:val="false"/>
+                <w:sz w:val="19"/>
+                <w:szCs w:val="19"/>
+              </w:rPr>
+              <w:t xml:space="preserve">Tn5 working dilution — add last (dilution buffer for tube 1)</w:t>
+            </w:r>
+          </w:p>
+        </w:tc>
+        <w:tc>
+          <w:tcPr>
+            <w:tcW w:type="dxa" w:w="2507"/>
+            <w:tcMar>
+              <w:top w:type="dxa" w:w="60"/>
+              <w:left w:type="dxa" w:w="100"/>
+              <w:bottom w:type="dxa" w:w="60"/>
+              <w:right w:type="dxa" w:w="100"/>
+            </w:tcMar>
+          </w:tcPr>
+          <w:p>
+            <w:pPr>
+              <w:spacing w:after="0"/>
+            </w:pPr>
+            <w:r>
+              <w:rPr>
+                <w:b w:val="false"/>
+                <w:bCs w:val="false"/>
+                <w:sz w:val="19"/>
+                <w:szCs w:val="19"/>
+              </w:rPr>
+              <w:t xml:space="preserve">2 µl</w:t>
+            </w:r>
+          </w:p>
+        </w:tc>
+      </w:tr>
+      <w:tr>
+        <w:tc>
+          <w:tcPr>
+            <w:tcW w:type="dxa" w:w="6519"/>
+            <w:tcMar>
+              <w:top w:type="dxa" w:w="60"/>
+              <w:left w:type="dxa" w:w="100"/>
+              <w:bottom w:type="dxa" w:w="60"/>
+              <w:right w:type="dxa" w:w="100"/>
+            </w:tcMar>
+          </w:tcPr>
+          <w:p>
+            <w:pPr>
+              <w:spacing w:after="0"/>
+            </w:pPr>
+            <w:r>
+              <w:rPr>
+                <w:b w:val="false"/>
+                <w:bCs w:val="false"/>
+                <w:sz w:val="19"/>
+                <w:szCs w:val="19"/>
+              </w:rPr>
+              <w:t xml:space="preserve">Total</w:t>
+            </w:r>
+          </w:p>
+        </w:tc>
+        <w:tc>
+          <w:tcPr>
+            <w:tcW w:type="dxa" w:w="2507"/>
+            <w:tcMar>
+              <w:top w:type="dxa" w:w="60"/>
+              <w:left w:type="dxa" w:w="100"/>
+              <w:bottom w:type="dxa" w:w="60"/>
+              <w:right w:type="dxa" w:w="100"/>
+            </w:tcMar>
+          </w:tcPr>
+          <w:p>
+            <w:pPr>
+              <w:spacing w:after="0"/>
+            </w:pPr>
+            <w:r>
+              <w:rPr>
+                <w:b w:val="false"/>
+                <w:bCs w:val="false"/>
+                <w:sz w:val="19"/>
+                <w:szCs w:val="19"/>
+              </w:rPr>
+              <w:t xml:space="preserve">12 µl</w:t>
+            </w:r>
+          </w:p>
+        </w:tc>
+      </w:tr>
+    </w:tbl>
+    <w:p>
+      <w:pPr>
+        <w:spacing w:after="100"/>
+      </w:pPr>
+      <w:r>
+        <w:t xml:space="preserve">Tubes: 1 no enzyme; 2 12.5 nM-equivalent (62.5 nM working); 3 25 nM (125 nM); 4 50 nM (250 nM); 5 100 nM (500 nM); 6 optional commercial Tn5.</w:t>
+      </w:r>
+    </w:p>
+    <w:p>
+      <w:pPr>
+        <w:pStyle w:val="Heading2"/>
+        <w:spacing w:after="100" w:before="200"/>
+      </w:pPr>
+      <w:r>
+        <w:t xml:space="preserve">B.3 Procedure</w:t>
+      </w:r>
+    </w:p>
+    <w:p>
+      <w:pPr>
+        <w:pStyle w:val="ListParagraph"/>
+        <w:numPr>
+          <w:ilvl w:val="0"/>
+          <w:numId w:val="4"/>
+        </w:numPr>
+        <w:spacing w:after="80"/>
+      </w:pPr>
+      <w:r>
+        <w:rPr>
+          <w:b/>
+          <w:bCs/>
+        </w:rPr>
+        <w:t xml:space="preserve">Tagment: </w:t>
+      </w:r>
+      <w:r>
+        <w:t xml:space="preserve">mix gently, spin briefly; 37 °C, 30 min (thermocycler, lid 50 °C). Start all tubes together.</w:t>
+      </w:r>
+    </w:p>
+    <w:p>
+      <w:pPr>
+        <w:pStyle w:val="ListParagraph"/>
+        <w:numPr>
+          <w:ilvl w:val="0"/>
+          <w:numId w:val="4"/>
+        </w:numPr>
+        <w:spacing w:after="80"/>
+      </w:pPr>
+      <w:r>
+        <w:rPr>
+          <w:b/>
+          <w:bCs/>
+        </w:rPr>
+        <w:t xml:space="preserve">Stop and release Tn5: </w:t>
+      </w:r>
+      <w:r>
+        <w:t xml:space="preserve">add 2 µl lysis buffer; 55 °C, 15 min (essential for correct TapeStation sizing).</w:t>
+      </w:r>
+    </w:p>
+    <w:p>
+      <w:pPr>
+        <w:pStyle w:val="ListParagraph"/>
+        <w:numPr>
+          <w:ilvl w:val="0"/>
+          <w:numId w:val="4"/>
+        </w:numPr>
+        <w:spacing w:after="80"/>
+      </w:pPr>
+      <w:r>
+        <w:rPr>
+          <w:b/>
+          <w:bCs/>
+        </w:rPr>
+        <w:t xml:space="preserve">Clean up: </w:t>
+      </w:r>
+      <w:r>
+        <w:t xml:space="preserve">add 36 µl water (~50 µl), then 90 µl SPRI beads (1.8×); 5 min RT; magnet; 2 × 200 µl 80% ethanol; air-dry 2–3 min; elute in 15 µl 10 mM Tris pH 8.0; recover 14 µl.</w:t>
+      </w:r>
+    </w:p>
+    <w:p>
+      <w:pPr>
+        <w:pStyle w:val="ListParagraph"/>
+        <w:numPr>
+          <w:ilvl w:val="0"/>
+          <w:numId w:val="4"/>
+        </w:numPr>
+        <w:spacing w:after="80"/>
+      </w:pPr>
+      <w:r>
+        <w:rPr>
+          <w:b/>
+          <w:bCs/>
+        </w:rPr>
+        <w:t xml:space="preserve">Store (optional): </w:t>
+      </w:r>
+      <w:r>
+        <w:t xml:space="preserve">low-binding tubes labelled with dose, date and Tn5 batch; −20 °C for weeks to months (4 °C for 1–2 days).</w:t>
+      </w:r>
+    </w:p>
+    <w:p>
+      <w:pPr>
+        <w:pStyle w:val="ListParagraph"/>
+        <w:numPr>
+          <w:ilvl w:val="0"/>
+          <w:numId w:val="4"/>
+        </w:numPr>
+        <w:spacing w:after="80"/>
+      </w:pPr>
+      <w:r>
+        <w:rPr>
+          <w:b/>
+          <w:bCs/>
+        </w:rPr>
+        <w:t xml:space="preserve">TapeStation: </w:t>
+      </w:r>
+      <w:r>
+        <w:t xml:space="preserve">D5000 — 1 µl sample + 10 µl D5000 sample buffer (or HS D5000 — 2 µl + 2 µl if &lt; 0.5 ng/µl). Run all doses on one tape; set region 100–5,000 bp.</w:t>
+      </w:r>
+    </w:p>
+    <w:p>
+      <w:pPr>
+        <w:pStyle w:val="Heading2"/>
+        <w:spacing w:after="100" w:before="200"/>
+      </w:pPr>
+      <w:r>
+        <w:t xml:space="preserve">B.4 Interpretation</w:t>
+      </w:r>
+    </w:p>
+    <w:tbl>
+      <w:tblPr>
+        <w:tblW w:type="dxa" w:w="9026"/>
+        <w:tblBorders>
+          <w:top w:val="single" w:color="auto" w:sz="4"/>
+          <w:left w:val="single" w:color="auto" w:sz="4"/>
+          <w:bottom w:val="single" w:color="auto" w:sz="4"/>
+          <w:right w:val="single" w:color="auto" w:sz="4"/>
+          <w:insideH w:val="single" w:color="auto" w:sz="4"/>
+          <w:insideV w:val="single" w:color="auto" w:sz="4"/>
+        </w:tblBorders>
+      </w:tblPr>
+      <w:tblGrid>
+        <w:gridCol w:w="4513"/>
+        <w:gridCol w:w="4513"/>
+      </w:tblGrid>
+      <w:tr>
+        <w:trPr>
+          <w:tblHeader/>
+        </w:trPr>
+        <w:tc>
+          <w:tcPr>
+            <w:tcW w:type="dxa" w:w="4513"/>
+            <w:shd w:fill="1F4E79" w:color="auto" w:val="clear"/>
+            <w:tcMar>
+              <w:top w:type="dxa" w:w="60"/>
+              <w:left w:type="dxa" w:w="100"/>
+              <w:bottom w:type="dxa" w:w="60"/>
+              <w:right w:type="dxa" w:w="100"/>
+            </w:tcMar>
+          </w:tcPr>
+          <w:p>
+            <w:pPr>
+              <w:spacing w:after="0"/>
+            </w:pPr>
+            <w:r>
+              <w:rPr>
+                <w:b/>
+                <w:bCs/>
+                <w:color w:val="FFFFFF"/>
+                <w:sz w:val="19"/>
+                <w:szCs w:val="19"/>
+              </w:rPr>
+              <w:t xml:space="preserve">Profile</w:t>
+            </w:r>
+          </w:p>
+        </w:tc>
+        <w:tc>
+          <w:tcPr>
+            <w:tcW w:type="dxa" w:w="4513"/>
+            <w:shd w:fill="1F4E79" w:color="auto" w:val="clear"/>
+            <w:tcMar>
+              <w:top w:type="dxa" w:w="60"/>
+              <w:left w:type="dxa" w:w="100"/>
+              <w:bottom w:type="dxa" w:w="60"/>
+              <w:right w:type="dxa" w:w="100"/>
+            </w:tcMar>
+          </w:tcPr>
+          <w:p>
+            <w:pPr>
+              <w:spacing w:after="0"/>
+            </w:pPr>
+            <w:r>
+              <w:rPr>
+                <w:b/>
+                <w:bCs/>
+                <w:color w:val="FFFFFF"/>
+                <w:sz w:val="19"/>
+                <w:szCs w:val="19"/>
+              </w:rPr>
+              <w:t xml:space="preserve">Meaning</w:t>
+            </w:r>
+          </w:p>
+        </w:tc>
+      </w:tr>
+      <w:tr>
+        <w:tc>
+          <w:tcPr>
+            <w:tcW w:type="dxa" w:w="4513"/>
+            <w:tcMar>
+              <w:top w:type="dxa" w:w="60"/>
+              <w:left w:type="dxa" w:w="100"/>
+              <w:bottom w:type="dxa" w:w="60"/>
+              <w:right w:type="dxa" w:w="100"/>
+            </w:tcMar>
+          </w:tcPr>
+          <w:p>
+            <w:pPr>
+              <w:spacing w:after="0"/>
+            </w:pPr>
+            <w:r>
+              <w:rPr>
+                <w:b w:val="false"/>
+                <w:bCs w:val="false"/>
+                <w:sz w:val="19"/>
+                <w:szCs w:val="19"/>
+              </w:rPr>
+              <w:t xml:space="preserve">Tube 1: single band near/above top of sizing range</w:t>
+            </w:r>
+          </w:p>
+        </w:tc>
+        <w:tc>
+          <w:tcPr>
+            <w:tcW w:type="dxa" w:w="4513"/>
+            <w:tcMar>
+              <w:top w:type="dxa" w:w="60"/>
+              <w:left w:type="dxa" w:w="100"/>
+              <w:bottom w:type="dxa" w:w="60"/>
+              <w:right w:type="dxa" w:w="100"/>
+            </w:tcMar>
+          </w:tcPr>
+          <w:p>
+            <w:pPr>
+              <w:spacing w:after="0"/>
+            </w:pPr>
+            <w:r>
+              <w:rPr>
+                <w:b w:val="false"/>
+                <w:bCs w:val="false"/>
+                <w:sz w:val="19"/>
+                <w:szCs w:val="19"/>
+              </w:rPr>
+              <w:t xml:space="preserve">Intact lambda (48.5 kb) reference</w:t>
+            </w:r>
+          </w:p>
+        </w:tc>
+      </w:tr>
+      <w:tr>
+        <w:tc>
+          <w:tcPr>
+            <w:tcW w:type="dxa" w:w="4513"/>
+            <w:tcMar>
+              <w:top w:type="dxa" w:w="60"/>
+              <w:left w:type="dxa" w:w="100"/>
+              <w:bottom w:type="dxa" w:w="60"/>
+              <w:right w:type="dxa" w:w="100"/>
+            </w:tcMar>
+          </w:tcPr>
+          <w:p>
+            <w:pPr>
+              <w:spacing w:after="0"/>
+            </w:pPr>
+            <w:r>
+              <w:rPr>
+                <w:b w:val="false"/>
+                <w:bCs w:val="false"/>
+                <w:sz w:val="19"/>
+                <w:szCs w:val="19"/>
+              </w:rPr>
+              <w:t xml:space="preserve">Smear mostly &gt; 1 kb</w:t>
+            </w:r>
+          </w:p>
+        </w:tc>
+        <w:tc>
+          <w:tcPr>
+            <w:tcW w:type="dxa" w:w="4513"/>
+            <w:tcMar>
+              <w:top w:type="dxa" w:w="60"/>
+              <w:left w:type="dxa" w:w="100"/>
+              <w:bottom w:type="dxa" w:w="60"/>
+              <w:right w:type="dxa" w:w="100"/>
+            </w:tcMar>
+          </w:tcPr>
+          <w:p>
+            <w:pPr>
+              <w:spacing w:after="0"/>
+            </w:pPr>
+            <w:r>
+              <w:rPr>
+                <w:b w:val="false"/>
+                <w:bCs w:val="false"/>
+                <w:sz w:val="19"/>
+                <w:szCs w:val="19"/>
+              </w:rPr>
+              <w:t xml:space="preserve">Under-tagmentation</w:t>
+            </w:r>
+          </w:p>
+        </w:tc>
+      </w:tr>
+      <w:tr>
+        <w:tc>
+          <w:tcPr>
+            <w:tcW w:type="dxa" w:w="4513"/>
+            <w:tcMar>
+              <w:top w:type="dxa" w:w="60"/>
+              <w:left w:type="dxa" w:w="100"/>
+              <w:bottom w:type="dxa" w:w="60"/>
+              <w:right w:type="dxa" w:w="100"/>
+            </w:tcMar>
+          </w:tcPr>
+          <w:p>
+            <w:pPr>
+              <w:spacing w:after="0"/>
+            </w:pPr>
+            <w:r>
+              <w:rPr>
+                <w:b w:val="false"/>
+                <w:bCs w:val="false"/>
+                <w:sz w:val="19"/>
+                <w:szCs w:val="19"/>
+              </w:rPr>
+              <w:t xml:space="preserve">Broad smear centred ~200–600 bp</w:t>
+            </w:r>
+          </w:p>
+        </w:tc>
+        <w:tc>
+          <w:tcPr>
+            <w:tcW w:type="dxa" w:w="4513"/>
+            <w:tcMar>
+              <w:top w:type="dxa" w:w="60"/>
+              <w:left w:type="dxa" w:w="100"/>
+              <w:bottom w:type="dxa" w:w="60"/>
+              <w:right w:type="dxa" w:w="100"/>
+            </w:tcMar>
+          </w:tcPr>
+          <w:p>
+            <w:pPr>
+              <w:spacing w:after="0"/>
+            </w:pPr>
+            <w:r>
+              <w:rPr>
+                <w:b w:val="false"/>
+                <w:bCs w:val="false"/>
+                <w:sz w:val="19"/>
+                <w:szCs w:val="19"/>
+              </w:rPr>
+              <w:t xml:space="preserve">Moderate — target</w:t>
+            </w:r>
+          </w:p>
+        </w:tc>
+      </w:tr>
+      <w:tr>
+        <w:tc>
+          <w:tcPr>
+            <w:tcW w:type="dxa" w:w="4513"/>
+            <w:tcMar>
+              <w:top w:type="dxa" w:w="60"/>
+              <w:left w:type="dxa" w:w="100"/>
+              <w:bottom w:type="dxa" w:w="60"/>
+              <w:right w:type="dxa" w:w="100"/>
+            </w:tcMar>
+          </w:tcPr>
+          <w:p>
+            <w:pPr>
+              <w:spacing w:after="0"/>
+            </w:pPr>
+            <w:r>
+              <w:rPr>
+                <w:b w:val="false"/>
+                <w:bCs w:val="false"/>
+                <w:sz w:val="19"/>
+                <w:szCs w:val="19"/>
+              </w:rPr>
+              <w:t xml:space="preserve">Smear mostly &lt; 150–200 bp</w:t>
+            </w:r>
+          </w:p>
+        </w:tc>
+        <w:tc>
+          <w:tcPr>
+            <w:tcW w:type="dxa" w:w="4513"/>
+            <w:tcMar>
+              <w:top w:type="dxa" w:w="60"/>
+              <w:left w:type="dxa" w:w="100"/>
+              <w:bottom w:type="dxa" w:w="60"/>
+              <w:right w:type="dxa" w:w="100"/>
+            </w:tcMar>
+          </w:tcPr>
+          <w:p>
+            <w:pPr>
+              <w:spacing w:after="0"/>
+            </w:pPr>
+            <w:r>
+              <w:rPr>
+                <w:b w:val="false"/>
+                <w:bCs w:val="false"/>
+                <w:sz w:val="19"/>
+                <w:szCs w:val="19"/>
+              </w:rPr>
+              <w:t xml:space="preserve">Over-tagmentation (suspected at current 100 nM)</w:t>
+            </w:r>
+          </w:p>
+        </w:tc>
+      </w:tr>
+    </w:tbl>
+    <w:p>
+      <w:pPr>
+        <w:pStyle w:val="ListParagraph"/>
+        <w:numPr>
+          <w:ilvl w:val="0"/>
+          <w:numId w:val="2"/>
+        </w:numPr>
+        <w:spacing w:after="60"/>
+      </w:pPr>
+      <w:r>
+        <w:t xml:space="preserve">Record peak size, average size and % &lt; 200 bp for each dose and batch.</w:t>
+      </w:r>
+    </w:p>
+    <w:p>
+      <w:pPr>
+        <w:pStyle w:val="ListParagraph"/>
+        <w:numPr>
+          <w:ilvl w:val="0"/>
+          <w:numId w:val="2"/>
+        </w:numPr>
+        <w:spacing w:after="60"/>
+      </w:pPr>
+      <w:r>
+        <w:t xml:space="preserve">If 100 nM already pushes lambda below 200 bp, prioritise 50 and 25 nM in the cf-EpiTracing pilot.</w:t>
+      </w:r>
+    </w:p>
+    <w:p>
+      <w:pPr>
+        <w:pStyle w:val="ListParagraph"/>
+        <w:numPr>
+          <w:ilvl w:val="0"/>
+          <w:numId w:val="2"/>
+        </w:numPr>
+        <w:spacing w:after="60"/>
+      </w:pPr>
+      <w:r>
+        <w:t xml:space="preserve">With a commercial comparator, note which in-house dose matches its profile.</w:t>
+      </w:r>
+    </w:p>
+    <w:p>
+      <w:pPr>
+        <w:pStyle w:val="ListParagraph"/>
+        <w:numPr>
+          <w:ilvl w:val="0"/>
+          <w:numId w:val="2"/>
+        </w:numPr>
+        <w:spacing w:after="60"/>
+      </w:pPr>
+      <w:r>
+        <w:t xml:space="preserve">Repeat for every new Tn5 batch with the same lambda lot, amount and conditions; keep a log.</w:t>
       </w:r>
     </w:p>
     <w:sectPr>
@@ -5270,6 +8291,12 @@
     </w:lvlOverride>
   </w:num>
   <w:num w:numId="3">
+    <w:abstractNumId w:val="2"/>
+    <w:lvlOverride w:ilvl="0">
+      <w:startOverride w:val="1"/>
+    </w:lvlOverride>
+  </w:num>
+  <w:num w:numId="4">
     <w:abstractNumId w:val="2"/>
     <w:lvlOverride w:ilvl="0">
       <w:startOverride w:val="1"/>

</xml_diff>

<commit_message>
Complexity plan v1.2: add NEB lambda DNA dilution
Co-Authored-By: Claude Opus 5.5 <noreply@anthropic.com>
Claude-Session: https://claude.ai/code/session_0118hMfJWJZ4DaiswK3vUJeT
</commit_message>
<xml_diff>
--- a/cfEpi_LibraryComplexity_Plan.docx
+++ b/cfEpi_LibraryComplexity_Plan.docx
@@ -45,7 +45,7 @@
           <w:sz w:val="18"/>
           <w:szCs w:val="18"/>
         </w:rPr>
-        <w:t xml:space="preserve">Prepared for H. Ludewick. Version 1.1, 30 October 2026. Companion to the cf-EpiTracing Bench Protocol (v1.3) and the QC summary workbook (cfEpi_20261026_QC_summary.xlsx).</w:t>
+        <w:t xml:space="preserve">Prepared for H. Ludewick. Version 1.2, 30 October 2026. Companion to the cf-EpiTracing Bench Protocol (v1.3) and the QC summary workbook (cfEpi_20261026_QC_summary.xlsx).</w:t>
       </w:r>
     </w:p>
     <w:p>
@@ -7235,7 +7235,14 @@
         <w:spacing w:after="60"/>
       </w:pPr>
       <w:r>
-        <w:t xml:space="preserve">Lambda DNA diluted to 10 ng/µl in 10 mM Tris-HCl pH 8.0</w:t>
+        <w:rPr>
+          <w:b/>
+          <w:bCs/>
+        </w:rPr>
+        <w:t xml:space="preserve">Lambda DNA, NEB N3011 (500 µg/ml = 500 ng/µl): </w:t>
+      </w:r>
+      <w:r>
+        <w:t xml:space="preserve">dilute to 10 ng/µl — 2 µl stock + 98 µl 10 mM Tris-HCl pH 8.0 = 100 µl (enough for ~25 reactions). Mix by gentle flicking or slow pipetting with a wide-bore tip (48.5 kb DNA shears easily); spin briefly. Store the dilution at 4 °C for up to ~1 month; keep the stock at −20 °C.</w:t>
       </w:r>
     </w:p>
     <w:p>

</xml_diff>

<commit_message>
Complexity plan v1.3: dilution buffer with fresh DTT
Co-Authored-By: Claude Opus 5.5 <noreply@anthropic.com>
Claude-Session: https://claude.ai/code/session_0118hMfJWJZ4DaiswK3vUJeT
</commit_message>
<xml_diff>
--- a/cfEpi_LibraryComplexity_Plan.docx
+++ b/cfEpi_LibraryComplexity_Plan.docx
@@ -45,7 +45,7 @@
           <w:sz w:val="18"/>
           <w:szCs w:val="18"/>
         </w:rPr>
-        <w:t xml:space="preserve">Prepared for H. Ludewick. Version 1.2, 30 October 2026. Companion to the cf-EpiTracing Bench Protocol (v1.3) and the QC summary workbook (cfEpi_20261026_QC_summary.xlsx).</w:t>
+        <w:t xml:space="preserve">Prepared for H. Ludewick. Version 1.3, 30 October 2026. Companion to the cf-EpiTracing Bench Protocol (v1.3) and the QC summary workbook (cfEpi_20261026_QC_summary.xlsx).</w:t>
       </w:r>
     </w:p>
     <w:p>
@@ -6686,7 +6686,27 @@
         <w:spacing w:after="100" w:before="200"/>
       </w:pPr>
       <w:r>
-        <w:t xml:space="preserve">A.5 Working dilutions from 37.5 µM stock (in storage/dilution buffer, on ice)</w:t>
+        <w:t xml:space="preserve">A.5 Working dilutions from 37.5 µM stock (in dilution buffer, on ice)</w:t>
+      </w:r>
+    </w:p>
+    <w:p>
+      <w:pPr>
+        <w:pBdr>
+          <w:left w:val="single" w:color="1F4E79" w:sz="18" w:space="6"/>
+        </w:pBdr>
+        <w:shd w:fill="EAF1F8" w:color="auto" w:val="clear"/>
+        <w:spacing w:after="120" w:before="80"/>
+        <w:ind w:left="120"/>
+      </w:pPr>
+      <w:r>
+        <w:rPr>
+          <w:b/>
+          <w:bCs/>
+        </w:rPr>
+        <w:t xml:space="preserve">Dilution buffer: </w:t>
+      </w:r>
+      <w:r>
+        <w:t xml:space="preserve">Chen et al. storage buffer (50 mM HEPES pH 7.2, 100 mM NaCl, 0.1 mM EDTA, 0.1% Triton X-100, 60% glycerol) with 1 mM DTT added fresh on the day (1 µl of 1 M DTT per 1 ml; keep a DTT-free base buffer and frozen 1 M DTT aliquots). DTT oxidises in solution, and dilute Tn5 is more sensitive to oxidation. Use the same freshly made buffer for all dilutions and the no-enzyme control.</w:t>
       </w:r>
     </w:p>
     <w:tbl>
@@ -7222,7 +7242,7 @@
         <w:spacing w:after="60"/>
       </w:pPr>
       <w:r>
-        <w:t xml:space="preserve">Tn5 working dilutions (Appendix A.5); dilution buffer for the no-enzyme control</w:t>
+        <w:t xml:space="preserve">Tn5 working dilutions (Appendix A.5) and dilution buffer with fresh 1 mM DTT for the no-enzyme control (2 µl per 12 µl reaction gives ~0.17 mM DTT and ~10% glycerol in every tube — no effect on tagmentation)</w:t>
       </w:r>
     </w:p>
     <w:p>

</xml_diff>

<commit_message>
Complexity plan v1.4: revised Tn5 stop, refined dose series, round 1 lambda results
Co-Authored-By: Claude Opus 5.5 <noreply@anthropic.com>
Claude-Session: https://claude.ai/code/session_0118hMfJWJZ4DaiswK3vUJeT
</commit_message>
<xml_diff>
--- a/cfEpi_LibraryComplexity_Plan.docx
+++ b/cfEpi_LibraryComplexity_Plan.docx
@@ -45,7 +45,7 @@
           <w:sz w:val="18"/>
           <w:szCs w:val="18"/>
         </w:rPr>
-        <w:t xml:space="preserve">Prepared for H. Ludewick. Version 1.3, 30 October 2026. Companion to the cf-EpiTracing Bench Protocol (v1.3) and the QC summary workbook (cfEpi_20261026_QC_summary.xlsx).</w:t>
+        <w:t xml:space="preserve">Prepared for H. Ludewick. Version 1.4, 30 October 2026. Companion to the cf-EpiTracing Bench Protocol (v1.3) and the QC summary workbook (cfEpi_20261026_QC_summary.xlsx).</w:t>
       </w:r>
     </w:p>
     <w:p>
@@ -7602,7 +7602,587 @@
         <w:spacing w:after="100"/>
       </w:pPr>
       <w:r>
-        <w:t xml:space="preserve">Tubes: 1 no enzyme; 2 12.5 nM-equivalent (62.5 nM working); 3 25 nM (125 nM); 4 50 nM (250 nM); 5 100 nM (500 nM); 6 optional commercial Tn5.</w:t>
+        <w:t xml:space="preserve">Round 1 tubes (30 Oct 2026): 0, 12.5, 25, 50, 100 nM final. Round 2 (refined, see B.5): 0, 25, 37.5, 50, 75, 100 nM final, plus optional low-DNA series.</w:t>
+      </w:r>
+    </w:p>
+    <w:tbl>
+      <w:tblPr>
+        <w:tblW w:type="dxa" w:w="9026"/>
+        <w:tblBorders>
+          <w:top w:val="single" w:color="auto" w:sz="4"/>
+          <w:left w:val="single" w:color="auto" w:sz="4"/>
+          <w:bottom w:val="single" w:color="auto" w:sz="4"/>
+          <w:right w:val="single" w:color="auto" w:sz="4"/>
+          <w:insideH w:val="single" w:color="auto" w:sz="4"/>
+          <w:insideV w:val="single" w:color="auto" w:sz="4"/>
+        </w:tblBorders>
+      </w:tblPr>
+      <w:tblGrid>
+        <w:gridCol w:w="2507"/>
+        <w:gridCol w:w="2808"/>
+        <w:gridCol w:w="3711"/>
+      </w:tblGrid>
+      <w:tr>
+        <w:trPr>
+          <w:tblHeader/>
+        </w:trPr>
+        <w:tc>
+          <w:tcPr>
+            <w:tcW w:type="dxa" w:w="2507"/>
+            <w:shd w:fill="1F4E79" w:color="auto" w:val="clear"/>
+            <w:tcMar>
+              <w:top w:type="dxa" w:w="60"/>
+              <w:left w:type="dxa" w:w="100"/>
+              <w:bottom w:type="dxa" w:w="60"/>
+              <w:right w:type="dxa" w:w="100"/>
+            </w:tcMar>
+          </w:tcPr>
+          <w:p>
+            <w:pPr>
+              <w:spacing w:after="0"/>
+            </w:pPr>
+            <w:r>
+              <w:rPr>
+                <w:b/>
+                <w:bCs/>
+                <w:color w:val="FFFFFF"/>
+                <w:sz w:val="19"/>
+                <w:szCs w:val="19"/>
+              </w:rPr>
+              <w:t xml:space="preserve">Final Tn5 (in 12 µl)</w:t>
+            </w:r>
+          </w:p>
+        </w:tc>
+        <w:tc>
+          <w:tcPr>
+            <w:tcW w:type="dxa" w:w="2808"/>
+            <w:shd w:fill="1F4E79" w:color="auto" w:val="clear"/>
+            <w:tcMar>
+              <w:top w:type="dxa" w:w="60"/>
+              <w:left w:type="dxa" w:w="100"/>
+              <w:bottom w:type="dxa" w:w="60"/>
+              <w:right w:type="dxa" w:w="100"/>
+            </w:tcMar>
+          </w:tcPr>
+          <w:p>
+            <w:pPr>
+              <w:spacing w:after="0"/>
+            </w:pPr>
+            <w:r>
+              <w:rPr>
+                <w:b/>
+                <w:bCs/>
+                <w:color w:val="FFFFFF"/>
+                <w:sz w:val="19"/>
+                <w:szCs w:val="19"/>
+              </w:rPr>
+              <w:t xml:space="preserve">Working stock to add (2 µl)</w:t>
+            </w:r>
+          </w:p>
+        </w:tc>
+        <w:tc>
+          <w:tcPr>
+            <w:tcW w:type="dxa" w:w="3711"/>
+            <w:shd w:fill="1F4E79" w:color="auto" w:val="clear"/>
+            <w:tcMar>
+              <w:top w:type="dxa" w:w="60"/>
+              <w:left w:type="dxa" w:w="100"/>
+              <w:bottom w:type="dxa" w:w="60"/>
+              <w:right w:type="dxa" w:w="100"/>
+            </w:tcMar>
+          </w:tcPr>
+          <w:p>
+            <w:pPr>
+              <w:spacing w:after="0"/>
+            </w:pPr>
+            <w:r>
+              <w:rPr>
+                <w:b/>
+                <w:bCs/>
+                <w:color w:val="FFFFFF"/>
+                <w:sz w:val="19"/>
+                <w:szCs w:val="19"/>
+              </w:rPr>
+              <w:t xml:space="preserve">How to make the working stock</w:t>
+            </w:r>
+          </w:p>
+        </w:tc>
+      </w:tr>
+      <w:tr>
+        <w:tc>
+          <w:tcPr>
+            <w:tcW w:type="dxa" w:w="2507"/>
+            <w:tcMar>
+              <w:top w:type="dxa" w:w="60"/>
+              <w:left w:type="dxa" w:w="100"/>
+              <w:bottom w:type="dxa" w:w="60"/>
+              <w:right w:type="dxa" w:w="100"/>
+            </w:tcMar>
+          </w:tcPr>
+          <w:p>
+            <w:pPr>
+              <w:spacing w:after="0"/>
+            </w:pPr>
+            <w:r>
+              <w:rPr>
+                <w:b w:val="false"/>
+                <w:bCs w:val="false"/>
+                <w:sz w:val="19"/>
+                <w:szCs w:val="19"/>
+              </w:rPr>
+              <w:t xml:space="preserve">0 (no enzyme)</w:t>
+            </w:r>
+          </w:p>
+        </w:tc>
+        <w:tc>
+          <w:tcPr>
+            <w:tcW w:type="dxa" w:w="2808"/>
+            <w:tcMar>
+              <w:top w:type="dxa" w:w="60"/>
+              <w:left w:type="dxa" w:w="100"/>
+              <w:bottom w:type="dxa" w:w="60"/>
+              <w:right w:type="dxa" w:w="100"/>
+            </w:tcMar>
+          </w:tcPr>
+          <w:p>
+            <w:pPr>
+              <w:spacing w:after="0"/>
+            </w:pPr>
+            <w:r>
+              <w:rPr>
+                <w:b w:val="false"/>
+                <w:bCs w:val="false"/>
+                <w:sz w:val="19"/>
+                <w:szCs w:val="19"/>
+              </w:rPr>
+              <w:t xml:space="preserve">Dilution buffer</w:t>
+            </w:r>
+          </w:p>
+        </w:tc>
+        <w:tc>
+          <w:tcPr>
+            <w:tcW w:type="dxa" w:w="3711"/>
+            <w:tcMar>
+              <w:top w:type="dxa" w:w="60"/>
+              <w:left w:type="dxa" w:w="100"/>
+              <w:bottom w:type="dxa" w:w="60"/>
+              <w:right w:type="dxa" w:w="100"/>
+            </w:tcMar>
+          </w:tcPr>
+          <w:p>
+            <w:pPr>
+              <w:spacing w:after="0"/>
+            </w:pPr>
+            <w:r>
+              <w:rPr>
+                <w:b w:val="false"/>
+                <w:bCs w:val="false"/>
+                <w:sz w:val="19"/>
+                <w:szCs w:val="19"/>
+              </w:rPr>
+              <w:t xml:space="preserve">—</w:t>
+            </w:r>
+          </w:p>
+        </w:tc>
+      </w:tr>
+      <w:tr>
+        <w:tc>
+          <w:tcPr>
+            <w:tcW w:type="dxa" w:w="2507"/>
+            <w:tcMar>
+              <w:top w:type="dxa" w:w="60"/>
+              <w:left w:type="dxa" w:w="100"/>
+              <w:bottom w:type="dxa" w:w="60"/>
+              <w:right w:type="dxa" w:w="100"/>
+            </w:tcMar>
+          </w:tcPr>
+          <w:p>
+            <w:pPr>
+              <w:spacing w:after="0"/>
+            </w:pPr>
+            <w:r>
+              <w:rPr>
+                <w:b w:val="false"/>
+                <w:bCs w:val="false"/>
+                <w:sz w:val="19"/>
+                <w:szCs w:val="19"/>
+              </w:rPr>
+              <w:t xml:space="preserve">25 nM</w:t>
+            </w:r>
+          </w:p>
+        </w:tc>
+        <w:tc>
+          <w:tcPr>
+            <w:tcW w:type="dxa" w:w="2808"/>
+            <w:tcMar>
+              <w:top w:type="dxa" w:w="60"/>
+              <w:left w:type="dxa" w:w="100"/>
+              <w:bottom w:type="dxa" w:w="60"/>
+              <w:right w:type="dxa" w:w="100"/>
+            </w:tcMar>
+          </w:tcPr>
+          <w:p>
+            <w:pPr>
+              <w:spacing w:after="0"/>
+            </w:pPr>
+            <w:r>
+              <w:rPr>
+                <w:b w:val="false"/>
+                <w:bCs w:val="false"/>
+                <w:sz w:val="19"/>
+                <w:szCs w:val="19"/>
+              </w:rPr>
+              <w:t xml:space="preserve">150 nM</w:t>
+            </w:r>
+          </w:p>
+        </w:tc>
+        <w:tc>
+          <w:tcPr>
+            <w:tcW w:type="dxa" w:w="3711"/>
+            <w:tcMar>
+              <w:top w:type="dxa" w:w="60"/>
+              <w:left w:type="dxa" w:w="100"/>
+              <w:bottom w:type="dxa" w:w="60"/>
+              <w:right w:type="dxa" w:w="100"/>
+            </w:tcMar>
+          </w:tcPr>
+          <w:p>
+            <w:pPr>
+              <w:spacing w:after="0"/>
+            </w:pPr>
+            <w:r>
+              <w:rPr>
+                <w:b w:val="false"/>
+                <w:bCs w:val="false"/>
+                <w:sz w:val="19"/>
+                <w:szCs w:val="19"/>
+              </w:rPr>
+              <w:t xml:space="preserve">30 µl of 500 nM + 70 µl buffer</w:t>
+            </w:r>
+          </w:p>
+        </w:tc>
+      </w:tr>
+      <w:tr>
+        <w:tc>
+          <w:tcPr>
+            <w:tcW w:type="dxa" w:w="2507"/>
+            <w:tcMar>
+              <w:top w:type="dxa" w:w="60"/>
+              <w:left w:type="dxa" w:w="100"/>
+              <w:bottom w:type="dxa" w:w="60"/>
+              <w:right w:type="dxa" w:w="100"/>
+            </w:tcMar>
+          </w:tcPr>
+          <w:p>
+            <w:pPr>
+              <w:spacing w:after="0"/>
+            </w:pPr>
+            <w:r>
+              <w:rPr>
+                <w:b w:val="false"/>
+                <w:bCs w:val="false"/>
+                <w:sz w:val="19"/>
+                <w:szCs w:val="19"/>
+              </w:rPr>
+              <w:t xml:space="preserve">37.5 nM</w:t>
+            </w:r>
+          </w:p>
+        </w:tc>
+        <w:tc>
+          <w:tcPr>
+            <w:tcW w:type="dxa" w:w="2808"/>
+            <w:tcMar>
+              <w:top w:type="dxa" w:w="60"/>
+              <w:left w:type="dxa" w:w="100"/>
+              <w:bottom w:type="dxa" w:w="60"/>
+              <w:right w:type="dxa" w:w="100"/>
+            </w:tcMar>
+          </w:tcPr>
+          <w:p>
+            <w:pPr>
+              <w:spacing w:after="0"/>
+            </w:pPr>
+            <w:r>
+              <w:rPr>
+                <w:b w:val="false"/>
+                <w:bCs w:val="false"/>
+                <w:sz w:val="19"/>
+                <w:szCs w:val="19"/>
+              </w:rPr>
+              <w:t xml:space="preserve">225 nM</w:t>
+            </w:r>
+          </w:p>
+        </w:tc>
+        <w:tc>
+          <w:tcPr>
+            <w:tcW w:type="dxa" w:w="3711"/>
+            <w:tcMar>
+              <w:top w:type="dxa" w:w="60"/>
+              <w:left w:type="dxa" w:w="100"/>
+              <w:bottom w:type="dxa" w:w="60"/>
+              <w:right w:type="dxa" w:w="100"/>
+            </w:tcMar>
+          </w:tcPr>
+          <w:p>
+            <w:pPr>
+              <w:spacing w:after="0"/>
+            </w:pPr>
+            <w:r>
+              <w:rPr>
+                <w:b w:val="false"/>
+                <w:bCs w:val="false"/>
+                <w:sz w:val="19"/>
+                <w:szCs w:val="19"/>
+              </w:rPr>
+              <w:t xml:space="preserve">45 µl of 500 nM + 55 µl buffer</w:t>
+            </w:r>
+          </w:p>
+        </w:tc>
+      </w:tr>
+      <w:tr>
+        <w:tc>
+          <w:tcPr>
+            <w:tcW w:type="dxa" w:w="2507"/>
+            <w:tcMar>
+              <w:top w:type="dxa" w:w="60"/>
+              <w:left w:type="dxa" w:w="100"/>
+              <w:bottom w:type="dxa" w:w="60"/>
+              <w:right w:type="dxa" w:w="100"/>
+            </w:tcMar>
+          </w:tcPr>
+          <w:p>
+            <w:pPr>
+              <w:spacing w:after="0"/>
+            </w:pPr>
+            <w:r>
+              <w:rPr>
+                <w:b w:val="false"/>
+                <w:bCs w:val="false"/>
+                <w:sz w:val="19"/>
+                <w:szCs w:val="19"/>
+              </w:rPr>
+              <w:t xml:space="preserve">50 nM</w:t>
+            </w:r>
+          </w:p>
+        </w:tc>
+        <w:tc>
+          <w:tcPr>
+            <w:tcW w:type="dxa" w:w="2808"/>
+            <w:tcMar>
+              <w:top w:type="dxa" w:w="60"/>
+              <w:left w:type="dxa" w:w="100"/>
+              <w:bottom w:type="dxa" w:w="60"/>
+              <w:right w:type="dxa" w:w="100"/>
+            </w:tcMar>
+          </w:tcPr>
+          <w:p>
+            <w:pPr>
+              <w:spacing w:after="0"/>
+            </w:pPr>
+            <w:r>
+              <w:rPr>
+                <w:b w:val="false"/>
+                <w:bCs w:val="false"/>
+                <w:sz w:val="19"/>
+                <w:szCs w:val="19"/>
+              </w:rPr>
+              <w:t xml:space="preserve">300 nM</w:t>
+            </w:r>
+          </w:p>
+        </w:tc>
+        <w:tc>
+          <w:tcPr>
+            <w:tcW w:type="dxa" w:w="3711"/>
+            <w:tcMar>
+              <w:top w:type="dxa" w:w="60"/>
+              <w:left w:type="dxa" w:w="100"/>
+              <w:bottom w:type="dxa" w:w="60"/>
+              <w:right w:type="dxa" w:w="100"/>
+            </w:tcMar>
+          </w:tcPr>
+          <w:p>
+            <w:pPr>
+              <w:spacing w:after="0"/>
+            </w:pPr>
+            <w:r>
+              <w:rPr>
+                <w:b w:val="false"/>
+                <w:bCs w:val="false"/>
+                <w:sz w:val="19"/>
+                <w:szCs w:val="19"/>
+              </w:rPr>
+              <w:t xml:space="preserve">60 µl of 500 nM + 40 µl buffer</w:t>
+            </w:r>
+          </w:p>
+        </w:tc>
+      </w:tr>
+      <w:tr>
+        <w:tc>
+          <w:tcPr>
+            <w:tcW w:type="dxa" w:w="2507"/>
+            <w:tcMar>
+              <w:top w:type="dxa" w:w="60"/>
+              <w:left w:type="dxa" w:w="100"/>
+              <w:bottom w:type="dxa" w:w="60"/>
+              <w:right w:type="dxa" w:w="100"/>
+            </w:tcMar>
+          </w:tcPr>
+          <w:p>
+            <w:pPr>
+              <w:spacing w:after="0"/>
+            </w:pPr>
+            <w:r>
+              <w:rPr>
+                <w:b w:val="false"/>
+                <w:bCs w:val="false"/>
+                <w:sz w:val="19"/>
+                <w:szCs w:val="19"/>
+              </w:rPr>
+              <w:t xml:space="preserve">75 nM</w:t>
+            </w:r>
+          </w:p>
+        </w:tc>
+        <w:tc>
+          <w:tcPr>
+            <w:tcW w:type="dxa" w:w="2808"/>
+            <w:tcMar>
+              <w:top w:type="dxa" w:w="60"/>
+              <w:left w:type="dxa" w:w="100"/>
+              <w:bottom w:type="dxa" w:w="60"/>
+              <w:right w:type="dxa" w:w="100"/>
+            </w:tcMar>
+          </w:tcPr>
+          <w:p>
+            <w:pPr>
+              <w:spacing w:after="0"/>
+            </w:pPr>
+            <w:r>
+              <w:rPr>
+                <w:b w:val="false"/>
+                <w:bCs w:val="false"/>
+                <w:sz w:val="19"/>
+                <w:szCs w:val="19"/>
+              </w:rPr>
+              <w:t xml:space="preserve">450 nM</w:t>
+            </w:r>
+          </w:p>
+        </w:tc>
+        <w:tc>
+          <w:tcPr>
+            <w:tcW w:type="dxa" w:w="3711"/>
+            <w:tcMar>
+              <w:top w:type="dxa" w:w="60"/>
+              <w:left w:type="dxa" w:w="100"/>
+              <w:bottom w:type="dxa" w:w="60"/>
+              <w:right w:type="dxa" w:w="100"/>
+            </w:tcMar>
+          </w:tcPr>
+          <w:p>
+            <w:pPr>
+              <w:spacing w:after="0"/>
+            </w:pPr>
+            <w:r>
+              <w:rPr>
+                <w:b w:val="false"/>
+                <w:bCs w:val="false"/>
+                <w:sz w:val="19"/>
+                <w:szCs w:val="19"/>
+              </w:rPr>
+              <w:t xml:space="preserve">90 µl of 500 nM + 10 µl buffer</w:t>
+            </w:r>
+          </w:p>
+        </w:tc>
+      </w:tr>
+      <w:tr>
+        <w:tc>
+          <w:tcPr>
+            <w:tcW w:type="dxa" w:w="2507"/>
+            <w:tcMar>
+              <w:top w:type="dxa" w:w="60"/>
+              <w:left w:type="dxa" w:w="100"/>
+              <w:bottom w:type="dxa" w:w="60"/>
+              <w:right w:type="dxa" w:w="100"/>
+            </w:tcMar>
+          </w:tcPr>
+          <w:p>
+            <w:pPr>
+              <w:spacing w:after="0"/>
+            </w:pPr>
+            <w:r>
+              <w:rPr>
+                <w:b w:val="false"/>
+                <w:bCs w:val="false"/>
+                <w:sz w:val="19"/>
+                <w:szCs w:val="19"/>
+              </w:rPr>
+              <w:t xml:space="preserve">100 nM</w:t>
+            </w:r>
+          </w:p>
+        </w:tc>
+        <w:tc>
+          <w:tcPr>
+            <w:tcW w:type="dxa" w:w="2808"/>
+            <w:tcMar>
+              <w:top w:type="dxa" w:w="60"/>
+              <w:left w:type="dxa" w:w="100"/>
+              <w:bottom w:type="dxa" w:w="60"/>
+              <w:right w:type="dxa" w:w="100"/>
+            </w:tcMar>
+          </w:tcPr>
+          <w:p>
+            <w:pPr>
+              <w:spacing w:after="0"/>
+            </w:pPr>
+            <w:r>
+              <w:rPr>
+                <w:b w:val="false"/>
+                <w:bCs w:val="false"/>
+                <w:sz w:val="19"/>
+                <w:szCs w:val="19"/>
+              </w:rPr>
+              <w:t xml:space="preserve">600 nM</w:t>
+            </w:r>
+          </w:p>
+        </w:tc>
+        <w:tc>
+          <w:tcPr>
+            <w:tcW w:type="dxa" w:w="3711"/>
+            <w:tcMar>
+              <w:top w:type="dxa" w:w="60"/>
+              <w:left w:type="dxa" w:w="100"/>
+              <w:bottom w:type="dxa" w:w="60"/>
+              <w:right w:type="dxa" w:w="100"/>
+            </w:tcMar>
+          </w:tcPr>
+          <w:p>
+            <w:pPr>
+              <w:spacing w:after="0"/>
+            </w:pPr>
+            <w:r>
+              <w:rPr>
+                <w:b w:val="false"/>
+                <w:bCs w:val="false"/>
+                <w:sz w:val="19"/>
+                <w:szCs w:val="19"/>
+              </w:rPr>
+              <w:t xml:space="preserve">6 µl of 5 µM + 44 µl buffer</w:t>
+            </w:r>
+          </w:p>
+        </w:tc>
+      </w:tr>
+    </w:tbl>
+    <w:p>
+      <w:pPr>
+        <w:spacing w:after="100"/>
+      </w:pPr>
+      <w:r>
+        <w:rPr>
+          <w:i/>
+          <w:iCs/>
+          <w:sz w:val="18"/>
+          <w:szCs w:val="18"/>
+        </w:rPr>
+        <w:t xml:space="preserve">Final concentrations are calculated for the 12 µl reaction (2 µl working stock × working conc ÷ 12). Use dilution buffer with fresh 1 mM DTT; mix each dilution thoroughly.</w:t>
       </w:r>
     </w:p>
     <w:p>
@@ -7648,10 +8228,10 @@
           <w:b/>
           <w:bCs/>
         </w:rPr>
-        <w:t xml:space="preserve">Stop and release Tn5: </w:t>
-      </w:r>
-      <w:r>
-        <w:t xml:space="preserve">add 2 µl lysis buffer; 55 °C, 15 min (essential for correct TapeStation sizing).</w:t>
+        <w:t xml:space="preserve">Stop and release Tn5 (revised): </w:t>
+      </w:r>
+      <w:r>
+        <w:t xml:space="preserve">add 2 µl lysis buffer (unchanged) + 0.7 µl 10% SDS (≈ 0.5% SDS total). Incubate 55 °C, 30 min, then 70 °C, 10 min. Cool to room temperature (not on ice — SDS precipitates). Treat every tube identically, including the no-enzyme control. The original stop (2 µl lysis buffer only, ≈ 0.04% SDS) did not fully release Tn5 at 50–100 nM.</w:t>
       </w:r>
     </w:p>
     <w:p>
@@ -7671,7 +8251,7 @@
         <w:t xml:space="preserve">Clean up: </w:t>
       </w:r>
       <w:r>
-        <w:t xml:space="preserve">add 36 µl water (~50 µl), then 90 µl SPRI beads (1.8×); 5 min RT; magnet; 2 × 200 µl 80% ethanol; air-dry 2–3 min; elute in 15 µl 10 mM Tris pH 8.0; recover 14 µl.</w:t>
+        <w:t xml:space="preserve">add water to ~50 µl (≈ 35 µl), keep at room temperature, then 90 µl SPRI beads (1.8×); 5 min RT; magnet; 2 × 200 µl 80% ethanol; air-dry 2–3 min; elute in 15 µl 10 mM Tris pH 8.0; recover 14 µl.</w:t>
       </w:r>
     </w:p>
     <w:p>
@@ -8057,6 +8637,757 @@
       </w:pPr>
       <w:r>
         <w:t xml:space="preserve">Repeat for every new Tn5 batch with the same lambda lot, amount and conditions; keep a log.</w:t>
+      </w:r>
+    </w:p>
+    <w:p>
+      <w:pPr>
+        <w:pStyle w:val="Heading2"/>
+        <w:spacing w:after="100" w:before="200"/>
+      </w:pPr>
+      <w:r>
+        <w:t xml:space="preserve">B.5 Round 1 results (30 Oct 2026, TapeStation D5000)</w:t>
+      </w:r>
+    </w:p>
+    <w:tbl>
+      <w:tblPr>
+        <w:tblW w:type="dxa" w:w="9026"/>
+        <w:tblBorders>
+          <w:top w:val="single" w:color="auto" w:sz="4"/>
+          <w:left w:val="single" w:color="auto" w:sz="4"/>
+          <w:bottom w:val="single" w:color="auto" w:sz="4"/>
+          <w:right w:val="single" w:color="auto" w:sz="4"/>
+          <w:insideH w:val="single" w:color="auto" w:sz="4"/>
+          <w:insideV w:val="single" w:color="auto" w:sz="4"/>
+        </w:tblBorders>
+      </w:tblPr>
+      <w:tblGrid>
+        <w:gridCol w:w="903"/>
+        <w:gridCol w:w="1304"/>
+        <w:gridCol w:w="3911"/>
+        <w:gridCol w:w="2908"/>
+      </w:tblGrid>
+      <w:tr>
+        <w:trPr>
+          <w:tblHeader/>
+        </w:trPr>
+        <w:tc>
+          <w:tcPr>
+            <w:tcW w:type="dxa" w:w="903"/>
+            <w:shd w:fill="1F4E79" w:color="auto" w:val="clear"/>
+            <w:tcMar>
+              <w:top w:type="dxa" w:w="60"/>
+              <w:left w:type="dxa" w:w="100"/>
+              <w:bottom w:type="dxa" w:w="60"/>
+              <w:right w:type="dxa" w:w="100"/>
+            </w:tcMar>
+          </w:tcPr>
+          <w:p>
+            <w:pPr>
+              <w:spacing w:after="0"/>
+            </w:pPr>
+            <w:r>
+              <w:rPr>
+                <w:b/>
+                <w:bCs/>
+                <w:color w:val="FFFFFF"/>
+                <w:sz w:val="19"/>
+                <w:szCs w:val="19"/>
+              </w:rPr>
+              <w:t xml:space="preserve">Lane</w:t>
+            </w:r>
+          </w:p>
+        </w:tc>
+        <w:tc>
+          <w:tcPr>
+            <w:tcW w:type="dxa" w:w="1304"/>
+            <w:shd w:fill="1F4E79" w:color="auto" w:val="clear"/>
+            <w:tcMar>
+              <w:top w:type="dxa" w:w="60"/>
+              <w:left w:type="dxa" w:w="100"/>
+              <w:bottom w:type="dxa" w:w="60"/>
+              <w:right w:type="dxa" w:w="100"/>
+            </w:tcMar>
+          </w:tcPr>
+          <w:p>
+            <w:pPr>
+              <w:spacing w:after="0"/>
+            </w:pPr>
+            <w:r>
+              <w:rPr>
+                <w:b/>
+                <w:bCs/>
+                <w:color w:val="FFFFFF"/>
+                <w:sz w:val="19"/>
+                <w:szCs w:val="19"/>
+              </w:rPr>
+              <w:t xml:space="preserve">Final Tn5</w:t>
+            </w:r>
+          </w:p>
+        </w:tc>
+        <w:tc>
+          <w:tcPr>
+            <w:tcW w:type="dxa" w:w="3911"/>
+            <w:shd w:fill="1F4E79" w:color="auto" w:val="clear"/>
+            <w:tcMar>
+              <w:top w:type="dxa" w:w="60"/>
+              <w:left w:type="dxa" w:w="100"/>
+              <w:bottom w:type="dxa" w:w="60"/>
+              <w:right w:type="dxa" w:w="100"/>
+            </w:tcMar>
+          </w:tcPr>
+          <w:p>
+            <w:pPr>
+              <w:spacing w:after="0"/>
+            </w:pPr>
+            <w:r>
+              <w:rPr>
+                <w:b/>
+                <w:bCs/>
+                <w:color w:val="FFFFFF"/>
+                <w:sz w:val="19"/>
+                <w:szCs w:val="19"/>
+              </w:rPr>
+              <w:t xml:space="preserve">Profile</w:t>
+            </w:r>
+          </w:p>
+        </w:tc>
+        <w:tc>
+          <w:tcPr>
+            <w:tcW w:type="dxa" w:w="2908"/>
+            <w:shd w:fill="1F4E79" w:color="auto" w:val="clear"/>
+            <w:tcMar>
+              <w:top w:type="dxa" w:w="60"/>
+              <w:left w:type="dxa" w:w="100"/>
+              <w:bottom w:type="dxa" w:w="60"/>
+              <w:right w:type="dxa" w:w="100"/>
+            </w:tcMar>
+          </w:tcPr>
+          <w:p>
+            <w:pPr>
+              <w:spacing w:after="0"/>
+            </w:pPr>
+            <w:r>
+              <w:rPr>
+                <w:b/>
+                <w:bCs/>
+                <w:color w:val="FFFFFF"/>
+                <w:sz w:val="19"/>
+                <w:szCs w:val="19"/>
+              </w:rPr>
+              <w:t xml:space="preserve">Interpretation</w:t>
+            </w:r>
+          </w:p>
+        </w:tc>
+      </w:tr>
+      <w:tr>
+        <w:tc>
+          <w:tcPr>
+            <w:tcW w:type="dxa" w:w="903"/>
+            <w:tcMar>
+              <w:top w:type="dxa" w:w="60"/>
+              <w:left w:type="dxa" w:w="100"/>
+              <w:bottom w:type="dxa" w:w="60"/>
+              <w:right w:type="dxa" w:w="100"/>
+            </w:tcMar>
+          </w:tcPr>
+          <w:p>
+            <w:pPr>
+              <w:spacing w:after="0"/>
+            </w:pPr>
+            <w:r>
+              <w:rPr>
+                <w:b w:val="false"/>
+                <w:bCs w:val="false"/>
+                <w:sz w:val="19"/>
+                <w:szCs w:val="19"/>
+              </w:rPr>
+              <w:t xml:space="preserve">B1</w:t>
+            </w:r>
+          </w:p>
+        </w:tc>
+        <w:tc>
+          <w:tcPr>
+            <w:tcW w:type="dxa" w:w="1304"/>
+            <w:tcMar>
+              <w:top w:type="dxa" w:w="60"/>
+              <w:left w:type="dxa" w:w="100"/>
+              <w:bottom w:type="dxa" w:w="60"/>
+              <w:right w:type="dxa" w:w="100"/>
+            </w:tcMar>
+          </w:tcPr>
+          <w:p>
+            <w:pPr>
+              <w:spacing w:after="0"/>
+            </w:pPr>
+            <w:r>
+              <w:rPr>
+                <w:b w:val="false"/>
+                <w:bCs w:val="false"/>
+                <w:sz w:val="19"/>
+                <w:szCs w:val="19"/>
+              </w:rPr>
+              <w:t xml:space="preserve">0</w:t>
+            </w:r>
+          </w:p>
+        </w:tc>
+        <w:tc>
+          <w:tcPr>
+            <w:tcW w:type="dxa" w:w="3911"/>
+            <w:tcMar>
+              <w:top w:type="dxa" w:w="60"/>
+              <w:left w:type="dxa" w:w="100"/>
+              <w:bottom w:type="dxa" w:w="60"/>
+              <w:right w:type="dxa" w:w="100"/>
+            </w:tcMar>
+          </w:tcPr>
+          <w:p>
+            <w:pPr>
+              <w:spacing w:after="0"/>
+            </w:pPr>
+            <w:r>
+              <w:rPr>
+                <w:b w:val="false"/>
+                <w:bCs w:val="false"/>
+                <w:sz w:val="19"/>
+                <w:szCs w:val="19"/>
+              </w:rPr>
+              <w:t xml:space="preserve">Single band near top (sized ~4.7 kb; lambda is 48.5 kb, beyond range); 14.2 ng/µl</w:t>
+            </w:r>
+          </w:p>
+        </w:tc>
+        <w:tc>
+          <w:tcPr>
+            <w:tcW w:type="dxa" w:w="2908"/>
+            <w:tcMar>
+              <w:top w:type="dxa" w:w="60"/>
+              <w:left w:type="dxa" w:w="100"/>
+              <w:bottom w:type="dxa" w:w="60"/>
+              <w:right w:type="dxa" w:w="100"/>
+            </w:tcMar>
+          </w:tcPr>
+          <w:p>
+            <w:pPr>
+              <w:spacing w:after="0"/>
+            </w:pPr>
+            <w:r>
+              <w:rPr>
+                <w:b w:val="false"/>
+                <w:bCs w:val="false"/>
+                <w:sz w:val="19"/>
+                <w:szCs w:val="19"/>
+              </w:rPr>
+              <w:t xml:space="preserve">Intact lambda reference</w:t>
+            </w:r>
+          </w:p>
+        </w:tc>
+      </w:tr>
+      <w:tr>
+        <w:tc>
+          <w:tcPr>
+            <w:tcW w:type="dxa" w:w="903"/>
+            <w:tcMar>
+              <w:top w:type="dxa" w:w="60"/>
+              <w:left w:type="dxa" w:w="100"/>
+              <w:bottom w:type="dxa" w:w="60"/>
+              <w:right w:type="dxa" w:w="100"/>
+            </w:tcMar>
+          </w:tcPr>
+          <w:p>
+            <w:pPr>
+              <w:spacing w:after="0"/>
+            </w:pPr>
+            <w:r>
+              <w:rPr>
+                <w:b w:val="false"/>
+                <w:bCs w:val="false"/>
+                <w:sz w:val="19"/>
+                <w:szCs w:val="19"/>
+              </w:rPr>
+              <w:t xml:space="preserve">F1</w:t>
+            </w:r>
+          </w:p>
+        </w:tc>
+        <w:tc>
+          <w:tcPr>
+            <w:tcW w:type="dxa" w:w="1304"/>
+            <w:tcMar>
+              <w:top w:type="dxa" w:w="60"/>
+              <w:left w:type="dxa" w:w="100"/>
+              <w:bottom w:type="dxa" w:w="60"/>
+              <w:right w:type="dxa" w:w="100"/>
+            </w:tcMar>
+          </w:tcPr>
+          <w:p>
+            <w:pPr>
+              <w:spacing w:after="0"/>
+            </w:pPr>
+            <w:r>
+              <w:rPr>
+                <w:b w:val="false"/>
+                <w:bCs w:val="false"/>
+                <w:sz w:val="19"/>
+                <w:szCs w:val="19"/>
+              </w:rPr>
+              <w:t xml:space="preserve">12.5 nM</w:t>
+            </w:r>
+          </w:p>
+        </w:tc>
+        <w:tc>
+          <w:tcPr>
+            <w:tcW w:type="dxa" w:w="3911"/>
+            <w:tcMar>
+              <w:top w:type="dxa" w:w="60"/>
+              <w:left w:type="dxa" w:w="100"/>
+              <w:bottom w:type="dxa" w:w="60"/>
+              <w:right w:type="dxa" w:w="100"/>
+            </w:tcMar>
+          </w:tcPr>
+          <w:p>
+            <w:pPr>
+              <w:spacing w:after="0"/>
+            </w:pPr>
+            <w:r>
+              <w:rPr>
+                <w:b w:val="false"/>
+                <w:bCs w:val="false"/>
+                <w:sz w:val="19"/>
+                <w:szCs w:val="19"/>
+              </w:rPr>
+              <w:t xml:space="preserve">Identical to no-enzyme</w:t>
+            </w:r>
+          </w:p>
+        </w:tc>
+        <w:tc>
+          <w:tcPr>
+            <w:tcW w:type="dxa" w:w="2908"/>
+            <w:tcMar>
+              <w:top w:type="dxa" w:w="60"/>
+              <w:left w:type="dxa" w:w="100"/>
+              <w:bottom w:type="dxa" w:w="60"/>
+              <w:right w:type="dxa" w:w="100"/>
+            </w:tcMar>
+          </w:tcPr>
+          <w:p>
+            <w:pPr>
+              <w:spacing w:after="0"/>
+            </w:pPr>
+            <w:r>
+              <w:rPr>
+                <w:b w:val="false"/>
+                <w:bCs w:val="false"/>
+                <w:sz w:val="19"/>
+                <w:szCs w:val="19"/>
+              </w:rPr>
+              <w:t xml:space="preserve">No detectable cutting</w:t>
+            </w:r>
+          </w:p>
+        </w:tc>
+      </w:tr>
+      <w:tr>
+        <w:tc>
+          <w:tcPr>
+            <w:tcW w:type="dxa" w:w="903"/>
+            <w:tcMar>
+              <w:top w:type="dxa" w:w="60"/>
+              <w:left w:type="dxa" w:w="100"/>
+              <w:bottom w:type="dxa" w:w="60"/>
+              <w:right w:type="dxa" w:w="100"/>
+            </w:tcMar>
+          </w:tcPr>
+          <w:p>
+            <w:pPr>
+              <w:spacing w:after="0"/>
+            </w:pPr>
+            <w:r>
+              <w:rPr>
+                <w:b w:val="false"/>
+                <w:bCs w:val="false"/>
+                <w:sz w:val="19"/>
+                <w:szCs w:val="19"/>
+              </w:rPr>
+              <w:t xml:space="preserve">E1</w:t>
+            </w:r>
+          </w:p>
+        </w:tc>
+        <w:tc>
+          <w:tcPr>
+            <w:tcW w:type="dxa" w:w="1304"/>
+            <w:tcMar>
+              <w:top w:type="dxa" w:w="60"/>
+              <w:left w:type="dxa" w:w="100"/>
+              <w:bottom w:type="dxa" w:w="60"/>
+              <w:right w:type="dxa" w:w="100"/>
+            </w:tcMar>
+          </w:tcPr>
+          <w:p>
+            <w:pPr>
+              <w:spacing w:after="0"/>
+            </w:pPr>
+            <w:r>
+              <w:rPr>
+                <w:b w:val="false"/>
+                <w:bCs w:val="false"/>
+                <w:sz w:val="19"/>
+                <w:szCs w:val="19"/>
+              </w:rPr>
+              <w:t xml:space="preserve">25 nM</w:t>
+            </w:r>
+          </w:p>
+        </w:tc>
+        <w:tc>
+          <w:tcPr>
+            <w:tcW w:type="dxa" w:w="3911"/>
+            <w:tcMar>
+              <w:top w:type="dxa" w:w="60"/>
+              <w:left w:type="dxa" w:w="100"/>
+              <w:bottom w:type="dxa" w:w="60"/>
+              <w:right w:type="dxa" w:w="100"/>
+            </w:tcMar>
+          </w:tcPr>
+          <w:p>
+            <w:pPr>
+              <w:spacing w:after="0"/>
+            </w:pPr>
+            <w:r>
+              <w:rPr>
+                <w:b w:val="false"/>
+                <w:bCs w:val="false"/>
+                <w:sz w:val="19"/>
+                <w:szCs w:val="19"/>
+              </w:rPr>
+              <w:t xml:space="preserve">Identical to no-enzyme</w:t>
+            </w:r>
+          </w:p>
+        </w:tc>
+        <w:tc>
+          <w:tcPr>
+            <w:tcW w:type="dxa" w:w="2908"/>
+            <w:tcMar>
+              <w:top w:type="dxa" w:w="60"/>
+              <w:left w:type="dxa" w:w="100"/>
+              <w:bottom w:type="dxa" w:w="60"/>
+              <w:right w:type="dxa" w:w="100"/>
+            </w:tcMar>
+          </w:tcPr>
+          <w:p>
+            <w:pPr>
+              <w:spacing w:after="0"/>
+            </w:pPr>
+            <w:r>
+              <w:rPr>
+                <w:b w:val="false"/>
+                <w:bCs w:val="false"/>
+                <w:sz w:val="19"/>
+                <w:szCs w:val="19"/>
+              </w:rPr>
+              <w:t xml:space="preserve">No detectable cutting</w:t>
+            </w:r>
+          </w:p>
+        </w:tc>
+      </w:tr>
+      <w:tr>
+        <w:tc>
+          <w:tcPr>
+            <w:tcW w:type="dxa" w:w="903"/>
+            <w:tcMar>
+              <w:top w:type="dxa" w:w="60"/>
+              <w:left w:type="dxa" w:w="100"/>
+              <w:bottom w:type="dxa" w:w="60"/>
+              <w:right w:type="dxa" w:w="100"/>
+            </w:tcMar>
+          </w:tcPr>
+          <w:p>
+            <w:pPr>
+              <w:spacing w:after="0"/>
+            </w:pPr>
+            <w:r>
+              <w:rPr>
+                <w:b w:val="false"/>
+                <w:bCs w:val="false"/>
+                <w:sz w:val="19"/>
+                <w:szCs w:val="19"/>
+              </w:rPr>
+              <w:t xml:space="preserve">D1</w:t>
+            </w:r>
+          </w:p>
+        </w:tc>
+        <w:tc>
+          <w:tcPr>
+            <w:tcW w:type="dxa" w:w="1304"/>
+            <w:tcMar>
+              <w:top w:type="dxa" w:w="60"/>
+              <w:left w:type="dxa" w:w="100"/>
+              <w:bottom w:type="dxa" w:w="60"/>
+              <w:right w:type="dxa" w:w="100"/>
+            </w:tcMar>
+          </w:tcPr>
+          <w:p>
+            <w:pPr>
+              <w:spacing w:after="0"/>
+            </w:pPr>
+            <w:r>
+              <w:rPr>
+                <w:b w:val="false"/>
+                <w:bCs w:val="false"/>
+                <w:sz w:val="19"/>
+                <w:szCs w:val="19"/>
+              </w:rPr>
+              <w:t xml:space="preserve">50 nM</w:t>
+            </w:r>
+          </w:p>
+        </w:tc>
+        <w:tc>
+          <w:tcPr>
+            <w:tcW w:type="dxa" w:w="3911"/>
+            <w:tcMar>
+              <w:top w:type="dxa" w:w="60"/>
+              <w:left w:type="dxa" w:w="100"/>
+              <w:bottom w:type="dxa" w:w="60"/>
+              <w:right w:type="dxa" w:w="100"/>
+            </w:tcMar>
+          </w:tcPr>
+          <w:p>
+            <w:pPr>
+              <w:spacing w:after="0"/>
+            </w:pPr>
+            <w:r>
+              <w:rPr>
+                <w:b w:val="false"/>
+                <w:bCs w:val="false"/>
+                <w:sz w:val="19"/>
+                <w:szCs w:val="19"/>
+              </w:rPr>
+              <w:t xml:space="preserve">Lambda band gone; strong signal above upper marker; weak 15–300 bp smear; heavy staining at lower marker</w:t>
+            </w:r>
+          </w:p>
+        </w:tc>
+        <w:tc>
+          <w:tcPr>
+            <w:tcW w:type="dxa" w:w="2908"/>
+            <w:tcMar>
+              <w:top w:type="dxa" w:w="60"/>
+              <w:left w:type="dxa" w:w="100"/>
+              <w:bottom w:type="dxa" w:w="60"/>
+              <w:right w:type="dxa" w:w="100"/>
+            </w:tcMar>
+          </w:tcPr>
+          <w:p>
+            <w:pPr>
+              <w:spacing w:after="0"/>
+            </w:pPr>
+            <w:r>
+              <w:rPr>
+                <w:b w:val="false"/>
+                <w:bCs w:val="false"/>
+                <w:sz w:val="19"/>
+                <w:szCs w:val="19"/>
+              </w:rPr>
+              <w:t xml:space="preserve">Fully cut but Tn5–DNA complexes not released; excess free adapter at bottom</w:t>
+            </w:r>
+          </w:p>
+        </w:tc>
+      </w:tr>
+      <w:tr>
+        <w:tc>
+          <w:tcPr>
+            <w:tcW w:type="dxa" w:w="903"/>
+            <w:tcMar>
+              <w:top w:type="dxa" w:w="60"/>
+              <w:left w:type="dxa" w:w="100"/>
+              <w:bottom w:type="dxa" w:w="60"/>
+              <w:right w:type="dxa" w:w="100"/>
+            </w:tcMar>
+          </w:tcPr>
+          <w:p>
+            <w:pPr>
+              <w:spacing w:after="0"/>
+            </w:pPr>
+            <w:r>
+              <w:rPr>
+                <w:b w:val="false"/>
+                <w:bCs w:val="false"/>
+                <w:sz w:val="19"/>
+                <w:szCs w:val="19"/>
+              </w:rPr>
+              <w:t xml:space="preserve">C1</w:t>
+            </w:r>
+          </w:p>
+        </w:tc>
+        <w:tc>
+          <w:tcPr>
+            <w:tcW w:type="dxa" w:w="1304"/>
+            <w:tcMar>
+              <w:top w:type="dxa" w:w="60"/>
+              <w:left w:type="dxa" w:w="100"/>
+              <w:bottom w:type="dxa" w:w="60"/>
+              <w:right w:type="dxa" w:w="100"/>
+            </w:tcMar>
+          </w:tcPr>
+          <w:p>
+            <w:pPr>
+              <w:spacing w:after="0"/>
+            </w:pPr>
+            <w:r>
+              <w:rPr>
+                <w:b w:val="false"/>
+                <w:bCs w:val="false"/>
+                <w:sz w:val="19"/>
+                <w:szCs w:val="19"/>
+              </w:rPr>
+              <w:t xml:space="preserve">100 nM</w:t>
+            </w:r>
+          </w:p>
+        </w:tc>
+        <w:tc>
+          <w:tcPr>
+            <w:tcW w:type="dxa" w:w="3911"/>
+            <w:tcMar>
+              <w:top w:type="dxa" w:w="60"/>
+              <w:left w:type="dxa" w:w="100"/>
+              <w:bottom w:type="dxa" w:w="60"/>
+              <w:right w:type="dxa" w:w="100"/>
+            </w:tcMar>
+          </w:tcPr>
+          <w:p>
+            <w:pPr>
+              <w:spacing w:after="0"/>
+            </w:pPr>
+            <w:r>
+              <w:rPr>
+                <w:b w:val="false"/>
+                <w:bCs w:val="false"/>
+                <w:sz w:val="19"/>
+                <w:szCs w:val="19"/>
+              </w:rPr>
+              <w:t xml:space="preserve">As 50 nM</w:t>
+            </w:r>
+          </w:p>
+        </w:tc>
+        <w:tc>
+          <w:tcPr>
+            <w:tcW w:type="dxa" w:w="2908"/>
+            <w:tcMar>
+              <w:top w:type="dxa" w:w="60"/>
+              <w:left w:type="dxa" w:w="100"/>
+              <w:bottom w:type="dxa" w:w="60"/>
+              <w:right w:type="dxa" w:w="100"/>
+            </w:tcMar>
+          </w:tcPr>
+          <w:p>
+            <w:pPr>
+              <w:spacing w:after="0"/>
+            </w:pPr>
+            <w:r>
+              <w:rPr>
+                <w:b w:val="false"/>
+                <w:bCs w:val="false"/>
+                <w:sz w:val="19"/>
+                <w:szCs w:val="19"/>
+              </w:rPr>
+              <w:t xml:space="preserve">As 50 nM</w:t>
+            </w:r>
+          </w:p>
+        </w:tc>
+      </w:tr>
+    </w:tbl>
+    <w:p>
+      <w:pPr>
+        <w:pStyle w:val="ListParagraph"/>
+        <w:numPr>
+          <w:ilvl w:val="0"/>
+          <w:numId w:val="2"/>
+        </w:numPr>
+        <w:spacing w:after="60"/>
+      </w:pPr>
+      <w:r>
+        <w:t xml:space="preserve">The Tn5 batch is clearly active: 50–100 nM fully cuts the lambda input in 30 min. In cf-EpiTracing, 100 nM meets only picograms of chromatin, supporting the over-tagmentation hypothesis and testing 25–50 nM in the pilot.</w:t>
+      </w:r>
+    </w:p>
+    <w:p>
+      <w:pPr>
+        <w:pStyle w:val="ListParagraph"/>
+        <w:numPr>
+          <w:ilvl w:val="0"/>
+          <w:numId w:val="2"/>
+        </w:numPr>
+        <w:spacing w:after="60"/>
+      </w:pPr>
+      <w:r>
+        <w:t xml:space="preserve">Sharp switch between 25 and 50 nM: check the lambda input by Qubit (no-enzyme lane suggests ~200 ng recovered rather than 40 ng; D5000 quantification above 5 kb is unreliable). Excess DNA would mask cutting at low doses.</w:t>
+      </w:r>
+    </w:p>
+    <w:p>
+      <w:pPr>
+        <w:pStyle w:val="ListParagraph"/>
+        <w:numPr>
+          <w:ilvl w:val="0"/>
+          <w:numId w:val="2"/>
+        </w:numPr>
+        <w:spacing w:after="60"/>
+      </w:pPr>
+      <w:r>
+        <w:t xml:space="preserve">Material above the upper marker at 50–100 nM indicates incomplete Tn5 release; use the revised stop (B.3, step 2).</w:t>
+      </w:r>
+    </w:p>
+    <w:p>
+      <w:pPr>
+        <w:pStyle w:val="Heading2"/>
+        <w:spacing w:after="100" w:before="200"/>
+      </w:pPr>
+      <w:r>
+        <w:t xml:space="preserve">B.6 Round 2 plan</w:t>
+      </w:r>
+    </w:p>
+    <w:p>
+      <w:pPr>
+        <w:pStyle w:val="ListParagraph"/>
+        <w:numPr>
+          <w:ilvl w:val="0"/>
+          <w:numId w:val="2"/>
+        </w:numPr>
+        <w:spacing w:after="60"/>
+      </w:pPr>
+      <w:r>
+        <w:t xml:space="preserve">Qubit the 10 ng/µl lambda dilution; use 40 ng per reaction.</w:t>
+      </w:r>
+    </w:p>
+    <w:p>
+      <w:pPr>
+        <w:pStyle w:val="ListParagraph"/>
+        <w:numPr>
+          <w:ilvl w:val="0"/>
+          <w:numId w:val="2"/>
+        </w:numPr>
+        <w:spacing w:after="60"/>
+      </w:pPr>
+      <w:r>
+        <w:t xml:space="preserve">Doses: 0, 25, 37.5, 50, 75, 100 nM (table in B.2); revised SDS/proteinase K stop; 1.8× SPRI clean-up; D5000.</w:t>
+      </w:r>
+    </w:p>
+    <w:p>
+      <w:pPr>
+        <w:pStyle w:val="ListParagraph"/>
+        <w:numPr>
+          <w:ilvl w:val="0"/>
+          <w:numId w:val="2"/>
+        </w:numPr>
+        <w:spacing w:after="60"/>
+      </w:pPr>
+      <w:r>
+        <w:t xml:space="preserve">Optional low-DNA series: 5 ng lambda at 12.5, 25 and 50 nM, run on High Sensitivity D5000 (closer to cf-EpiTracing input).</w:t>
+      </w:r>
+    </w:p>
+    <w:p>
+      <w:pPr>
+        <w:pStyle w:val="ListParagraph"/>
+        <w:numPr>
+          <w:ilvl w:val="0"/>
+          <w:numId w:val="2"/>
+        </w:numPr>
+        <w:spacing w:after="60"/>
+      </w:pPr>
+      <w:r>
+        <w:t xml:space="preserve">Read-out: where the smear is centred at each dose (mostly &lt; 200 bp = over-tagmentation; ~200–600 bp = moderate). Carry the bracketing doses (likely 25, 50, 100 nM) into the cf-EpiTracing pilot.</w:t>
       </w:r>
     </w:p>
     <w:sectPr>

</xml_diff>

<commit_message>
Complexity plan v1.5: Chen et al. benchmarks and batch QC assay
Co-Authored-By: Claude Opus 5.5 <noreply@anthropic.com>
Claude-Session: https://claude.ai/code/session_0118hMfJWJZ4DaiswK3vUJeT
</commit_message>
<xml_diff>
--- a/cfEpi_LibraryComplexity_Plan.docx
+++ b/cfEpi_LibraryComplexity_Plan.docx
@@ -45,7 +45,7 @@
           <w:sz w:val="18"/>
           <w:szCs w:val="18"/>
         </w:rPr>
-        <w:t xml:space="preserve">Prepared for H. Ludewick. Version 1.4, 30 October 2026. Companion to the cf-EpiTracing Bench Protocol (v1.3) and the QC summary workbook (cfEpi_20261026_QC_summary.xlsx).</w:t>
+        <w:t xml:space="preserve">Prepared for H. Ludewick. Version 1.5, 30 October 2026. Companion to the cf-EpiTracing Bench Protocol (v1.3) and the QC summary workbook (cfEpi_20261026_QC_summary.xlsx).</w:t>
       </w:r>
     </w:p>
     <w:p>
@@ -1621,6 +1621,1099 @@
     </w:tbl>
     <w:p>
       <w:pPr>
+        <w:pStyle w:val="Heading2"/>
+        <w:spacing w:after="100" w:before="200"/>
+      </w:pPr>
+      <w:r>
+        <w:t xml:space="preserve">2.4 Benchmarks from Chen et al. (personal communication, 30 Oct 2026)</w:t>
+      </w:r>
+    </w:p>
+    <w:p>
+      <w:pPr>
+        <w:spacing w:after="100"/>
+      </w:pPr>
+      <w:r>
+        <w:t xml:space="preserve">The Chen et al. authors replied to our QC questions. Their benchmarks, against our run 20261026 (observed unique human fragments after duplicate removal):</w:t>
+      </w:r>
+    </w:p>
+    <w:tbl>
+      <w:tblPr>
+        <w:tblW w:type="dxa" w:w="9026"/>
+        <w:tblBorders>
+          <w:top w:val="single" w:color="auto" w:sz="4"/>
+          <w:left w:val="single" w:color="auto" w:sz="4"/>
+          <w:bottom w:val="single" w:color="auto" w:sz="4"/>
+          <w:right w:val="single" w:color="auto" w:sz="4"/>
+          <w:insideH w:val="single" w:color="auto" w:sz="4"/>
+          <w:insideV w:val="single" w:color="auto" w:sz="4"/>
+        </w:tblBorders>
+      </w:tblPr>
+      <w:tblGrid>
+        <w:gridCol w:w="2006"/>
+        <w:gridCol w:w="2407"/>
+        <w:gridCol w:w="2507"/>
+        <w:gridCol w:w="2106"/>
+      </w:tblGrid>
+      <w:tr>
+        <w:trPr>
+          <w:tblHeader/>
+        </w:trPr>
+        <w:tc>
+          <w:tcPr>
+            <w:tcW w:type="dxa" w:w="2006"/>
+            <w:shd w:fill="1F4E79" w:color="auto" w:val="clear"/>
+            <w:tcMar>
+              <w:top w:type="dxa" w:w="60"/>
+              <w:left w:type="dxa" w:w="100"/>
+              <w:bottom w:type="dxa" w:w="60"/>
+              <w:right w:type="dxa" w:w="100"/>
+            </w:tcMar>
+          </w:tcPr>
+          <w:p>
+            <w:pPr>
+              <w:spacing w:after="0"/>
+            </w:pPr>
+            <w:r>
+              <w:rPr>
+                <w:b/>
+                <w:bCs/>
+                <w:color w:val="FFFFFF"/>
+                <w:sz w:val="19"/>
+                <w:szCs w:val="19"/>
+              </w:rPr>
+              <w:t xml:space="preserve">Parameter</w:t>
+            </w:r>
+          </w:p>
+        </w:tc>
+        <w:tc>
+          <w:tcPr>
+            <w:tcW w:type="dxa" w:w="2407"/>
+            <w:shd w:fill="1F4E79" w:color="auto" w:val="clear"/>
+            <w:tcMar>
+              <w:top w:type="dxa" w:w="60"/>
+              <w:left w:type="dxa" w:w="100"/>
+              <w:bottom w:type="dxa" w:w="60"/>
+              <w:right w:type="dxa" w:w="100"/>
+            </w:tcMar>
+          </w:tcPr>
+          <w:p>
+            <w:pPr>
+              <w:spacing w:after="0"/>
+            </w:pPr>
+            <w:r>
+              <w:rPr>
+                <w:b/>
+                <w:bCs/>
+                <w:color w:val="FFFFFF"/>
+                <w:sz w:val="19"/>
+                <w:szCs w:val="19"/>
+              </w:rPr>
+              <w:t xml:space="preserve">Chen et al.</w:t>
+            </w:r>
+          </w:p>
+        </w:tc>
+        <w:tc>
+          <w:tcPr>
+            <w:tcW w:type="dxa" w:w="2507"/>
+            <w:shd w:fill="1F4E79" w:color="auto" w:val="clear"/>
+            <w:tcMar>
+              <w:top w:type="dxa" w:w="60"/>
+              <w:left w:type="dxa" w:w="100"/>
+              <w:bottom w:type="dxa" w:w="60"/>
+              <w:right w:type="dxa" w:w="100"/>
+            </w:tcMar>
+          </w:tcPr>
+          <w:p>
+            <w:pPr>
+              <w:spacing w:after="0"/>
+            </w:pPr>
+            <w:r>
+              <w:rPr>
+                <w:b/>
+                <w:bCs/>
+                <w:color w:val="FFFFFF"/>
+                <w:sz w:val="19"/>
+                <w:szCs w:val="19"/>
+              </w:rPr>
+              <w:t xml:space="preserve">This study</w:t>
+            </w:r>
+          </w:p>
+        </w:tc>
+        <w:tc>
+          <w:tcPr>
+            <w:tcW w:type="dxa" w:w="2106"/>
+            <w:shd w:fill="1F4E79" w:color="auto" w:val="clear"/>
+            <w:tcMar>
+              <w:top w:type="dxa" w:w="60"/>
+              <w:left w:type="dxa" w:w="100"/>
+              <w:bottom w:type="dxa" w:w="60"/>
+              <w:right w:type="dxa" w:w="100"/>
+            </w:tcMar>
+          </w:tcPr>
+          <w:p>
+            <w:pPr>
+              <w:spacing w:after="0"/>
+            </w:pPr>
+            <w:r>
+              <w:rPr>
+                <w:b/>
+                <w:bCs/>
+                <w:color w:val="FFFFFF"/>
+                <w:sz w:val="19"/>
+                <w:szCs w:val="19"/>
+              </w:rPr>
+              <w:t xml:space="preserve">Assessment</w:t>
+            </w:r>
+          </w:p>
+        </w:tc>
+      </w:tr>
+      <w:tr>
+        <w:tc>
+          <w:tcPr>
+            <w:tcW w:type="dxa" w:w="2006"/>
+            <w:tcMar>
+              <w:top w:type="dxa" w:w="60"/>
+              <w:left w:type="dxa" w:w="100"/>
+              <w:bottom w:type="dxa" w:w="60"/>
+              <w:right w:type="dxa" w:w="100"/>
+            </w:tcMar>
+          </w:tcPr>
+          <w:p>
+            <w:pPr>
+              <w:spacing w:after="0"/>
+            </w:pPr>
+            <w:r>
+              <w:rPr>
+                <w:b w:val="false"/>
+                <w:bCs w:val="false"/>
+                <w:sz w:val="19"/>
+                <w:szCs w:val="19"/>
+              </w:rPr>
+              <w:t xml:space="preserve">Plasma donors (volume comparison)</w:t>
+            </w:r>
+          </w:p>
+        </w:tc>
+        <w:tc>
+          <w:tcPr>
+            <w:tcW w:type="dxa" w:w="2407"/>
+            <w:tcMar>
+              <w:top w:type="dxa" w:w="60"/>
+              <w:left w:type="dxa" w:w="100"/>
+              <w:bottom w:type="dxa" w:w="60"/>
+              <w:right w:type="dxa" w:w="100"/>
+            </w:tcMar>
+          </w:tcPr>
+          <w:p>
+            <w:pPr>
+              <w:spacing w:after="0"/>
+            </w:pPr>
+            <w:r>
+              <w:rPr>
+                <w:b w:val="false"/>
+                <w:bCs w:val="false"/>
+                <w:sz w:val="19"/>
+                <w:szCs w:val="19"/>
+              </w:rPr>
+              <w:t xml:space="preserve">Healthy donors</w:t>
+            </w:r>
+          </w:p>
+        </w:tc>
+        <w:tc>
+          <w:tcPr>
+            <w:tcW w:type="dxa" w:w="2507"/>
+            <w:tcMar>
+              <w:top w:type="dxa" w:w="60"/>
+              <w:left w:type="dxa" w:w="100"/>
+              <w:bottom w:type="dxa" w:w="60"/>
+              <w:right w:type="dxa" w:w="100"/>
+            </w:tcMar>
+          </w:tcPr>
+          <w:p>
+            <w:pPr>
+              <w:spacing w:after="0"/>
+            </w:pPr>
+            <w:r>
+              <w:rPr>
+                <w:b w:val="false"/>
+                <w:bCs w:val="false"/>
+                <w:sz w:val="19"/>
+                <w:szCs w:val="19"/>
+              </w:rPr>
+              <w:t xml:space="preserve">Healthy donors</w:t>
+            </w:r>
+          </w:p>
+        </w:tc>
+        <w:tc>
+          <w:tcPr>
+            <w:tcW w:type="dxa" w:w="2106"/>
+            <w:tcMar>
+              <w:top w:type="dxa" w:w="60"/>
+              <w:left w:type="dxa" w:w="100"/>
+              <w:bottom w:type="dxa" w:w="60"/>
+              <w:right w:type="dxa" w:w="100"/>
+            </w:tcMar>
+          </w:tcPr>
+          <w:p>
+            <w:pPr>
+              <w:spacing w:after="0"/>
+            </w:pPr>
+            <w:r>
+              <w:rPr>
+                <w:b w:val="false"/>
+                <w:bCs w:val="false"/>
+                <w:sz w:val="19"/>
+                <w:szCs w:val="19"/>
+              </w:rPr>
+              <w:t xml:space="preserve">Directly comparable</w:t>
+            </w:r>
+          </w:p>
+        </w:tc>
+      </w:tr>
+      <w:tr>
+        <w:tc>
+          <w:tcPr>
+            <w:tcW w:type="dxa" w:w="2006"/>
+            <w:tcMar>
+              <w:top w:type="dxa" w:w="60"/>
+              <w:left w:type="dxa" w:w="100"/>
+              <w:bottom w:type="dxa" w:w="60"/>
+              <w:right w:type="dxa" w:w="100"/>
+            </w:tcMar>
+          </w:tcPr>
+          <w:p>
+            <w:pPr>
+              <w:spacing w:after="0"/>
+            </w:pPr>
+            <w:r>
+              <w:rPr>
+                <w:b w:val="false"/>
+                <w:bCs w:val="false"/>
+                <w:sz w:val="19"/>
+                <w:szCs w:val="19"/>
+              </w:rPr>
+              <w:t xml:space="preserve">Unique fragments per library</w:t>
+            </w:r>
+          </w:p>
+        </w:tc>
+        <w:tc>
+          <w:tcPr>
+            <w:tcW w:type="dxa" w:w="2407"/>
+            <w:tcMar>
+              <w:top w:type="dxa" w:w="60"/>
+              <w:left w:type="dxa" w:w="100"/>
+              <w:bottom w:type="dxa" w:w="60"/>
+              <w:right w:type="dxa" w:w="100"/>
+            </w:tcMar>
+          </w:tcPr>
+          <w:p>
+            <w:pPr>
+              <w:spacing w:after="0"/>
+            </w:pPr>
+            <w:r>
+              <w:rPr>
+                <w:b w:val="false"/>
+                <w:bCs w:val="false"/>
+                <w:sz w:val="19"/>
+                <w:szCs w:val="19"/>
+              </w:rPr>
+              <w:t xml:space="preserve">≥ 1 M minimum; usually ≥ 5 M; &gt; 10 M for some marks</w:t>
+            </w:r>
+          </w:p>
+        </w:tc>
+        <w:tc>
+          <w:tcPr>
+            <w:tcW w:type="dxa" w:w="2507"/>
+            <w:tcMar>
+              <w:top w:type="dxa" w:w="60"/>
+              <w:left w:type="dxa" w:w="100"/>
+              <w:bottom w:type="dxa" w:w="60"/>
+              <w:right w:type="dxa" w:w="100"/>
+            </w:tcMar>
+          </w:tcPr>
+          <w:p>
+            <w:pPr>
+              <w:spacing w:after="0"/>
+            </w:pPr>
+            <w:r>
+              <w:rPr>
+                <w:b w:val="false"/>
+                <w:bCs w:val="false"/>
+                <w:sz w:val="19"/>
+                <w:szCs w:val="19"/>
+              </w:rPr>
+              <w:t xml:space="preserve">0.22–4.4 M (median ~1 M); 12/24 ≥ 1 M; none ≥ 5 M</w:t>
+            </w:r>
+          </w:p>
+        </w:tc>
+        <w:tc>
+          <w:tcPr>
+            <w:tcW w:type="dxa" w:w="2106"/>
+            <w:tcMar>
+              <w:top w:type="dxa" w:w="60"/>
+              <w:left w:type="dxa" w:w="100"/>
+              <w:bottom w:type="dxa" w:w="60"/>
+              <w:right w:type="dxa" w:w="100"/>
+            </w:tcMar>
+          </w:tcPr>
+          <w:p>
+            <w:pPr>
+              <w:spacing w:after="0"/>
+            </w:pPr>
+            <w:r>
+              <w:rPr>
+                <w:b w:val="false"/>
+                <w:bCs w:val="false"/>
+                <w:sz w:val="19"/>
+                <w:szCs w:val="19"/>
+              </w:rPr>
+              <w:t xml:space="preserve">~3–10× below typical; usable but complexity-limited</w:t>
+            </w:r>
+          </w:p>
+        </w:tc>
+      </w:tr>
+      <w:tr>
+        <w:tc>
+          <w:tcPr>
+            <w:tcW w:type="dxa" w:w="2006"/>
+            <w:tcMar>
+              <w:top w:type="dxa" w:w="60"/>
+              <w:left w:type="dxa" w:w="100"/>
+              <w:bottom w:type="dxa" w:w="60"/>
+              <w:right w:type="dxa" w:w="100"/>
+            </w:tcMar>
+          </w:tcPr>
+          <w:p>
+            <w:pPr>
+              <w:spacing w:after="0"/>
+            </w:pPr>
+            <w:r>
+              <w:rPr>
+                <w:b w:val="false"/>
+                <w:bCs w:val="false"/>
+                <w:sz w:val="19"/>
+                <w:szCs w:val="19"/>
+              </w:rPr>
+              <w:t xml:space="preserve">Duplication rate</w:t>
+            </w:r>
+          </w:p>
+        </w:tc>
+        <w:tc>
+          <w:tcPr>
+            <w:tcW w:type="dxa" w:w="2407"/>
+            <w:tcMar>
+              <w:top w:type="dxa" w:w="60"/>
+              <w:left w:type="dxa" w:w="100"/>
+              <w:bottom w:type="dxa" w:w="60"/>
+              <w:right w:type="dxa" w:w="100"/>
+            </w:tcMar>
+          </w:tcPr>
+          <w:p>
+            <w:pPr>
+              <w:spacing w:after="0"/>
+            </w:pPr>
+            <w:r>
+              <w:rPr>
+                <w:b w:val="false"/>
+                <w:bCs w:val="false"/>
+                <w:sz w:val="19"/>
+                <w:szCs w:val="19"/>
+              </w:rPr>
+              <w:t xml:space="preserve">~10–50%</w:t>
+            </w:r>
+          </w:p>
+        </w:tc>
+        <w:tc>
+          <w:tcPr>
+            <w:tcW w:type="dxa" w:w="2507"/>
+            <w:tcMar>
+              <w:top w:type="dxa" w:w="60"/>
+              <w:left w:type="dxa" w:w="100"/>
+              <w:bottom w:type="dxa" w:w="60"/>
+              <w:right w:type="dxa" w:w="100"/>
+            </w:tcMar>
+          </w:tcPr>
+          <w:p>
+            <w:pPr>
+              <w:spacing w:after="0"/>
+            </w:pPr>
+            <w:r>
+              <w:rPr>
+                <w:b w:val="false"/>
+                <w:bCs w:val="false"/>
+                <w:sz w:val="19"/>
+                <w:szCs w:val="19"/>
+              </w:rPr>
+              <w:t xml:space="preserve">56–94%</w:t>
+            </w:r>
+          </w:p>
+        </w:tc>
+        <w:tc>
+          <w:tcPr>
+            <w:tcW w:type="dxa" w:w="2106"/>
+            <w:tcMar>
+              <w:top w:type="dxa" w:w="60"/>
+              <w:left w:type="dxa" w:w="100"/>
+              <w:bottom w:type="dxa" w:w="60"/>
+              <w:right w:type="dxa" w:w="100"/>
+            </w:tcMar>
+          </w:tcPr>
+          <w:p>
+            <w:pPr>
+              <w:spacing w:after="0"/>
+            </w:pPr>
+            <w:r>
+              <w:rPr>
+                <w:b w:val="false"/>
+                <w:bCs w:val="false"/>
+                <w:sz w:val="19"/>
+                <w:szCs w:val="19"/>
+              </w:rPr>
+              <w:t xml:space="preserve">Saturated (also depth-dependent; compare unique fragments)</w:t>
+            </w:r>
+          </w:p>
+        </w:tc>
+      </w:tr>
+      <w:tr>
+        <w:tc>
+          <w:tcPr>
+            <w:tcW w:type="dxa" w:w="2006"/>
+            <w:tcMar>
+              <w:top w:type="dxa" w:w="60"/>
+              <w:left w:type="dxa" w:w="100"/>
+              <w:bottom w:type="dxa" w:w="60"/>
+              <w:right w:type="dxa" w:w="100"/>
+            </w:tcMar>
+          </w:tcPr>
+          <w:p>
+            <w:pPr>
+              <w:spacing w:after="0"/>
+            </w:pPr>
+            <w:r>
+              <w:rPr>
+                <w:b w:val="false"/>
+                <w:bCs w:val="false"/>
+                <w:sz w:val="19"/>
+                <w:szCs w:val="19"/>
+              </w:rPr>
+              <w:t xml:space="preserve">Mark dependence</w:t>
+            </w:r>
+          </w:p>
+        </w:tc>
+        <w:tc>
+          <w:tcPr>
+            <w:tcW w:type="dxa" w:w="2407"/>
+            <w:tcMar>
+              <w:top w:type="dxa" w:w="60"/>
+              <w:left w:type="dxa" w:w="100"/>
+              <w:bottom w:type="dxa" w:w="60"/>
+              <w:right w:type="dxa" w:w="100"/>
+            </w:tcMar>
+          </w:tcPr>
+          <w:p>
+            <w:pPr>
+              <w:spacing w:after="0"/>
+            </w:pPr>
+            <w:r>
+              <w:rPr>
+                <w:b w:val="false"/>
+                <w:bCs w:val="false"/>
+                <w:sz w:val="19"/>
+                <w:szCs w:val="19"/>
+              </w:rPr>
+              <w:t xml:space="preserve">Varies by mark</w:t>
+            </w:r>
+          </w:p>
+        </w:tc>
+        <w:tc>
+          <w:tcPr>
+            <w:tcW w:type="dxa" w:w="2507"/>
+            <w:tcMar>
+              <w:top w:type="dxa" w:w="60"/>
+              <w:left w:type="dxa" w:w="100"/>
+              <w:bottom w:type="dxa" w:w="60"/>
+              <w:right w:type="dxa" w:w="100"/>
+            </w:tcMar>
+          </w:tcPr>
+          <w:p>
+            <w:pPr>
+              <w:spacing w:after="0"/>
+            </w:pPr>
+            <w:r>
+              <w:rPr>
+                <w:b w:val="false"/>
+                <w:bCs w:val="false"/>
+                <w:sz w:val="19"/>
+                <w:szCs w:val="19"/>
+              </w:rPr>
+              <w:t xml:space="preserve">H3K36me3 highest (3.0–4.4 M); H3K9ac and HC8 lowest (0.39–0.43 M)</w:t>
+            </w:r>
+          </w:p>
+        </w:tc>
+        <w:tc>
+          <w:tcPr>
+            <w:tcW w:type="dxa" w:w="2106"/>
+            <w:tcMar>
+              <w:top w:type="dxa" w:w="60"/>
+              <w:left w:type="dxa" w:w="100"/>
+              <w:bottom w:type="dxa" w:w="60"/>
+              <w:right w:type="dxa" w:w="100"/>
+            </w:tcMar>
+          </w:tcPr>
+          <w:p>
+            <w:pPr>
+              <w:spacing w:after="0"/>
+            </w:pPr>
+            <w:r>
+              <w:rPr>
+                <w:b w:val="false"/>
+                <w:bCs w:val="false"/>
+                <w:sz w:val="19"/>
+                <w:szCs w:val="19"/>
+              </w:rPr>
+              <w:t xml:space="preserve">Consistent</w:t>
+            </w:r>
+          </w:p>
+        </w:tc>
+      </w:tr>
+      <w:tr>
+        <w:tc>
+          <w:tcPr>
+            <w:tcW w:type="dxa" w:w="2006"/>
+            <w:tcMar>
+              <w:top w:type="dxa" w:w="60"/>
+              <w:left w:type="dxa" w:w="100"/>
+              <w:bottom w:type="dxa" w:w="60"/>
+              <w:right w:type="dxa" w:w="100"/>
+            </w:tcMar>
+          </w:tcPr>
+          <w:p>
+            <w:pPr>
+              <w:spacing w:after="0"/>
+            </w:pPr>
+            <w:r>
+              <w:rPr>
+                <w:b w:val="false"/>
+                <w:bCs w:val="false"/>
+                <w:sz w:val="19"/>
+                <w:szCs w:val="19"/>
+              </w:rPr>
+              <w:t xml:space="preserve">Tn5 dose</w:t>
+            </w:r>
+          </w:p>
+        </w:tc>
+        <w:tc>
+          <w:tcPr>
+            <w:tcW w:type="dxa" w:w="2407"/>
+            <w:tcMar>
+              <w:top w:type="dxa" w:w="60"/>
+              <w:left w:type="dxa" w:w="100"/>
+              <w:bottom w:type="dxa" w:w="60"/>
+              <w:right w:type="dxa" w:w="100"/>
+            </w:tcMar>
+          </w:tcPr>
+          <w:p>
+            <w:pPr>
+              <w:spacing w:after="0"/>
+            </w:pPr>
+            <w:r>
+              <w:rPr>
+                <w:b w:val="false"/>
+                <w:bCs w:val="false"/>
+                <w:sz w:val="19"/>
+                <w:szCs w:val="19"/>
+              </w:rPr>
+              <w:t xml:space="preserve">100 nM = total protein</w:t>
+            </w:r>
+          </w:p>
+        </w:tc>
+        <w:tc>
+          <w:tcPr>
+            <w:tcW w:type="dxa" w:w="2507"/>
+            <w:tcMar>
+              <w:top w:type="dxa" w:w="60"/>
+              <w:left w:type="dxa" w:w="100"/>
+              <w:bottom w:type="dxa" w:w="60"/>
+              <w:right w:type="dxa" w:w="100"/>
+            </w:tcMar>
+          </w:tcPr>
+          <w:p>
+            <w:pPr>
+              <w:spacing w:after="0"/>
+            </w:pPr>
+            <w:r>
+              <w:rPr>
+                <w:b w:val="false"/>
+                <w:bCs w:val="false"/>
+                <w:sz w:val="19"/>
+                <w:szCs w:val="19"/>
+              </w:rPr>
+              <w:t xml:space="preserve">100 nM, total protein by A280 (may be over-estimated if Triton X-100 absorbs)</w:t>
+            </w:r>
+          </w:p>
+        </w:tc>
+        <w:tc>
+          <w:tcPr>
+            <w:tcW w:type="dxa" w:w="2106"/>
+            <w:tcMar>
+              <w:top w:type="dxa" w:w="60"/>
+              <w:left w:type="dxa" w:w="100"/>
+              <w:bottom w:type="dxa" w:w="60"/>
+              <w:right w:type="dxa" w:w="100"/>
+            </w:tcMar>
+          </w:tcPr>
+          <w:p>
+            <w:pPr>
+              <w:spacing w:after="0"/>
+            </w:pPr>
+            <w:r>
+              <w:rPr>
+                <w:b w:val="false"/>
+                <w:bCs w:val="false"/>
+                <w:sz w:val="19"/>
+                <w:szCs w:val="19"/>
+              </w:rPr>
+              <w:t xml:space="preserve">Same definition; true dose may be lower than stated</w:t>
+            </w:r>
+          </w:p>
+        </w:tc>
+      </w:tr>
+      <w:tr>
+        <w:tc>
+          <w:tcPr>
+            <w:tcW w:type="dxa" w:w="2006"/>
+            <w:tcMar>
+              <w:top w:type="dxa" w:w="60"/>
+              <w:left w:type="dxa" w:w="100"/>
+              <w:bottom w:type="dxa" w:w="60"/>
+              <w:right w:type="dxa" w:w="100"/>
+            </w:tcMar>
+          </w:tcPr>
+          <w:p>
+            <w:pPr>
+              <w:spacing w:after="0"/>
+            </w:pPr>
+            <w:r>
+              <w:rPr>
+                <w:b w:val="false"/>
+                <w:bCs w:val="false"/>
+                <w:sz w:val="19"/>
+                <w:szCs w:val="19"/>
+              </w:rPr>
+              <w:t xml:space="preserve">Tn5 batch QC</w:t>
+            </w:r>
+          </w:p>
+        </w:tc>
+        <w:tc>
+          <w:tcPr>
+            <w:tcW w:type="dxa" w:w="2407"/>
+            <w:tcMar>
+              <w:top w:type="dxa" w:w="60"/>
+              <w:left w:type="dxa" w:w="100"/>
+              <w:bottom w:type="dxa" w:w="60"/>
+              <w:right w:type="dxa" w:w="100"/>
+            </w:tcMar>
+          </w:tcPr>
+          <w:p>
+            <w:pPr>
+              <w:spacing w:after="0"/>
+            </w:pPr>
+            <w:r>
+              <w:rPr>
+                <w:b w:val="false"/>
+                <w:bCs w:val="false"/>
+                <w:sz w:val="19"/>
+                <w:szCs w:val="19"/>
+              </w:rPr>
+              <w:t xml:space="preserve">1 µl of 37.5 µM on 500 ng gDNA; pass = all &lt; 1 kb; high-activity = &lt; 750 or &lt; 500 bp</w:t>
+            </w:r>
+          </w:p>
+        </w:tc>
+        <w:tc>
+          <w:tcPr>
+            <w:tcW w:type="dxa" w:w="2507"/>
+            <w:tcMar>
+              <w:top w:type="dxa" w:w="60"/>
+              <w:left w:type="dxa" w:w="100"/>
+              <w:bottom w:type="dxa" w:w="60"/>
+              <w:right w:type="dxa" w:w="100"/>
+            </w:tcMar>
+          </w:tcPr>
+          <w:p>
+            <w:pPr>
+              <w:spacing w:after="0"/>
+            </w:pPr>
+            <w:r>
+              <w:rPr>
+                <w:b w:val="false"/>
+                <w:bCs w:val="false"/>
+                <w:sz w:val="19"/>
+                <w:szCs w:val="19"/>
+              </w:rPr>
+              <w:t xml:space="preserve">Not yet done (lambda titration only)</w:t>
+            </w:r>
+          </w:p>
+        </w:tc>
+        <w:tc>
+          <w:tcPr>
+            <w:tcW w:type="dxa" w:w="2106"/>
+            <w:tcMar>
+              <w:top w:type="dxa" w:w="60"/>
+              <w:left w:type="dxa" w:w="100"/>
+              <w:bottom w:type="dxa" w:w="60"/>
+              <w:right w:type="dxa" w:w="100"/>
+            </w:tcMar>
+          </w:tcPr>
+          <w:p>
+            <w:pPr>
+              <w:spacing w:after="0"/>
+            </w:pPr>
+            <w:r>
+              <w:rPr>
+                <w:b w:val="false"/>
+                <w:bCs w:val="false"/>
+                <w:sz w:val="19"/>
+                <w:szCs w:val="19"/>
+              </w:rPr>
+              <w:t xml:space="preserve">Run the same assay (Appendix B.7)</w:t>
+            </w:r>
+          </w:p>
+        </w:tc>
+      </w:tr>
+      <w:tr>
+        <w:tc>
+          <w:tcPr>
+            <w:tcW w:type="dxa" w:w="2006"/>
+            <w:tcMar>
+              <w:top w:type="dxa" w:w="60"/>
+              <w:left w:type="dxa" w:w="100"/>
+              <w:bottom w:type="dxa" w:w="60"/>
+              <w:right w:type="dxa" w:w="100"/>
+            </w:tcMar>
+          </w:tcPr>
+          <w:p>
+            <w:pPr>
+              <w:spacing w:after="0"/>
+            </w:pPr>
+            <w:r>
+              <w:rPr>
+                <w:b w:val="false"/>
+                <w:bCs w:val="false"/>
+                <w:sz w:val="19"/>
+                <w:szCs w:val="19"/>
+              </w:rPr>
+              <w:t xml:space="preserve">Tn5 titration</w:t>
+            </w:r>
+          </w:p>
+        </w:tc>
+        <w:tc>
+          <w:tcPr>
+            <w:tcW w:type="dxa" w:w="2407"/>
+            <w:tcMar>
+              <w:top w:type="dxa" w:w="60"/>
+              <w:left w:type="dxa" w:w="100"/>
+              <w:bottom w:type="dxa" w:w="60"/>
+              <w:right w:type="dxa" w:w="100"/>
+            </w:tcMar>
+          </w:tcPr>
+          <w:p>
+            <w:pPr>
+              <w:spacing w:after="0"/>
+            </w:pPr>
+            <w:r>
+              <w:rPr>
+                <w:b w:val="false"/>
+                <w:bCs w:val="false"/>
+                <w:sz w:val="19"/>
+                <w:szCs w:val="19"/>
+              </w:rPr>
+              <w:t xml:space="preserve">Testing 100, 50, 25 nM is reasonable</w:t>
+            </w:r>
+          </w:p>
+        </w:tc>
+        <w:tc>
+          <w:tcPr>
+            <w:tcW w:type="dxa" w:w="2507"/>
+            <w:tcMar>
+              <w:top w:type="dxa" w:w="60"/>
+              <w:left w:type="dxa" w:w="100"/>
+              <w:bottom w:type="dxa" w:w="60"/>
+              <w:right w:type="dxa" w:w="100"/>
+            </w:tcMar>
+          </w:tcPr>
+          <w:p>
+            <w:pPr>
+              <w:spacing w:after="0"/>
+            </w:pPr>
+            <w:r>
+              <w:rPr>
+                <w:b w:val="false"/>
+                <w:bCs w:val="false"/>
+                <w:sz w:val="19"/>
+                <w:szCs w:val="19"/>
+              </w:rPr>
+              <w:t xml:space="preserve">Planned (Section 5)</w:t>
+            </w:r>
+          </w:p>
+        </w:tc>
+        <w:tc>
+          <w:tcPr>
+            <w:tcW w:type="dxa" w:w="2106"/>
+            <w:tcMar>
+              <w:top w:type="dxa" w:w="60"/>
+              <w:left w:type="dxa" w:w="100"/>
+              <w:bottom w:type="dxa" w:w="60"/>
+              <w:right w:type="dxa" w:w="100"/>
+            </w:tcMar>
+          </w:tcPr>
+          <w:p>
+            <w:pPr>
+              <w:spacing w:after="0"/>
+            </w:pPr>
+            <w:r>
+              <w:rPr>
+                <w:b w:val="false"/>
+                <w:bCs w:val="false"/>
+                <w:sz w:val="19"/>
+                <w:szCs w:val="19"/>
+              </w:rPr>
+              <w:t xml:space="preserve">Agreed</w:t>
+            </w:r>
+          </w:p>
+        </w:tc>
+      </w:tr>
+      <w:tr>
+        <w:tc>
+          <w:tcPr>
+            <w:tcW w:type="dxa" w:w="2006"/>
+            <w:tcMar>
+              <w:top w:type="dxa" w:w="60"/>
+              <w:left w:type="dxa" w:w="100"/>
+              <w:bottom w:type="dxa" w:w="60"/>
+              <w:right w:type="dxa" w:w="100"/>
+            </w:tcMar>
+          </w:tcPr>
+          <w:p>
+            <w:pPr>
+              <w:spacing w:after="0"/>
+            </w:pPr>
+            <w:r>
+              <w:rPr>
+                <w:b w:val="false"/>
+                <w:bCs w:val="false"/>
+                <w:sz w:val="19"/>
+                <w:szCs w:val="19"/>
+              </w:rPr>
+              <w:t xml:space="preserve">PCR</w:t>
+            </w:r>
+          </w:p>
+        </w:tc>
+        <w:tc>
+          <w:tcPr>
+            <w:tcW w:type="dxa" w:w="2407"/>
+            <w:tcMar>
+              <w:top w:type="dxa" w:w="60"/>
+              <w:left w:type="dxa" w:w="100"/>
+              <w:bottom w:type="dxa" w:w="60"/>
+              <w:right w:type="dxa" w:w="100"/>
+            </w:tcMar>
+          </w:tcPr>
+          <w:p>
+            <w:pPr>
+              <w:spacing w:after="0"/>
+            </w:pPr>
+            <w:r>
+              <w:rPr>
+                <w:b w:val="false"/>
+                <w:bCs w:val="false"/>
+                <w:sz w:val="19"/>
+                <w:szCs w:val="19"/>
+              </w:rPr>
+              <w:t xml:space="preserve">21 cycles for all samples, never adjusted</w:t>
+            </w:r>
+          </w:p>
+        </w:tc>
+        <w:tc>
+          <w:tcPr>
+            <w:tcW w:type="dxa" w:w="2507"/>
+            <w:tcMar>
+              <w:top w:type="dxa" w:w="60"/>
+              <w:left w:type="dxa" w:w="100"/>
+              <w:bottom w:type="dxa" w:w="60"/>
+              <w:right w:type="dxa" w:w="100"/>
+            </w:tcMar>
+          </w:tcPr>
+          <w:p>
+            <w:pPr>
+              <w:spacing w:after="0"/>
+            </w:pPr>
+            <w:r>
+              <w:rPr>
+                <w:b w:val="false"/>
+                <w:bCs w:val="false"/>
+                <w:sz w:val="19"/>
+                <w:szCs w:val="19"/>
+              </w:rPr>
+              <w:t xml:space="preserve">21 cycles</w:t>
+            </w:r>
+          </w:p>
+        </w:tc>
+        <w:tc>
+          <w:tcPr>
+            <w:tcW w:type="dxa" w:w="2106"/>
+            <w:tcMar>
+              <w:top w:type="dxa" w:w="60"/>
+              <w:left w:type="dxa" w:w="100"/>
+              <w:bottom w:type="dxa" w:w="60"/>
+              <w:right w:type="dxa" w:w="100"/>
+            </w:tcMar>
+          </w:tcPr>
+          <w:p>
+            <w:pPr>
+              <w:spacing w:after="0"/>
+            </w:pPr>
+            <w:r>
+              <w:rPr>
+                <w:b w:val="false"/>
+                <w:bCs w:val="false"/>
+                <w:sz w:val="19"/>
+                <w:szCs w:val="19"/>
+              </w:rPr>
+              <w:t xml:space="preserve">Keep; complexity is set before PCR</w:t>
+            </w:r>
+          </w:p>
+        </w:tc>
+      </w:tr>
+      <w:tr>
+        <w:tc>
+          <w:tcPr>
+            <w:tcW w:type="dxa" w:w="2006"/>
+            <w:tcMar>
+              <w:top w:type="dxa" w:w="60"/>
+              <w:left w:type="dxa" w:w="100"/>
+              <w:bottom w:type="dxa" w:w="60"/>
+              <w:right w:type="dxa" w:w="100"/>
+            </w:tcMar>
+          </w:tcPr>
+          <w:p>
+            <w:pPr>
+              <w:spacing w:after="0"/>
+            </w:pPr>
+            <w:r>
+              <w:rPr>
+                <w:b w:val="false"/>
+                <w:bCs w:val="false"/>
+                <w:sz w:val="19"/>
+                <w:szCs w:val="19"/>
+              </w:rPr>
+              <w:t xml:space="preserve">S2 spike-in (1 ng / 200 µl)</w:t>
+            </w:r>
+          </w:p>
+        </w:tc>
+        <w:tc>
+          <w:tcPr>
+            <w:tcW w:type="dxa" w:w="2407"/>
+            <w:tcMar>
+              <w:top w:type="dxa" w:w="60"/>
+              <w:left w:type="dxa" w:w="100"/>
+              <w:bottom w:type="dxa" w:w="60"/>
+              <w:right w:type="dxa" w:w="100"/>
+            </w:tcMar>
+          </w:tcPr>
+          <w:p>
+            <w:pPr>
+              <w:spacing w:after="0"/>
+            </w:pPr>
+            <w:r>
+              <w:rPr>
+                <w:b w:val="false"/>
+                <w:bCs w:val="false"/>
+                <w:sz w:val="19"/>
+                <w:szCs w:val="19"/>
+              </w:rPr>
+              <w:t xml:space="preserve">dm6 ~5–20% of mapped reads</w:t>
+            </w:r>
+          </w:p>
+        </w:tc>
+        <w:tc>
+          <w:tcPr>
+            <w:tcW w:type="dxa" w:w="2507"/>
+            <w:tcMar>
+              <w:top w:type="dxa" w:w="60"/>
+              <w:left w:type="dxa" w:w="100"/>
+              <w:bottom w:type="dxa" w:w="60"/>
+              <w:right w:type="dxa" w:w="100"/>
+            </w:tcMar>
+          </w:tcPr>
+          <w:p>
+            <w:pPr>
+              <w:spacing w:after="0"/>
+            </w:pPr>
+            <w:r>
+              <w:rPr>
+                <w:b w:val="false"/>
+                <w:bCs w:val="false"/>
+                <w:sz w:val="19"/>
+                <w:szCs w:val="19"/>
+              </w:rPr>
+              <w:t xml:space="preserve">HC1 0.3–5.7%; HC8 0.7–1.9%; HC9 12–17.5%; IgG 0.1–0.3%</w:t>
+            </w:r>
+          </w:p>
+        </w:tc>
+        <w:tc>
+          <w:tcPr>
+            <w:tcW w:type="dxa" w:w="2106"/>
+            <w:tcMar>
+              <w:top w:type="dxa" w:w="60"/>
+              <w:left w:type="dxa" w:w="100"/>
+              <w:bottom w:type="dxa" w:w="60"/>
+              <w:right w:type="dxa" w:w="100"/>
+            </w:tcMar>
+          </w:tcPr>
+          <w:p>
+            <w:pPr>
+              <w:spacing w:after="0"/>
+            </w:pPr>
+            <w:r>
+              <w:rPr>
+                <w:b w:val="false"/>
+                <w:bCs w:val="false"/>
+                <w:sz w:val="19"/>
+                <w:szCs w:val="19"/>
+              </w:rPr>
+              <w:t xml:space="preserve">HC1/HC8 low; donor-level, not mark-level</w:t>
+            </w:r>
+          </w:p>
+        </w:tc>
+      </w:tr>
+    </w:tbl>
+    <w:p>
+      <w:pPr>
+        <w:pStyle w:val="ListParagraph"/>
+        <w:numPr>
+          <w:ilvl w:val="0"/>
+          <w:numId w:val="2"/>
+        </w:numPr>
+        <w:spacing w:after="60"/>
+      </w:pPr>
+      <w:r>
+        <w:t xml:space="preserve">Their activity QC uses ~75 pmol Tn5 per µg DNA; our round 1 top dose (100 nM in 12 µl on 40–200 ng lambda) was ~6–30 pmol per µg. Their pass criterion (&lt; 1 kb) is a low bar, so the assay places our batch relative to theirs rather than proving over-activity. If our batch cuts gDNA below 500 bp it is at the high-activity end and lower doses are the priority; if it is near 1 kb, look harder at capture and recovery (steps 2 and 5 above).</w:t>
+      </w:r>
+    </w:p>
+    <w:p>
+      <w:pPr>
+        <w:pStyle w:val="ListParagraph"/>
+        <w:numPr>
+          <w:ilvl w:val="0"/>
+          <w:numId w:val="2"/>
+        </w:numPr>
+        <w:spacing w:after="60"/>
+      </w:pPr>
+      <w:r>
+        <w:t xml:space="preserve">S2 fraction is consistent across marks within a donor but differs between donors, pointing to donor cfDNA load (fixed S2 is diluted by more human chromatin) or the S2 aliquot used. Check whether HC9 received a different S2 aliquot or prep day; if so, thaw a fresh aliquot for future runs. Low-fraction libraries still carry tens of thousands of dm6 reads, adequate for normalisation.</w:t>
+      </w:r>
+    </w:p>
+    <w:p>
+      <w:pPr>
         <w:pStyle w:val="Heading1"/>
         <w:spacing w:after="120" w:before="300"/>
       </w:pPr>
@@ -4991,11 +6084,24 @@
         <w:spacing w:after="60"/>
       </w:pPr>
       <w:r>
-        <w:t xml:space="preserve">Record cfDNA amount per donor (Qubit of extracted cfDNA from a parallel aliquot) to separate input effects from technique.</w:t>
+        <w:t xml:space="preserve">S2 spike-in: target a dm6 fraction of ~5–20% (Chen et al.). Record the S2 aliquot and thaw date for every sample; use a fresh aliquot if fractions stay &lt; 5% across donors.</w:t>
       </w:r>
     </w:p>
     <w:p>
       <w:pPr>
+        <w:pStyle w:val="ListParagraph"/>
+        <w:numPr>
+          <w:ilvl w:val="0"/>
+          <w:numId w:val="2"/>
+        </w:numPr>
+        <w:spacing w:after="60"/>
+      </w:pPr>
+      <w:r>
+        <w:t xml:space="preserve">Record cfDNA amount per donor (Qubit of extracted cfDNA from a parallel aliquot) to separate input effects from technique.</w:t>
+      </w:r>
+    </w:p>
+    <w:p>
+      <w:pPr>
         <w:pStyle w:val="Heading1"/>
         <w:spacing w:after="120" w:before="300"/>
       </w:pPr>
@@ -5009,6 +6115,14 @@
       </w:pPr>
       <w:r>
         <w:t xml:space="preserve">Chen et al. Cell-free chromatin state tracing reveals disease origin and therapy responses. Nature (2026). DOI: 10.1038/s41586-026-10224-0 (PMC13171458).</w:t>
+      </w:r>
+    </w:p>
+    <w:p>
+      <w:pPr>
+        <w:spacing w:after="100"/>
+      </w:pPr>
+      <w:r>
+        <w:t xml:space="preserve">Chen et al., personal communication (email reply to QC questions), 30 October 2026.</w:t>
       </w:r>
     </w:p>
     <w:p>
@@ -7203,7 +8317,7 @@
         <w:spacing w:after="100"/>
       </w:pPr>
       <w:r>
-        <w:t xml:space="preserve">2 µl of working stock in a 10 µl reaction gives 100 / 50 / 25 / 12.5 nM final. For cf-EpiTracing, build the chosen working stock into the tagmentation master mix (e.g. 2 µl of 500 nM per well for 100 nM).</w:t>
+        <w:t xml:space="preserve">2 µl of working stock in the 10 µl cf-EpiTracing reaction gives 100 / 50 / 25 / 12.5 nM final (for the 12 µl lambda titration use the table in B.2). For cf-EpiTracing, build the chosen working stock into the tagmentation master mix (e.g. 2 µl of 500 nM per well for 100 nM).</w:t>
       </w:r>
     </w:p>
     <w:p>
@@ -9388,6 +10502,1127 @@
       </w:pPr>
       <w:r>
         <w:t xml:space="preserve">Read-out: where the smear is centred at each dose (mostly &lt; 200 bp = over-tagmentation; ~200–600 bp = moderate). Carry the bracketing doses (likely 25, 50, 100 nM) into the cf-EpiTracing pilot.</w:t>
+      </w:r>
+    </w:p>
+    <w:p>
+      <w:pPr>
+        <w:pStyle w:val="ListParagraph"/>
+        <w:numPr>
+          <w:ilvl w:val="0"/>
+          <w:numId w:val="2"/>
+        </w:numPr>
+        <w:spacing w:after="60"/>
+      </w:pPr>
+      <w:r>
+        <w:t xml:space="preserve">Run the Chen et al. batch QC assay (B.7) on the same day, so the batch is benchmarked against theirs.</w:t>
+      </w:r>
+    </w:p>
+    <w:p>
+      <w:pPr>
+        <w:pStyle w:val="Heading2"/>
+        <w:spacing w:after="100" w:before="200"/>
+      </w:pPr>
+      <w:r>
+        <w:t xml:space="preserve">B.7 Chen et al. batch QC assay (benchmark)</w:t>
+      </w:r>
+    </w:p>
+    <w:p>
+      <w:pPr>
+        <w:spacing w:after="100"/>
+      </w:pPr>
+      <w:r>
+        <w:t xml:space="preserve">As used by Chen et al. for every purified Tn5 batch (personal communication): 1 µl of 37.5 µM Tn5 tagments 500 ng genomic DNA. Reaction volume and conditions were not specified; the set-up below uses the cf-EpiTracing tagmentation buffer and conditions.</w:t>
+      </w:r>
+    </w:p>
+    <w:tbl>
+      <w:tblPr>
+        <w:tblW w:type="dxa" w:w="9026"/>
+        <w:tblBorders>
+          <w:top w:val="single" w:color="auto" w:sz="4"/>
+          <w:left w:val="single" w:color="auto" w:sz="4"/>
+          <w:bottom w:val="single" w:color="auto" w:sz="4"/>
+          <w:right w:val="single" w:color="auto" w:sz="4"/>
+          <w:insideH w:val="single" w:color="auto" w:sz="4"/>
+          <w:insideV w:val="single" w:color="auto" w:sz="4"/>
+        </w:tblBorders>
+      </w:tblPr>
+      <w:tblGrid>
+        <w:gridCol w:w="5416"/>
+        <w:gridCol w:w="1805"/>
+        <w:gridCol w:w="1805"/>
+      </w:tblGrid>
+      <w:tr>
+        <w:trPr>
+          <w:tblHeader/>
+        </w:trPr>
+        <w:tc>
+          <w:tcPr>
+            <w:tcW w:type="dxa" w:w="5416"/>
+            <w:shd w:fill="1F4E79" w:color="auto" w:val="clear"/>
+            <w:tcMar>
+              <w:top w:type="dxa" w:w="60"/>
+              <w:left w:type="dxa" w:w="100"/>
+              <w:bottom w:type="dxa" w:w="60"/>
+              <w:right w:type="dxa" w:w="100"/>
+            </w:tcMar>
+          </w:tcPr>
+          <w:p>
+            <w:pPr>
+              <w:spacing w:after="0"/>
+            </w:pPr>
+            <w:r>
+              <w:rPr>
+                <w:b/>
+                <w:bCs/>
+                <w:color w:val="FFFFFF"/>
+                <w:sz w:val="19"/>
+                <w:szCs w:val="19"/>
+              </w:rPr>
+              <w:t xml:space="preserve">Component</w:t>
+            </w:r>
+          </w:p>
+        </w:tc>
+        <w:tc>
+          <w:tcPr>
+            <w:tcW w:type="dxa" w:w="1805"/>
+            <w:shd w:fill="1F4E79" w:color="auto" w:val="clear"/>
+            <w:tcMar>
+              <w:top w:type="dxa" w:w="60"/>
+              <w:left w:type="dxa" w:w="100"/>
+              <w:bottom w:type="dxa" w:w="60"/>
+              <w:right w:type="dxa" w:w="100"/>
+            </w:tcMar>
+          </w:tcPr>
+          <w:p>
+            <w:pPr>
+              <w:spacing w:after="0"/>
+            </w:pPr>
+            <w:r>
+              <w:rPr>
+                <w:b/>
+                <w:bCs/>
+                <w:color w:val="FFFFFF"/>
+                <w:sz w:val="19"/>
+                <w:szCs w:val="19"/>
+              </w:rPr>
+              <w:t xml:space="preserve">Tn5 tube</w:t>
+            </w:r>
+          </w:p>
+        </w:tc>
+        <w:tc>
+          <w:tcPr>
+            <w:tcW w:type="dxa" w:w="1805"/>
+            <w:shd w:fill="1F4E79" w:color="auto" w:val="clear"/>
+            <w:tcMar>
+              <w:top w:type="dxa" w:w="60"/>
+              <w:left w:type="dxa" w:w="100"/>
+              <w:bottom w:type="dxa" w:w="60"/>
+              <w:right w:type="dxa" w:w="100"/>
+            </w:tcMar>
+          </w:tcPr>
+          <w:p>
+            <w:pPr>
+              <w:spacing w:after="0"/>
+            </w:pPr>
+            <w:r>
+              <w:rPr>
+                <w:b/>
+                <w:bCs/>
+                <w:color w:val="FFFFFF"/>
+                <w:sz w:val="19"/>
+                <w:szCs w:val="19"/>
+              </w:rPr>
+              <w:t xml:space="preserve">No-enzyme control</w:t>
+            </w:r>
+          </w:p>
+        </w:tc>
+      </w:tr>
+      <w:tr>
+        <w:tc>
+          <w:tcPr>
+            <w:tcW w:type="dxa" w:w="5416"/>
+            <w:tcMar>
+              <w:top w:type="dxa" w:w="60"/>
+              <w:left w:type="dxa" w:w="100"/>
+              <w:bottom w:type="dxa" w:w="60"/>
+              <w:right w:type="dxa" w:w="100"/>
+            </w:tcMar>
+          </w:tcPr>
+          <w:p>
+            <w:pPr>
+              <w:spacing w:after="0"/>
+            </w:pPr>
+            <w:r>
+              <w:rPr>
+                <w:b w:val="false"/>
+                <w:bCs w:val="false"/>
+                <w:sz w:val="19"/>
+                <w:szCs w:val="19"/>
+              </w:rPr>
+              <w:t xml:space="preserve">2× tagmentation buffer</w:t>
+            </w:r>
+          </w:p>
+        </w:tc>
+        <w:tc>
+          <w:tcPr>
+            <w:tcW w:type="dxa" w:w="1805"/>
+            <w:tcMar>
+              <w:top w:type="dxa" w:w="60"/>
+              <w:left w:type="dxa" w:w="100"/>
+              <w:bottom w:type="dxa" w:w="60"/>
+              <w:right w:type="dxa" w:w="100"/>
+            </w:tcMar>
+          </w:tcPr>
+          <w:p>
+            <w:pPr>
+              <w:spacing w:after="0"/>
+            </w:pPr>
+            <w:r>
+              <w:rPr>
+                <w:b w:val="false"/>
+                <w:bCs w:val="false"/>
+                <w:sz w:val="19"/>
+                <w:szCs w:val="19"/>
+              </w:rPr>
+              <w:t xml:space="preserve">10 µl</w:t>
+            </w:r>
+          </w:p>
+        </w:tc>
+        <w:tc>
+          <w:tcPr>
+            <w:tcW w:type="dxa" w:w="1805"/>
+            <w:tcMar>
+              <w:top w:type="dxa" w:w="60"/>
+              <w:left w:type="dxa" w:w="100"/>
+              <w:bottom w:type="dxa" w:w="60"/>
+              <w:right w:type="dxa" w:w="100"/>
+            </w:tcMar>
+          </w:tcPr>
+          <w:p>
+            <w:pPr>
+              <w:spacing w:after="0"/>
+            </w:pPr>
+            <w:r>
+              <w:rPr>
+                <w:b w:val="false"/>
+                <w:bCs w:val="false"/>
+                <w:sz w:val="19"/>
+                <w:szCs w:val="19"/>
+              </w:rPr>
+              <w:t xml:space="preserve">10 µl</w:t>
+            </w:r>
+          </w:p>
+        </w:tc>
+      </w:tr>
+      <w:tr>
+        <w:tc>
+          <w:tcPr>
+            <w:tcW w:type="dxa" w:w="5416"/>
+            <w:tcMar>
+              <w:top w:type="dxa" w:w="60"/>
+              <w:left w:type="dxa" w:w="100"/>
+              <w:bottom w:type="dxa" w:w="60"/>
+              <w:right w:type="dxa" w:w="100"/>
+            </w:tcMar>
+          </w:tcPr>
+          <w:p>
+            <w:pPr>
+              <w:spacing w:after="0"/>
+            </w:pPr>
+            <w:r>
+              <w:rPr>
+                <w:b w:val="false"/>
+                <w:bCs w:val="false"/>
+                <w:sz w:val="19"/>
+                <w:szCs w:val="19"/>
+              </w:rPr>
+              <w:t xml:space="preserve">Genomic DNA, 500 ng (human gDNA preferred; or lambda, 1 µl of 500 µg/ml stock after Qubit check)</w:t>
+            </w:r>
+          </w:p>
+        </w:tc>
+        <w:tc>
+          <w:tcPr>
+            <w:tcW w:type="dxa" w:w="1805"/>
+            <w:tcMar>
+              <w:top w:type="dxa" w:w="60"/>
+              <w:left w:type="dxa" w:w="100"/>
+              <w:bottom w:type="dxa" w:w="60"/>
+              <w:right w:type="dxa" w:w="100"/>
+            </w:tcMar>
+          </w:tcPr>
+          <w:p>
+            <w:pPr>
+              <w:spacing w:after="0"/>
+            </w:pPr>
+            <w:r>
+              <w:rPr>
+                <w:b w:val="false"/>
+                <w:bCs w:val="false"/>
+                <w:sz w:val="19"/>
+                <w:szCs w:val="19"/>
+              </w:rPr>
+              <w:t xml:space="preserve">x µl</w:t>
+            </w:r>
+          </w:p>
+        </w:tc>
+        <w:tc>
+          <w:tcPr>
+            <w:tcW w:type="dxa" w:w="1805"/>
+            <w:tcMar>
+              <w:top w:type="dxa" w:w="60"/>
+              <w:left w:type="dxa" w:w="100"/>
+              <w:bottom w:type="dxa" w:w="60"/>
+              <w:right w:type="dxa" w:w="100"/>
+            </w:tcMar>
+          </w:tcPr>
+          <w:p>
+            <w:pPr>
+              <w:spacing w:after="0"/>
+            </w:pPr>
+            <w:r>
+              <w:rPr>
+                <w:b w:val="false"/>
+                <w:bCs w:val="false"/>
+                <w:sz w:val="19"/>
+                <w:szCs w:val="19"/>
+              </w:rPr>
+              <w:t xml:space="preserve">x µl</w:t>
+            </w:r>
+          </w:p>
+        </w:tc>
+      </w:tr>
+      <w:tr>
+        <w:tc>
+          <w:tcPr>
+            <w:tcW w:type="dxa" w:w="5416"/>
+            <w:tcMar>
+              <w:top w:type="dxa" w:w="60"/>
+              <w:left w:type="dxa" w:w="100"/>
+              <w:bottom w:type="dxa" w:w="60"/>
+              <w:right w:type="dxa" w:w="100"/>
+            </w:tcMar>
+          </w:tcPr>
+          <w:p>
+            <w:pPr>
+              <w:spacing w:after="0"/>
+            </w:pPr>
+            <w:r>
+              <w:rPr>
+                <w:b w:val="false"/>
+                <w:bCs w:val="false"/>
+                <w:sz w:val="19"/>
+                <w:szCs w:val="19"/>
+              </w:rPr>
+              <w:t xml:space="preserve">Water</w:t>
+            </w:r>
+          </w:p>
+        </w:tc>
+        <w:tc>
+          <w:tcPr>
+            <w:tcW w:type="dxa" w:w="1805"/>
+            <w:tcMar>
+              <w:top w:type="dxa" w:w="60"/>
+              <w:left w:type="dxa" w:w="100"/>
+              <w:bottom w:type="dxa" w:w="60"/>
+              <w:right w:type="dxa" w:w="100"/>
+            </w:tcMar>
+          </w:tcPr>
+          <w:p>
+            <w:pPr>
+              <w:spacing w:after="0"/>
+            </w:pPr>
+            <w:r>
+              <w:rPr>
+                <w:b w:val="false"/>
+                <w:bCs w:val="false"/>
+                <w:sz w:val="19"/>
+                <w:szCs w:val="19"/>
+              </w:rPr>
+              <w:t xml:space="preserve">to 19 µl</w:t>
+            </w:r>
+          </w:p>
+        </w:tc>
+        <w:tc>
+          <w:tcPr>
+            <w:tcW w:type="dxa" w:w="1805"/>
+            <w:tcMar>
+              <w:top w:type="dxa" w:w="60"/>
+              <w:left w:type="dxa" w:w="100"/>
+              <w:bottom w:type="dxa" w:w="60"/>
+              <w:right w:type="dxa" w:w="100"/>
+            </w:tcMar>
+          </w:tcPr>
+          <w:p>
+            <w:pPr>
+              <w:spacing w:after="0"/>
+            </w:pPr>
+            <w:r>
+              <w:rPr>
+                <w:b w:val="false"/>
+                <w:bCs w:val="false"/>
+                <w:sz w:val="19"/>
+                <w:szCs w:val="19"/>
+              </w:rPr>
+              <w:t xml:space="preserve">to 19 µl</w:t>
+            </w:r>
+          </w:p>
+        </w:tc>
+      </w:tr>
+      <w:tr>
+        <w:tc>
+          <w:tcPr>
+            <w:tcW w:type="dxa" w:w="5416"/>
+            <w:tcMar>
+              <w:top w:type="dxa" w:w="60"/>
+              <w:left w:type="dxa" w:w="100"/>
+              <w:bottom w:type="dxa" w:w="60"/>
+              <w:right w:type="dxa" w:w="100"/>
+            </w:tcMar>
+          </w:tcPr>
+          <w:p>
+            <w:pPr>
+              <w:spacing w:after="0"/>
+            </w:pPr>
+            <w:r>
+              <w:rPr>
+                <w:b w:val="false"/>
+                <w:bCs w:val="false"/>
+                <w:sz w:val="19"/>
+                <w:szCs w:val="19"/>
+              </w:rPr>
+              <w:t xml:space="preserve">Tn5 37.5 µM loaded stock, undiluted — add last</w:t>
+            </w:r>
+          </w:p>
+        </w:tc>
+        <w:tc>
+          <w:tcPr>
+            <w:tcW w:type="dxa" w:w="1805"/>
+            <w:tcMar>
+              <w:top w:type="dxa" w:w="60"/>
+              <w:left w:type="dxa" w:w="100"/>
+              <w:bottom w:type="dxa" w:w="60"/>
+              <w:right w:type="dxa" w:w="100"/>
+            </w:tcMar>
+          </w:tcPr>
+          <w:p>
+            <w:pPr>
+              <w:spacing w:after="0"/>
+            </w:pPr>
+            <w:r>
+              <w:rPr>
+                <w:b w:val="false"/>
+                <w:bCs w:val="false"/>
+                <w:sz w:val="19"/>
+                <w:szCs w:val="19"/>
+              </w:rPr>
+              <w:t xml:space="preserve">1 µl</w:t>
+            </w:r>
+          </w:p>
+        </w:tc>
+        <w:tc>
+          <w:tcPr>
+            <w:tcW w:type="dxa" w:w="1805"/>
+            <w:tcMar>
+              <w:top w:type="dxa" w:w="60"/>
+              <w:left w:type="dxa" w:w="100"/>
+              <w:bottom w:type="dxa" w:w="60"/>
+              <w:right w:type="dxa" w:w="100"/>
+            </w:tcMar>
+          </w:tcPr>
+          <w:p>
+            <w:pPr>
+              <w:spacing w:after="0"/>
+            </w:pPr>
+            <w:r>
+              <w:rPr>
+                <w:b w:val="false"/>
+                <w:bCs w:val="false"/>
+                <w:sz w:val="19"/>
+                <w:szCs w:val="19"/>
+              </w:rPr>
+              <w:t xml:space="preserve">—</w:t>
+            </w:r>
+          </w:p>
+        </w:tc>
+      </w:tr>
+      <w:tr>
+        <w:tc>
+          <w:tcPr>
+            <w:tcW w:type="dxa" w:w="5416"/>
+            <w:tcMar>
+              <w:top w:type="dxa" w:w="60"/>
+              <w:left w:type="dxa" w:w="100"/>
+              <w:bottom w:type="dxa" w:w="60"/>
+              <w:right w:type="dxa" w:w="100"/>
+            </w:tcMar>
+          </w:tcPr>
+          <w:p>
+            <w:pPr>
+              <w:spacing w:after="0"/>
+            </w:pPr>
+            <w:r>
+              <w:rPr>
+                <w:b w:val="false"/>
+                <w:bCs w:val="false"/>
+                <w:sz w:val="19"/>
+                <w:szCs w:val="19"/>
+              </w:rPr>
+              <w:t xml:space="preserve">Tn5 storage buffer (60% glycerol) — add last</w:t>
+            </w:r>
+          </w:p>
+        </w:tc>
+        <w:tc>
+          <w:tcPr>
+            <w:tcW w:type="dxa" w:w="1805"/>
+            <w:tcMar>
+              <w:top w:type="dxa" w:w="60"/>
+              <w:left w:type="dxa" w:w="100"/>
+              <w:bottom w:type="dxa" w:w="60"/>
+              <w:right w:type="dxa" w:w="100"/>
+            </w:tcMar>
+          </w:tcPr>
+          <w:p>
+            <w:pPr>
+              <w:spacing w:after="0"/>
+            </w:pPr>
+            <w:r>
+              <w:rPr>
+                <w:b w:val="false"/>
+                <w:bCs w:val="false"/>
+                <w:sz w:val="19"/>
+                <w:szCs w:val="19"/>
+              </w:rPr>
+              <w:t xml:space="preserve">—</w:t>
+            </w:r>
+          </w:p>
+        </w:tc>
+        <w:tc>
+          <w:tcPr>
+            <w:tcW w:type="dxa" w:w="1805"/>
+            <w:tcMar>
+              <w:top w:type="dxa" w:w="60"/>
+              <w:left w:type="dxa" w:w="100"/>
+              <w:bottom w:type="dxa" w:w="60"/>
+              <w:right w:type="dxa" w:w="100"/>
+            </w:tcMar>
+          </w:tcPr>
+          <w:p>
+            <w:pPr>
+              <w:spacing w:after="0"/>
+            </w:pPr>
+            <w:r>
+              <w:rPr>
+                <w:b w:val="false"/>
+                <w:bCs w:val="false"/>
+                <w:sz w:val="19"/>
+                <w:szCs w:val="19"/>
+              </w:rPr>
+              <w:t xml:space="preserve">1 µl</w:t>
+            </w:r>
+          </w:p>
+        </w:tc>
+      </w:tr>
+      <w:tr>
+        <w:tc>
+          <w:tcPr>
+            <w:tcW w:type="dxa" w:w="5416"/>
+            <w:tcMar>
+              <w:top w:type="dxa" w:w="60"/>
+              <w:left w:type="dxa" w:w="100"/>
+              <w:bottom w:type="dxa" w:w="60"/>
+              <w:right w:type="dxa" w:w="100"/>
+            </w:tcMar>
+          </w:tcPr>
+          <w:p>
+            <w:pPr>
+              <w:spacing w:after="0"/>
+            </w:pPr>
+            <w:r>
+              <w:rPr>
+                <w:b w:val="false"/>
+                <w:bCs w:val="false"/>
+                <w:sz w:val="19"/>
+                <w:szCs w:val="19"/>
+              </w:rPr>
+              <w:t xml:space="preserve">Total</w:t>
+            </w:r>
+          </w:p>
+        </w:tc>
+        <w:tc>
+          <w:tcPr>
+            <w:tcW w:type="dxa" w:w="1805"/>
+            <w:tcMar>
+              <w:top w:type="dxa" w:w="60"/>
+              <w:left w:type="dxa" w:w="100"/>
+              <w:bottom w:type="dxa" w:w="60"/>
+              <w:right w:type="dxa" w:w="100"/>
+            </w:tcMar>
+          </w:tcPr>
+          <w:p>
+            <w:pPr>
+              <w:spacing w:after="0"/>
+            </w:pPr>
+            <w:r>
+              <w:rPr>
+                <w:b w:val="false"/>
+                <w:bCs w:val="false"/>
+                <w:sz w:val="19"/>
+                <w:szCs w:val="19"/>
+              </w:rPr>
+              <w:t xml:space="preserve">20 µl</w:t>
+            </w:r>
+          </w:p>
+        </w:tc>
+        <w:tc>
+          <w:tcPr>
+            <w:tcW w:type="dxa" w:w="1805"/>
+            <w:tcMar>
+              <w:top w:type="dxa" w:w="60"/>
+              <w:left w:type="dxa" w:w="100"/>
+              <w:bottom w:type="dxa" w:w="60"/>
+              <w:right w:type="dxa" w:w="100"/>
+            </w:tcMar>
+          </w:tcPr>
+          <w:p>
+            <w:pPr>
+              <w:spacing w:after="0"/>
+            </w:pPr>
+            <w:r>
+              <w:rPr>
+                <w:b w:val="false"/>
+                <w:bCs w:val="false"/>
+                <w:sz w:val="19"/>
+                <w:szCs w:val="19"/>
+              </w:rPr>
+              <w:t xml:space="preserve">20 µl</w:t>
+            </w:r>
+          </w:p>
+        </w:tc>
+      </w:tr>
+    </w:tbl>
+    <w:p>
+      <w:pPr>
+        <w:pStyle w:val="ListParagraph"/>
+        <w:numPr>
+          <w:ilvl w:val="0"/>
+          <w:numId w:val="5"/>
+        </w:numPr>
+        <w:spacing w:after="80"/>
+      </w:pPr>
+      <w:r>
+        <w:rPr>
+          <w:b/>
+          <w:bCs/>
+        </w:rPr>
+        <w:t xml:space="preserve">Pipette the stock carefully: </w:t>
+      </w:r>
+      <w:r>
+        <w:t xml:space="preserve">it is viscous (60% glycerol). Pipette slowly, wipe the outside of the tip, and mix by pipetting 10× until no glycerol streaks remain.</w:t>
+      </w:r>
+    </w:p>
+    <w:p>
+      <w:pPr>
+        <w:pStyle w:val="ListParagraph"/>
+        <w:numPr>
+          <w:ilvl w:val="0"/>
+          <w:numId w:val="5"/>
+        </w:numPr>
+        <w:spacing w:after="80"/>
+      </w:pPr>
+      <w:r>
+        <w:rPr>
+          <w:b/>
+          <w:bCs/>
+        </w:rPr>
+        <w:t xml:space="preserve">Tagment: </w:t>
+      </w:r>
+      <w:r>
+        <w:t xml:space="preserve">37 °C, 30 min (thermocycler, lid 50 °C).</w:t>
+      </w:r>
+    </w:p>
+    <w:p>
+      <w:pPr>
+        <w:pStyle w:val="ListParagraph"/>
+        <w:numPr>
+          <w:ilvl w:val="0"/>
+          <w:numId w:val="5"/>
+        </w:numPr>
+        <w:spacing w:after="80"/>
+      </w:pPr>
+      <w:r>
+        <w:rPr>
+          <w:b/>
+          <w:bCs/>
+        </w:rPr>
+        <w:t xml:space="preserve">Stop and release: </w:t>
+      </w:r>
+      <w:r>
+        <w:t xml:space="preserve">add 4 µl lysis buffer + 1.5 µl 10% SDS (≈ 0.6% SDS in 25.5 µl). This tube has ~1.9 µM Tn5 (~2 µg protein), ~50× more than the titration tubes; if available add 1 µl proteinase K (20 mg/ml) as well. 55 °C, 30 min, then 70 °C, 10 min; cool to room temperature.</w:t>
+      </w:r>
+    </w:p>
+    <w:p>
+      <w:pPr>
+        <w:pStyle w:val="ListParagraph"/>
+        <w:numPr>
+          <w:ilvl w:val="0"/>
+          <w:numId w:val="5"/>
+        </w:numPr>
+        <w:spacing w:after="80"/>
+      </w:pPr>
+      <w:r>
+        <w:rPr>
+          <w:b/>
+          <w:bCs/>
+        </w:rPr>
+        <w:t xml:space="preserve">Clean up: </w:t>
+      </w:r>
+      <w:r>
+        <w:t xml:space="preserve">add water to 50 µl, then 90 µl SPRI beads (1.8×), wash as in B.3, elute in 20 µl 10 mM Tris pH 8.0 (or use a DNA Clean &amp; Concentrator column).</w:t>
+      </w:r>
+    </w:p>
+    <w:p>
+      <w:pPr>
+        <w:pStyle w:val="ListParagraph"/>
+        <w:numPr>
+          <w:ilvl w:val="0"/>
+          <w:numId w:val="5"/>
+        </w:numPr>
+        <w:spacing w:after="80"/>
+      </w:pPr>
+      <w:r>
+        <w:rPr>
+          <w:b/>
+          <w:bCs/>
+        </w:rPr>
+        <w:t xml:space="preserve">Read out: </w:t>
+      </w:r>
+      <w:r>
+        <w:t xml:space="preserve">Genomic DNA ScreenTape (sizes the intact control) or D5000 (1 µl; ~20 ng/µl expected). Qubit the eluate to confirm recovery.</w:t>
+      </w:r>
+    </w:p>
+    <w:tbl>
+      <w:tblPr>
+        <w:tblW w:type="dxa" w:w="9026"/>
+        <w:tblBorders>
+          <w:top w:val="single" w:color="auto" w:sz="4"/>
+          <w:left w:val="single" w:color="auto" w:sz="4"/>
+          <w:bottom w:val="single" w:color="auto" w:sz="4"/>
+          <w:right w:val="single" w:color="auto" w:sz="4"/>
+          <w:insideH w:val="single" w:color="auto" w:sz="4"/>
+          <w:insideV w:val="single" w:color="auto" w:sz="4"/>
+        </w:tblBorders>
+      </w:tblPr>
+      <w:tblGrid>
+        <w:gridCol w:w="2808"/>
+        <w:gridCol w:w="2407"/>
+        <w:gridCol w:w="3811"/>
+      </w:tblGrid>
+      <w:tr>
+        <w:trPr>
+          <w:tblHeader/>
+        </w:trPr>
+        <w:tc>
+          <w:tcPr>
+            <w:tcW w:type="dxa" w:w="2808"/>
+            <w:shd w:fill="1F4E79" w:color="auto" w:val="clear"/>
+            <w:tcMar>
+              <w:top w:type="dxa" w:w="60"/>
+              <w:left w:type="dxa" w:w="100"/>
+              <w:bottom w:type="dxa" w:w="60"/>
+              <w:right w:type="dxa" w:w="100"/>
+            </w:tcMar>
+          </w:tcPr>
+          <w:p>
+            <w:pPr>
+              <w:spacing w:after="0"/>
+            </w:pPr>
+            <w:r>
+              <w:rPr>
+                <w:b/>
+                <w:bCs/>
+                <w:color w:val="FFFFFF"/>
+                <w:sz w:val="19"/>
+                <w:szCs w:val="19"/>
+              </w:rPr>
+              <w:t xml:space="preserve">Result (Tn5 tube)</w:t>
+            </w:r>
+          </w:p>
+        </w:tc>
+        <w:tc>
+          <w:tcPr>
+            <w:tcW w:type="dxa" w:w="2407"/>
+            <w:shd w:fill="1F4E79" w:color="auto" w:val="clear"/>
+            <w:tcMar>
+              <w:top w:type="dxa" w:w="60"/>
+              <w:left w:type="dxa" w:w="100"/>
+              <w:bottom w:type="dxa" w:w="60"/>
+              <w:right w:type="dxa" w:w="100"/>
+            </w:tcMar>
+          </w:tcPr>
+          <w:p>
+            <w:pPr>
+              <w:spacing w:after="0"/>
+            </w:pPr>
+            <w:r>
+              <w:rPr>
+                <w:b/>
+                <w:bCs/>
+                <w:color w:val="FFFFFF"/>
+                <w:sz w:val="19"/>
+                <w:szCs w:val="19"/>
+              </w:rPr>
+              <w:t xml:space="preserve">Chen et al. classification</w:t>
+            </w:r>
+          </w:p>
+        </w:tc>
+        <w:tc>
+          <w:tcPr>
+            <w:tcW w:type="dxa" w:w="3811"/>
+            <w:shd w:fill="1F4E79" w:color="auto" w:val="clear"/>
+            <w:tcMar>
+              <w:top w:type="dxa" w:w="60"/>
+              <w:left w:type="dxa" w:w="100"/>
+              <w:bottom w:type="dxa" w:w="60"/>
+              <w:right w:type="dxa" w:w="100"/>
+            </w:tcMar>
+          </w:tcPr>
+          <w:p>
+            <w:pPr>
+              <w:spacing w:after="0"/>
+            </w:pPr>
+            <w:r>
+              <w:rPr>
+                <w:b/>
+                <w:bCs/>
+                <w:color w:val="FFFFFF"/>
+                <w:sz w:val="19"/>
+                <w:szCs w:val="19"/>
+              </w:rPr>
+              <w:t xml:space="preserve">Implication for our plasma libraries</w:t>
+            </w:r>
+          </w:p>
+        </w:tc>
+      </w:tr>
+      <w:tr>
+        <w:tc>
+          <w:tcPr>
+            <w:tcW w:type="dxa" w:w="2808"/>
+            <w:tcMar>
+              <w:top w:type="dxa" w:w="60"/>
+              <w:left w:type="dxa" w:w="100"/>
+              <w:bottom w:type="dxa" w:w="60"/>
+              <w:right w:type="dxa" w:w="100"/>
+            </w:tcMar>
+          </w:tcPr>
+          <w:p>
+            <w:pPr>
+              <w:spacing w:after="0"/>
+            </w:pPr>
+            <w:r>
+              <w:rPr>
+                <w:b w:val="false"/>
+                <w:bCs w:val="false"/>
+                <w:sz w:val="19"/>
+                <w:szCs w:val="19"/>
+              </w:rPr>
+              <w:t xml:space="preserve">Material remaining &gt; 1 kb</w:t>
+            </w:r>
+          </w:p>
+        </w:tc>
+        <w:tc>
+          <w:tcPr>
+            <w:tcW w:type="dxa" w:w="2407"/>
+            <w:tcMar>
+              <w:top w:type="dxa" w:w="60"/>
+              <w:left w:type="dxa" w:w="100"/>
+              <w:bottom w:type="dxa" w:w="60"/>
+              <w:right w:type="dxa" w:w="100"/>
+            </w:tcMar>
+          </w:tcPr>
+          <w:p>
+            <w:pPr>
+              <w:spacing w:after="0"/>
+            </w:pPr>
+            <w:r>
+              <w:rPr>
+                <w:b w:val="false"/>
+                <w:bCs w:val="false"/>
+                <w:sz w:val="19"/>
+                <w:szCs w:val="19"/>
+              </w:rPr>
+              <w:t xml:space="preserve">Insufficient activity</w:t>
+            </w:r>
+          </w:p>
+        </w:tc>
+        <w:tc>
+          <w:tcPr>
+            <w:tcW w:type="dxa" w:w="3811"/>
+            <w:tcMar>
+              <w:top w:type="dxa" w:w="60"/>
+              <w:left w:type="dxa" w:w="100"/>
+              <w:bottom w:type="dxa" w:w="60"/>
+              <w:right w:type="dxa" w:w="100"/>
+            </w:tcMar>
+          </w:tcPr>
+          <w:p>
+            <w:pPr>
+              <w:spacing w:after="0"/>
+            </w:pPr>
+            <w:r>
+              <w:rPr>
+                <w:b w:val="false"/>
+                <w:bCs w:val="false"/>
+                <w:sz w:val="19"/>
+                <w:szCs w:val="19"/>
+              </w:rPr>
+              <w:t xml:space="preserve">Unlikely to be over-tagmenting; check loading and protein concentration</w:t>
+            </w:r>
+          </w:p>
+        </w:tc>
+      </w:tr>
+      <w:tr>
+        <w:tc>
+          <w:tcPr>
+            <w:tcW w:type="dxa" w:w="2808"/>
+            <w:tcMar>
+              <w:top w:type="dxa" w:w="60"/>
+              <w:left w:type="dxa" w:w="100"/>
+              <w:bottom w:type="dxa" w:w="60"/>
+              <w:right w:type="dxa" w:w="100"/>
+            </w:tcMar>
+          </w:tcPr>
+          <w:p>
+            <w:pPr>
+              <w:spacing w:after="0"/>
+            </w:pPr>
+            <w:r>
+              <w:rPr>
+                <w:b w:val="false"/>
+                <w:bCs w:val="false"/>
+                <w:sz w:val="19"/>
+                <w:szCs w:val="19"/>
+              </w:rPr>
+              <w:t xml:space="preserve">All fragments &lt; 1 kb</w:t>
+            </w:r>
+          </w:p>
+        </w:tc>
+        <w:tc>
+          <w:tcPr>
+            <w:tcW w:type="dxa" w:w="2407"/>
+            <w:tcMar>
+              <w:top w:type="dxa" w:w="60"/>
+              <w:left w:type="dxa" w:w="100"/>
+              <w:bottom w:type="dxa" w:w="60"/>
+              <w:right w:type="dxa" w:w="100"/>
+            </w:tcMar>
+          </w:tcPr>
+          <w:p>
+            <w:pPr>
+              <w:spacing w:after="0"/>
+            </w:pPr>
+            <w:r>
+              <w:rPr>
+                <w:b w:val="false"/>
+                <w:bCs w:val="false"/>
+                <w:sz w:val="19"/>
+                <w:szCs w:val="19"/>
+              </w:rPr>
+              <w:t xml:space="preserve">Sufficiently active (typical)</w:t>
+            </w:r>
+          </w:p>
+        </w:tc>
+        <w:tc>
+          <w:tcPr>
+            <w:tcW w:type="dxa" w:w="3811"/>
+            <w:tcMar>
+              <w:top w:type="dxa" w:w="60"/>
+              <w:left w:type="dxa" w:w="100"/>
+              <w:bottom w:type="dxa" w:w="60"/>
+              <w:right w:type="dxa" w:w="100"/>
+            </w:tcMar>
+          </w:tcPr>
+          <w:p>
+            <w:pPr>
+              <w:spacing w:after="0"/>
+            </w:pPr>
+            <w:r>
+              <w:rPr>
+                <w:b w:val="false"/>
+                <w:bCs w:val="false"/>
+                <w:sz w:val="19"/>
+                <w:szCs w:val="19"/>
+              </w:rPr>
+              <w:t xml:space="preserve">Tn5 dose is probably not the main cause of low complexity; focus on capture and recovery, still run the pilot</w:t>
+            </w:r>
+          </w:p>
+        </w:tc>
+      </w:tr>
+      <w:tr>
+        <w:tc>
+          <w:tcPr>
+            <w:tcW w:type="dxa" w:w="2808"/>
+            <w:tcMar>
+              <w:top w:type="dxa" w:w="60"/>
+              <w:left w:type="dxa" w:w="100"/>
+              <w:bottom w:type="dxa" w:w="60"/>
+              <w:right w:type="dxa" w:w="100"/>
+            </w:tcMar>
+          </w:tcPr>
+          <w:p>
+            <w:pPr>
+              <w:spacing w:after="0"/>
+            </w:pPr>
+            <w:r>
+              <w:rPr>
+                <w:b w:val="false"/>
+                <w:bCs w:val="false"/>
+                <w:sz w:val="19"/>
+                <w:szCs w:val="19"/>
+              </w:rPr>
+              <w:t xml:space="preserve">All fragments &lt; 750 bp or &lt; 500 bp</w:t>
+            </w:r>
+          </w:p>
+        </w:tc>
+        <w:tc>
+          <w:tcPr>
+            <w:tcW w:type="dxa" w:w="2407"/>
+            <w:tcMar>
+              <w:top w:type="dxa" w:w="60"/>
+              <w:left w:type="dxa" w:w="100"/>
+              <w:bottom w:type="dxa" w:w="60"/>
+              <w:right w:type="dxa" w:w="100"/>
+            </w:tcMar>
+          </w:tcPr>
+          <w:p>
+            <w:pPr>
+              <w:spacing w:after="0"/>
+            </w:pPr>
+            <w:r>
+              <w:rPr>
+                <w:b w:val="false"/>
+                <w:bCs w:val="false"/>
+                <w:sz w:val="19"/>
+                <w:szCs w:val="19"/>
+              </w:rPr>
+              <w:t xml:space="preserve">High-activity batch</w:t>
+            </w:r>
+          </w:p>
+        </w:tc>
+        <w:tc>
+          <w:tcPr>
+            <w:tcW w:type="dxa" w:w="3811"/>
+            <w:tcMar>
+              <w:top w:type="dxa" w:w="60"/>
+              <w:left w:type="dxa" w:w="100"/>
+              <w:bottom w:type="dxa" w:w="60"/>
+              <w:right w:type="dxa" w:w="100"/>
+            </w:tcMar>
+          </w:tcPr>
+          <w:p>
+            <w:pPr>
+              <w:spacing w:after="0"/>
+            </w:pPr>
+            <w:r>
+              <w:rPr>
+                <w:b w:val="false"/>
+                <w:bCs w:val="false"/>
+                <w:sz w:val="19"/>
+                <w:szCs w:val="19"/>
+              </w:rPr>
+              <w:t xml:space="preserve">Supports over-tagmentation at 100 nM; prioritise 50 and 25 nM in the pilot</w:t>
+            </w:r>
+          </w:p>
+        </w:tc>
+      </w:tr>
+      <w:tr>
+        <w:tc>
+          <w:tcPr>
+            <w:tcW w:type="dxa" w:w="2808"/>
+            <w:tcMar>
+              <w:top w:type="dxa" w:w="60"/>
+              <w:left w:type="dxa" w:w="100"/>
+              <w:bottom w:type="dxa" w:w="60"/>
+              <w:right w:type="dxa" w:w="100"/>
+            </w:tcMar>
+          </w:tcPr>
+          <w:p>
+            <w:pPr>
+              <w:spacing w:after="0"/>
+            </w:pPr>
+            <w:r>
+              <w:rPr>
+                <w:b w:val="false"/>
+                <w:bCs w:val="false"/>
+                <w:sz w:val="19"/>
+                <w:szCs w:val="19"/>
+              </w:rPr>
+              <w:t xml:space="preserve">Signal stuck above the upper marker / in the well</w:t>
+            </w:r>
+          </w:p>
+        </w:tc>
+        <w:tc>
+          <w:tcPr>
+            <w:tcW w:type="dxa" w:w="2407"/>
+            <w:tcMar>
+              <w:top w:type="dxa" w:w="60"/>
+              <w:left w:type="dxa" w:w="100"/>
+              <w:bottom w:type="dxa" w:w="60"/>
+              <w:right w:type="dxa" w:w="100"/>
+            </w:tcMar>
+          </w:tcPr>
+          <w:p>
+            <w:pPr>
+              <w:spacing w:after="0"/>
+            </w:pPr>
+            <w:r>
+              <w:rPr>
+                <w:b w:val="false"/>
+                <w:bCs w:val="false"/>
+                <w:sz w:val="19"/>
+                <w:szCs w:val="19"/>
+              </w:rPr>
+              <w:t xml:space="preserve">Not interpretable</w:t>
+            </w:r>
+          </w:p>
+        </w:tc>
+        <w:tc>
+          <w:tcPr>
+            <w:tcW w:type="dxa" w:w="3811"/>
+            <w:tcMar>
+              <w:top w:type="dxa" w:w="60"/>
+              <w:left w:type="dxa" w:w="100"/>
+              <w:bottom w:type="dxa" w:w="60"/>
+              <w:right w:type="dxa" w:w="100"/>
+            </w:tcMar>
+          </w:tcPr>
+          <w:p>
+            <w:pPr>
+              <w:spacing w:after="0"/>
+            </w:pPr>
+            <w:r>
+              <w:rPr>
+                <w:b w:val="false"/>
+                <w:bCs w:val="false"/>
+                <w:sz w:val="19"/>
+                <w:szCs w:val="19"/>
+              </w:rPr>
+              <w:t xml:space="preserve">Tn5 not released; repeat with more SDS and proteinase K</w:t>
+            </w:r>
+          </w:p>
+        </w:tc>
+      </w:tr>
+    </w:tbl>
+    <w:p>
+      <w:pPr>
+        <w:pStyle w:val="ListParagraph"/>
+        <w:numPr>
+          <w:ilvl w:val="0"/>
+          <w:numId w:val="2"/>
+        </w:numPr>
+        <w:spacing w:after="60"/>
+      </w:pPr>
+      <w:r>
+        <w:t xml:space="preserve">Log the result with batch, date and DNA lot; repeat for every new Tn5 batch alongside the lambda titration.</w:t>
       </w:r>
     </w:p>
     <w:sectPr>
@@ -9655,6 +11890,12 @@
     </w:lvlOverride>
   </w:num>
   <w:num w:numId="4">
+    <w:abstractNumId w:val="2"/>
+    <w:lvlOverride w:ilvl="0">
+      <w:startOverride w:val="1"/>
+    </w:lvlOverride>
+  </w:num>
+  <w:num w:numId="5">
     <w:abstractNumId w:val="2"/>
     <w:lvlOverride w:ilvl="0">
       <w:startOverride w:val="1"/>

</xml_diff>